<commit_message>
Cotizaciones: el formato cabe en una hoja tambien en Word
Word y LibreOffice calculan distinto la altura de linea (Segoe UI pide
~1.33 em y la sustitucion de LibreOffice ~1.17 em), asi que lo que en la
vista previa cabia en una hoja se desbordaba al abrirlo en Word.

Ahora el interlineado va fijo en 1.26 em, con lo que las dos aplicaciones
miden igual. Los parrafos que solo llevan imagen quedan fuera de la regla
para no recortar los logotipos.

El espacio que se gano se devuelve a los renglones de servicio, que ahora
tienen mas altura para escribir, y quedan casi 12 mm libres antes del pie
como margen de seguridad.

De paso se quita el hilo blanco que Word dibujaba entre las celdas de la
barra de TOTAL.

Co-Authored-By: Claude Opus 5 <noreply@anthropic.com>
Claude-Session: https://claude.ai/code/session_017DE5RtjtLFhQ3FcsP1iHRy
</commit_message>
<xml_diff>
--- a/plantillas/cotizador/salida/FORMATO_COTIZACION_FLETES_TAURO.docx
+++ b/plantillas/cotizador/salida/FORMATO_COTIZACION_FLETES_TAURO.docx
@@ -140,7 +140,7 @@
           </w:tcPr>
           <w:p>
             <w:pPr>
-              <w:spacing w:before="0" w:after="70"/>
+              <w:spacing w:before="0" w:after="70" w:line="630" w:lineRule="exact"/>
               <w:jc w:val="right"/>
             </w:pPr>
             <w:r>
@@ -158,7 +158,7 @@
           </w:p>
           <w:p>
             <w:pPr>
-              <w:spacing w:before="0" w:after="0"/>
+              <w:spacing w:before="0" w:after="0" w:line="201" w:lineRule="exact"/>
               <w:jc w:val="right"/>
             </w:pPr>
             <w:r>
@@ -181,7 +181,7 @@
         <w:pBdr>
           <w:bottom w:val="single" w:sz="18" w:space="0" w:color="C21112"/>
         </w:pBdr>
-        <w:spacing w:before="110" w:after="0"/>
+        <w:spacing w:before="110" w:after="0" w:line="25" w:lineRule="exact"/>
       </w:pPr>
       <w:r>
         <w:rPr>
@@ -197,7 +197,7 @@
         <w:pBdr>
           <w:bottom w:val="single" w:sz="6" w:space="0" w:color="111111"/>
         </w:pBdr>
-        <w:spacing w:before="60" w:after="0"/>
+        <w:spacing w:before="60" w:after="0" w:line="25" w:lineRule="exact"/>
       </w:pPr>
       <w:r>
         <w:rPr>
@@ -210,7 +210,7 @@
     </w:p>
     <w:p>
       <w:pPr>
-        <w:spacing w:before="0" w:after="40"/>
+        <w:spacing w:before="0" w:after="40" w:line="75" w:lineRule="exact"/>
       </w:pPr>
       <w:r>
         <w:rPr>
@@ -260,7 +260,7 @@
           </w:tcPr>
           <w:p>
             <w:pPr>
-              <w:spacing w:before="0" w:after="0"/>
+              <w:spacing w:before="0" w:after="0" w:line="189" w:lineRule="exact"/>
             </w:pPr>
             <w:r>
               <w:rPr>
@@ -290,7 +290,7 @@
           </w:tcPr>
           <w:p>
             <w:pPr>
-              <w:spacing w:before="0" w:after="0"/>
+              <w:spacing w:before="0" w:after="0" w:line="25" w:lineRule="exact"/>
             </w:pPr>
             <w:r>
               <w:rPr>
@@ -317,7 +317,7 @@
           </w:tcPr>
           <w:p>
             <w:pPr>
-              <w:spacing w:before="0" w:after="0"/>
+              <w:spacing w:before="0" w:after="0" w:line="189" w:lineRule="exact"/>
             </w:pPr>
             <w:r>
               <w:rPr>
@@ -338,7 +338,7 @@
       <w:tr>
         <w:trPr>
           <w:cantSplit/>
-          <w:trHeight w:val="282" w:hRule="atLeast"/>
+          <w:trHeight w:val="300" w:hRule="atLeast"/>
         </w:trPr>
         <w:tc>
           <w:tcPr>
@@ -353,7 +353,7 @@
           </w:tcPr>
           <w:p>
             <w:pPr>
-              <w:spacing w:before="0" w:after="0"/>
+              <w:spacing w:before="0" w:after="0" w:line="189" w:lineRule="exact"/>
             </w:pPr>
             <w:r>
               <w:rPr>
@@ -386,7 +386,7 @@
           </w:tcPr>
           <w:p>
             <w:pPr>
-              <w:spacing w:before="0" w:after="0"/>
+              <w:spacing w:before="0" w:after="0" w:line="239" w:lineRule="exact"/>
             </w:pPr>
             <w:sdt>
               <w:sdtPr>
@@ -434,7 +434,7 @@
           </w:tcPr>
           <w:p>
             <w:pPr>
-              <w:spacing w:before="0" w:after="0"/>
+              <w:spacing w:before="0" w:after="0" w:line="25" w:lineRule="exact"/>
             </w:pPr>
             <w:r>
               <w:rPr>
@@ -459,7 +459,7 @@
           </w:tcPr>
           <w:p>
             <w:pPr>
-              <w:spacing w:before="0" w:after="0"/>
+              <w:spacing w:before="0" w:after="0" w:line="189" w:lineRule="exact"/>
             </w:pPr>
             <w:r>
               <w:rPr>
@@ -492,7 +492,7 @@
           </w:tcPr>
           <w:p>
             <w:pPr>
-              <w:spacing w:before="0" w:after="0"/>
+              <w:spacing w:before="0" w:after="0" w:line="239" w:lineRule="exact"/>
             </w:pPr>
             <w:sdt>
               <w:sdtPr>
@@ -531,7 +531,7 @@
       <w:tr>
         <w:trPr>
           <w:cantSplit/>
-          <w:trHeight w:val="282" w:hRule="atLeast"/>
+          <w:trHeight w:val="300" w:hRule="atLeast"/>
         </w:trPr>
         <w:tc>
           <w:tcPr>
@@ -546,7 +546,7 @@
           </w:tcPr>
           <w:p>
             <w:pPr>
-              <w:spacing w:before="0" w:after="0"/>
+              <w:spacing w:before="0" w:after="0" w:line="189" w:lineRule="exact"/>
             </w:pPr>
             <w:r>
               <w:rPr>
@@ -579,7 +579,7 @@
           </w:tcPr>
           <w:p>
             <w:pPr>
-              <w:spacing w:before="0" w:after="0"/>
+              <w:spacing w:before="0" w:after="0" w:line="239" w:lineRule="exact"/>
             </w:pPr>
             <w:sdt>
               <w:sdtPr>
@@ -627,7 +627,7 @@
           </w:tcPr>
           <w:p>
             <w:pPr>
-              <w:spacing w:before="0" w:after="0"/>
+              <w:spacing w:before="0" w:after="0" w:line="25" w:lineRule="exact"/>
             </w:pPr>
             <w:r>
               <w:rPr>
@@ -652,7 +652,7 @@
           </w:tcPr>
           <w:p>
             <w:pPr>
-              <w:spacing w:before="0" w:after="0"/>
+              <w:spacing w:before="0" w:after="0" w:line="189" w:lineRule="exact"/>
             </w:pPr>
             <w:r>
               <w:rPr>
@@ -685,7 +685,7 @@
           </w:tcPr>
           <w:p>
             <w:pPr>
-              <w:spacing w:before="0" w:after="0"/>
+              <w:spacing w:before="0" w:after="0" w:line="239" w:lineRule="exact"/>
             </w:pPr>
             <w:sdt>
               <w:sdtPr>
@@ -724,7 +724,7 @@
       <w:tr>
         <w:trPr>
           <w:cantSplit/>
-          <w:trHeight w:val="282" w:hRule="atLeast"/>
+          <w:trHeight w:val="300" w:hRule="atLeast"/>
         </w:trPr>
         <w:tc>
           <w:tcPr>
@@ -739,7 +739,7 @@
           </w:tcPr>
           <w:p>
             <w:pPr>
-              <w:spacing w:before="0" w:after="0"/>
+              <w:spacing w:before="0" w:after="0" w:line="189" w:lineRule="exact"/>
             </w:pPr>
             <w:r>
               <w:rPr>
@@ -772,7 +772,7 @@
           </w:tcPr>
           <w:p>
             <w:pPr>
-              <w:spacing w:before="0" w:after="0"/>
+              <w:spacing w:before="0" w:after="0" w:line="239" w:lineRule="exact"/>
             </w:pPr>
             <w:sdt>
               <w:sdtPr>
@@ -820,7 +820,7 @@
           </w:tcPr>
           <w:p>
             <w:pPr>
-              <w:spacing w:before="0" w:after="0"/>
+              <w:spacing w:before="0" w:after="0" w:line="25" w:lineRule="exact"/>
             </w:pPr>
             <w:r>
               <w:rPr>
@@ -845,7 +845,7 @@
           </w:tcPr>
           <w:p>
             <w:pPr>
-              <w:spacing w:before="0" w:after="0"/>
+              <w:spacing w:before="0" w:after="0" w:line="189" w:lineRule="exact"/>
             </w:pPr>
             <w:r>
               <w:rPr>
@@ -878,7 +878,7 @@
           </w:tcPr>
           <w:p>
             <w:pPr>
-              <w:spacing w:before="0" w:after="0"/>
+              <w:spacing w:before="0" w:after="0" w:line="239" w:lineRule="exact"/>
             </w:pPr>
             <w:sdt>
               <w:sdtPr>
@@ -917,7 +917,7 @@
       <w:tr>
         <w:trPr>
           <w:cantSplit/>
-          <w:trHeight w:val="282" w:hRule="atLeast"/>
+          <w:trHeight w:val="300" w:hRule="atLeast"/>
         </w:trPr>
         <w:tc>
           <w:tcPr>
@@ -932,7 +932,7 @@
           </w:tcPr>
           <w:p>
             <w:pPr>
-              <w:spacing w:before="0" w:after="0"/>
+              <w:spacing w:before="0" w:after="0" w:line="189" w:lineRule="exact"/>
             </w:pPr>
             <w:r>
               <w:rPr>
@@ -965,7 +965,7 @@
           </w:tcPr>
           <w:p>
             <w:pPr>
-              <w:spacing w:before="0" w:after="0"/>
+              <w:spacing w:before="0" w:after="0" w:line="239" w:lineRule="exact"/>
             </w:pPr>
             <w:sdt>
               <w:sdtPr>
@@ -1013,7 +1013,7 @@
           </w:tcPr>
           <w:p>
             <w:pPr>
-              <w:spacing w:before="0" w:after="0"/>
+              <w:spacing w:before="0" w:after="0" w:line="25" w:lineRule="exact"/>
             </w:pPr>
             <w:r>
               <w:rPr>
@@ -1038,7 +1038,7 @@
           </w:tcPr>
           <w:p>
             <w:pPr>
-              <w:spacing w:before="0" w:after="0"/>
+              <w:spacing w:before="0" w:after="0" w:line="189" w:lineRule="exact"/>
             </w:pPr>
             <w:r>
               <w:rPr>
@@ -1071,7 +1071,7 @@
           </w:tcPr>
           <w:p>
             <w:pPr>
-              <w:spacing w:before="0" w:after="0"/>
+              <w:spacing w:before="0" w:after="0" w:line="239" w:lineRule="exact"/>
             </w:pPr>
             <w:sdt>
               <w:sdtPr>
@@ -1110,7 +1110,7 @@
       <w:tr>
         <w:trPr>
           <w:cantSplit/>
-          <w:trHeight w:val="282" w:hRule="atLeast"/>
+          <w:trHeight w:val="300" w:hRule="atLeast"/>
         </w:trPr>
         <w:tc>
           <w:tcPr>
@@ -1125,7 +1125,7 @@
           </w:tcPr>
           <w:p>
             <w:pPr>
-              <w:spacing w:before="0" w:after="0"/>
+              <w:spacing w:before="0" w:after="0" w:line="189" w:lineRule="exact"/>
             </w:pPr>
             <w:r>
               <w:rPr>
@@ -1158,7 +1158,7 @@
           </w:tcPr>
           <w:p>
             <w:pPr>
-              <w:spacing w:before="0" w:after="0"/>
+              <w:spacing w:before="0" w:after="0" w:line="239" w:lineRule="exact"/>
             </w:pPr>
             <w:sdt>
               <w:sdtPr>
@@ -1206,7 +1206,7 @@
           </w:tcPr>
           <w:p>
             <w:pPr>
-              <w:spacing w:before="0" w:after="0"/>
+              <w:spacing w:before="0" w:after="0" w:line="25" w:lineRule="exact"/>
             </w:pPr>
             <w:r>
               <w:rPr>
@@ -1231,7 +1231,7 @@
           </w:tcPr>
           <w:p>
             <w:pPr>
-              <w:spacing w:before="0" w:after="0"/>
+              <w:spacing w:before="0" w:after="0" w:line="25" w:lineRule="exact"/>
             </w:pPr>
             <w:r>
               <w:rPr>
@@ -1256,7 +1256,7 @@
           </w:tcPr>
           <w:p>
             <w:pPr>
-              <w:spacing w:before="0" w:after="0"/>
+              <w:spacing w:before="0" w:after="0" w:line="25" w:lineRule="exact"/>
             </w:pPr>
             <w:r>
               <w:rPr>
@@ -1272,7 +1272,7 @@
     </w:tbl>
     <w:p>
       <w:pPr>
-        <w:spacing w:before="0" w:after="70"/>
+        <w:spacing w:before="0" w:after="70" w:line="100" w:lineRule="exact"/>
       </w:pPr>
       <w:r>
         <w:rPr>
@@ -1324,7 +1324,7 @@
           </w:tcPr>
           <w:p>
             <w:pPr>
-              <w:spacing w:before="0" w:after="0"/>
+              <w:spacing w:before="0" w:after="0" w:line="214" w:lineRule="exact"/>
               <w:jc w:val="center"/>
             </w:pPr>
             <w:r>
@@ -1359,7 +1359,7 @@
           </w:tcPr>
           <w:p>
             <w:pPr>
-              <w:spacing w:before="0" w:after="0"/>
+              <w:spacing w:before="0" w:after="0" w:line="214" w:lineRule="exact"/>
             </w:pPr>
             <w:r>
               <w:rPr>
@@ -1393,7 +1393,7 @@
           </w:tcPr>
           <w:p>
             <w:pPr>
-              <w:spacing w:before="0" w:after="0"/>
+              <w:spacing w:before="0" w:after="0" w:line="214" w:lineRule="exact"/>
               <w:jc w:val="right"/>
             </w:pPr>
             <w:r>
@@ -1415,7 +1415,7 @@
       <w:tr>
         <w:trPr>
           <w:cantSplit/>
-          <w:trHeight w:val="365" w:hRule="atLeast"/>
+          <w:trHeight w:val="430" w:hRule="atLeast"/>
         </w:trPr>
         <w:tc>
           <w:tcPr>
@@ -1427,16 +1427,16 @@
             </w:tcBorders>
             <w:shd w:val="clear" w:color="auto" w:fill="FFFFFF"/>
             <w:tcMar>
-              <w:top w:w="120" w:type="dxa"/>
+              <w:top w:w="185" w:type="dxa"/>
               <w:left w:w="100" w:type="dxa"/>
-              <w:bottom w:w="120" w:type="dxa"/>
+              <w:bottom w:w="185" w:type="dxa"/>
               <w:right w:w="100" w:type="dxa"/>
             </w:tcMar>
             <w:vAlign w:val="center"/>
           </w:tcPr>
           <w:p>
             <w:pPr>
-              <w:spacing w:before="0" w:after="0"/>
+              <w:spacing w:before="0" w:after="0" w:line="239" w:lineRule="exact"/>
               <w:jc w:val="center"/>
             </w:pPr>
             <w:r>
@@ -1462,16 +1462,16 @@
             </w:tcBorders>
             <w:shd w:val="clear" w:color="auto" w:fill="FFFFFF"/>
             <w:tcMar>
-              <w:top w:w="120" w:type="dxa"/>
+              <w:top w:w="185" w:type="dxa"/>
               <w:left w:w="200" w:type="dxa"/>
-              <w:bottom w:w="120" w:type="dxa"/>
+              <w:bottom w:w="185" w:type="dxa"/>
               <w:right w:w="200" w:type="dxa"/>
             </w:tcMar>
             <w:vAlign w:val="center"/>
           </w:tcPr>
           <w:p>
             <w:pPr>
-              <w:spacing w:before="0" w:after="0"/>
+              <w:spacing w:before="0" w:after="0" w:line="239" w:lineRule="exact"/>
             </w:pPr>
             <w:sdt>
               <w:sdtPr>
@@ -1516,16 +1516,16 @@
             </w:tcBorders>
             <w:shd w:val="clear" w:color="auto" w:fill="FFFFFF"/>
             <w:tcMar>
-              <w:top w:w="120" w:type="dxa"/>
+              <w:top w:w="185" w:type="dxa"/>
               <w:left w:w="200" w:type="dxa"/>
-              <w:bottom w:w="120" w:type="dxa"/>
+              <w:bottom w:w="185" w:type="dxa"/>
               <w:right w:w="200" w:type="dxa"/>
             </w:tcMar>
             <w:vAlign w:val="center"/>
           </w:tcPr>
           <w:p>
             <w:pPr>
-              <w:spacing w:before="0" w:after="0"/>
+              <w:spacing w:before="0" w:after="0" w:line="239" w:lineRule="exact"/>
               <w:jc w:val="right"/>
             </w:pPr>
             <w:sdt>
@@ -1567,7 +1567,7 @@
       <w:tr>
         <w:trPr>
           <w:cantSplit/>
-          <w:trHeight w:val="365" w:hRule="atLeast"/>
+          <w:trHeight w:val="430" w:hRule="atLeast"/>
         </w:trPr>
         <w:tc>
           <w:tcPr>
@@ -1579,16 +1579,16 @@
             </w:tcBorders>
             <w:shd w:val="clear" w:color="auto" w:fill="FAFAFA"/>
             <w:tcMar>
-              <w:top w:w="120" w:type="dxa"/>
+              <w:top w:w="185" w:type="dxa"/>
               <w:left w:w="100" w:type="dxa"/>
-              <w:bottom w:w="120" w:type="dxa"/>
+              <w:bottom w:w="185" w:type="dxa"/>
               <w:right w:w="100" w:type="dxa"/>
             </w:tcMar>
             <w:vAlign w:val="center"/>
           </w:tcPr>
           <w:p>
             <w:pPr>
-              <w:spacing w:before="0" w:after="0"/>
+              <w:spacing w:before="0" w:after="0" w:line="239" w:lineRule="exact"/>
               <w:jc w:val="center"/>
             </w:pPr>
             <w:r>
@@ -1614,16 +1614,16 @@
             </w:tcBorders>
             <w:shd w:val="clear" w:color="auto" w:fill="FAFAFA"/>
             <w:tcMar>
-              <w:top w:w="120" w:type="dxa"/>
+              <w:top w:w="185" w:type="dxa"/>
               <w:left w:w="200" w:type="dxa"/>
-              <w:bottom w:w="120" w:type="dxa"/>
+              <w:bottom w:w="185" w:type="dxa"/>
               <w:right w:w="200" w:type="dxa"/>
             </w:tcMar>
             <w:vAlign w:val="center"/>
           </w:tcPr>
           <w:p>
             <w:pPr>
-              <w:spacing w:before="0" w:after="0"/>
+              <w:spacing w:before="0" w:after="0" w:line="239" w:lineRule="exact"/>
             </w:pPr>
             <w:sdt>
               <w:sdtPr>
@@ -1668,16 +1668,16 @@
             </w:tcBorders>
             <w:shd w:val="clear" w:color="auto" w:fill="FAFAFA"/>
             <w:tcMar>
-              <w:top w:w="120" w:type="dxa"/>
+              <w:top w:w="185" w:type="dxa"/>
               <w:left w:w="200" w:type="dxa"/>
-              <w:bottom w:w="120" w:type="dxa"/>
+              <w:bottom w:w="185" w:type="dxa"/>
               <w:right w:w="200" w:type="dxa"/>
             </w:tcMar>
             <w:vAlign w:val="center"/>
           </w:tcPr>
           <w:p>
             <w:pPr>
-              <w:spacing w:before="0" w:after="0"/>
+              <w:spacing w:before="0" w:after="0" w:line="239" w:lineRule="exact"/>
               <w:jc w:val="right"/>
             </w:pPr>
             <w:sdt>
@@ -1719,7 +1719,7 @@
       <w:tr>
         <w:trPr>
           <w:cantSplit/>
-          <w:trHeight w:val="365" w:hRule="atLeast"/>
+          <w:trHeight w:val="430" w:hRule="atLeast"/>
         </w:trPr>
         <w:tc>
           <w:tcPr>
@@ -1731,16 +1731,16 @@
             </w:tcBorders>
             <w:shd w:val="clear" w:color="auto" w:fill="FFFFFF"/>
             <w:tcMar>
-              <w:top w:w="120" w:type="dxa"/>
+              <w:top w:w="185" w:type="dxa"/>
               <w:left w:w="100" w:type="dxa"/>
-              <w:bottom w:w="120" w:type="dxa"/>
+              <w:bottom w:w="185" w:type="dxa"/>
               <w:right w:w="100" w:type="dxa"/>
             </w:tcMar>
             <w:vAlign w:val="center"/>
           </w:tcPr>
           <w:p>
             <w:pPr>
-              <w:spacing w:before="0" w:after="0"/>
+              <w:spacing w:before="0" w:after="0" w:line="239" w:lineRule="exact"/>
               <w:jc w:val="center"/>
             </w:pPr>
             <w:r>
@@ -1766,16 +1766,16 @@
             </w:tcBorders>
             <w:shd w:val="clear" w:color="auto" w:fill="FFFFFF"/>
             <w:tcMar>
-              <w:top w:w="120" w:type="dxa"/>
+              <w:top w:w="185" w:type="dxa"/>
               <w:left w:w="200" w:type="dxa"/>
-              <w:bottom w:w="120" w:type="dxa"/>
+              <w:bottom w:w="185" w:type="dxa"/>
               <w:right w:w="200" w:type="dxa"/>
             </w:tcMar>
             <w:vAlign w:val="center"/>
           </w:tcPr>
           <w:p>
             <w:pPr>
-              <w:spacing w:before="0" w:after="0"/>
+              <w:spacing w:before="0" w:after="0" w:line="239" w:lineRule="exact"/>
             </w:pPr>
             <w:sdt>
               <w:sdtPr>
@@ -1820,16 +1820,16 @@
             </w:tcBorders>
             <w:shd w:val="clear" w:color="auto" w:fill="FFFFFF"/>
             <w:tcMar>
-              <w:top w:w="120" w:type="dxa"/>
+              <w:top w:w="185" w:type="dxa"/>
               <w:left w:w="200" w:type="dxa"/>
-              <w:bottom w:w="120" w:type="dxa"/>
+              <w:bottom w:w="185" w:type="dxa"/>
               <w:right w:w="200" w:type="dxa"/>
             </w:tcMar>
             <w:vAlign w:val="center"/>
           </w:tcPr>
           <w:p>
             <w:pPr>
-              <w:spacing w:before="0" w:after="0"/>
+              <w:spacing w:before="0" w:after="0" w:line="239" w:lineRule="exact"/>
               <w:jc w:val="right"/>
             </w:pPr>
             <w:sdt>
@@ -1871,7 +1871,7 @@
       <w:tr>
         <w:trPr>
           <w:cantSplit/>
-          <w:trHeight w:val="365" w:hRule="atLeast"/>
+          <w:trHeight w:val="430" w:hRule="atLeast"/>
         </w:trPr>
         <w:tc>
           <w:tcPr>
@@ -1883,16 +1883,16 @@
             </w:tcBorders>
             <w:shd w:val="clear" w:color="auto" w:fill="FAFAFA"/>
             <w:tcMar>
-              <w:top w:w="120" w:type="dxa"/>
+              <w:top w:w="185" w:type="dxa"/>
               <w:left w:w="100" w:type="dxa"/>
-              <w:bottom w:w="120" w:type="dxa"/>
+              <w:bottom w:w="185" w:type="dxa"/>
               <w:right w:w="100" w:type="dxa"/>
             </w:tcMar>
             <w:vAlign w:val="center"/>
           </w:tcPr>
           <w:p>
             <w:pPr>
-              <w:spacing w:before="0" w:after="0"/>
+              <w:spacing w:before="0" w:after="0" w:line="239" w:lineRule="exact"/>
               <w:jc w:val="center"/>
             </w:pPr>
             <w:r>
@@ -1918,16 +1918,16 @@
             </w:tcBorders>
             <w:shd w:val="clear" w:color="auto" w:fill="FAFAFA"/>
             <w:tcMar>
-              <w:top w:w="120" w:type="dxa"/>
+              <w:top w:w="185" w:type="dxa"/>
               <w:left w:w="200" w:type="dxa"/>
-              <w:bottom w:w="120" w:type="dxa"/>
+              <w:bottom w:w="185" w:type="dxa"/>
               <w:right w:w="200" w:type="dxa"/>
             </w:tcMar>
             <w:vAlign w:val="center"/>
           </w:tcPr>
           <w:p>
             <w:pPr>
-              <w:spacing w:before="0" w:after="0"/>
+              <w:spacing w:before="0" w:after="0" w:line="239" w:lineRule="exact"/>
             </w:pPr>
             <w:sdt>
               <w:sdtPr>
@@ -1972,16 +1972,16 @@
             </w:tcBorders>
             <w:shd w:val="clear" w:color="auto" w:fill="FAFAFA"/>
             <w:tcMar>
-              <w:top w:w="120" w:type="dxa"/>
+              <w:top w:w="185" w:type="dxa"/>
               <w:left w:w="200" w:type="dxa"/>
-              <w:bottom w:w="120" w:type="dxa"/>
+              <w:bottom w:w="185" w:type="dxa"/>
               <w:right w:w="200" w:type="dxa"/>
             </w:tcMar>
             <w:vAlign w:val="center"/>
           </w:tcPr>
           <w:p>
             <w:pPr>
-              <w:spacing w:before="0" w:after="0"/>
+              <w:spacing w:before="0" w:after="0" w:line="239" w:lineRule="exact"/>
               <w:jc w:val="right"/>
             </w:pPr>
             <w:sdt>
@@ -2023,7 +2023,7 @@
       <w:tr>
         <w:trPr>
           <w:cantSplit/>
-          <w:trHeight w:val="365" w:hRule="atLeast"/>
+          <w:trHeight w:val="430" w:hRule="atLeast"/>
         </w:trPr>
         <w:tc>
           <w:tcPr>
@@ -2035,16 +2035,16 @@
             </w:tcBorders>
             <w:shd w:val="clear" w:color="auto" w:fill="FFFFFF"/>
             <w:tcMar>
-              <w:top w:w="120" w:type="dxa"/>
+              <w:top w:w="185" w:type="dxa"/>
               <w:left w:w="100" w:type="dxa"/>
-              <w:bottom w:w="120" w:type="dxa"/>
+              <w:bottom w:w="185" w:type="dxa"/>
               <w:right w:w="100" w:type="dxa"/>
             </w:tcMar>
             <w:vAlign w:val="center"/>
           </w:tcPr>
           <w:p>
             <w:pPr>
-              <w:spacing w:before="0" w:after="0"/>
+              <w:spacing w:before="0" w:after="0" w:line="239" w:lineRule="exact"/>
               <w:jc w:val="center"/>
             </w:pPr>
             <w:r>
@@ -2070,16 +2070,16 @@
             </w:tcBorders>
             <w:shd w:val="clear" w:color="auto" w:fill="FFFFFF"/>
             <w:tcMar>
-              <w:top w:w="120" w:type="dxa"/>
+              <w:top w:w="185" w:type="dxa"/>
               <w:left w:w="200" w:type="dxa"/>
-              <w:bottom w:w="120" w:type="dxa"/>
+              <w:bottom w:w="185" w:type="dxa"/>
               <w:right w:w="200" w:type="dxa"/>
             </w:tcMar>
             <w:vAlign w:val="center"/>
           </w:tcPr>
           <w:p>
             <w:pPr>
-              <w:spacing w:before="0" w:after="0"/>
+              <w:spacing w:before="0" w:after="0" w:line="239" w:lineRule="exact"/>
             </w:pPr>
             <w:sdt>
               <w:sdtPr>
@@ -2124,16 +2124,16 @@
             </w:tcBorders>
             <w:shd w:val="clear" w:color="auto" w:fill="FFFFFF"/>
             <w:tcMar>
-              <w:top w:w="120" w:type="dxa"/>
+              <w:top w:w="185" w:type="dxa"/>
               <w:left w:w="200" w:type="dxa"/>
-              <w:bottom w:w="120" w:type="dxa"/>
+              <w:bottom w:w="185" w:type="dxa"/>
               <w:right w:w="200" w:type="dxa"/>
             </w:tcMar>
             <w:vAlign w:val="center"/>
           </w:tcPr>
           <w:p>
             <w:pPr>
-              <w:spacing w:before="0" w:after="0"/>
+              <w:spacing w:before="0" w:after="0" w:line="239" w:lineRule="exact"/>
               <w:jc w:val="right"/>
             </w:pPr>
             <w:sdt>
@@ -2175,7 +2175,7 @@
     </w:tbl>
     <w:p>
       <w:pPr>
-        <w:spacing w:before="0" w:after="70"/>
+        <w:spacing w:before="0" w:after="70" w:line="100" w:lineRule="exact"/>
       </w:pPr>
       <w:r>
         <w:rPr>
@@ -2219,7 +2219,7 @@
           </w:tcPr>
           <w:p>
             <w:pPr>
-              <w:spacing w:before="0" w:after="60"/>
+              <w:spacing w:before="0" w:after="60" w:line="189" w:lineRule="exact"/>
             </w:pPr>
             <w:r>
               <w:rPr>
@@ -2240,7 +2240,7 @@
               <w:pBdr>
                 <w:bottom w:val="single" w:sz="6" w:space="4" w:color="C9C9C9"/>
               </w:pBdr>
-              <w:spacing w:before="40" w:after="90"/>
+              <w:spacing w:before="40" w:after="90" w:line="239" w:lineRule="exact"/>
             </w:pPr>
             <w:sdt>
               <w:sdtPr>
@@ -2276,7 +2276,7 @@
           </w:p>
           <w:p>
             <w:pPr>
-              <w:spacing w:before="60" w:after="60"/>
+              <w:spacing w:before="60" w:after="60" w:line="189" w:lineRule="exact"/>
             </w:pPr>
             <w:r>
               <w:rPr>
@@ -2297,7 +2297,7 @@
               <w:pBdr>
                 <w:bottom w:val="single" w:sz="6" w:space="4" w:color="C9C9C9"/>
               </w:pBdr>
-              <w:spacing w:before="40" w:after="90"/>
+              <w:spacing w:before="40" w:after="90" w:line="239" w:lineRule="exact"/>
             </w:pPr>
             <w:sdt>
               <w:sdtPr>
@@ -2336,7 +2336,7 @@
               <w:pBdr>
                 <w:bottom w:val="single" w:sz="6" w:space="4" w:color="C9C9C9"/>
               </w:pBdr>
-              <w:spacing w:before="40" w:after="90"/>
+              <w:spacing w:before="40" w:after="90" w:line="239" w:lineRule="exact"/>
             </w:pPr>
             <w:sdt>
               <w:sdtPr>
@@ -2406,6 +2406,9 @@
               <w:tc>
                 <w:tcPr>
                   <w:tcW w:w="1700" w:type="dxa"/>
+                  <w:tcBorders>
+                    <w:right w:val="single" w:sz="4" w:space="0" w:color="C21112"/>
+                  </w:tcBorders>
                   <w:shd w:val="clear" w:color="auto" w:fill="C21112"/>
                   <w:tcMar>
                     <w:top w:w="170" w:type="dxa"/>
@@ -2417,7 +2420,7 @@
                 </w:tcPr>
                 <w:p>
                   <w:pPr>
-                    <w:spacing w:before="0" w:after="0"/>
+                    <w:spacing w:before="0" w:after="0" w:line="277" w:lineRule="exact"/>
                   </w:pPr>
                   <w:r>
                     <w:rPr>
@@ -2437,6 +2440,9 @@
               <w:tc>
                 <w:tcPr>
                   <w:tcW w:w="2668" w:type="dxa"/>
+                  <w:tcBorders>
+                    <w:left w:val="single" w:sz="4" w:space="0" w:color="C21112"/>
+                  </w:tcBorders>
                   <w:shd w:val="clear" w:color="auto" w:fill="C21112"/>
                   <w:tcMar>
                     <w:top w:w="170" w:type="dxa"/>
@@ -2448,7 +2454,7 @@
                 </w:tcPr>
                 <w:p>
                   <w:pPr>
-                    <w:spacing w:before="0" w:after="0"/>
+                    <w:spacing w:before="0" w:after="0" w:line="327" w:lineRule="exact"/>
                     <w:jc w:val="right"/>
                   </w:pPr>
                   <w:sdt>
@@ -2490,7 +2496,7 @@
           </w:tbl>
           <w:p>
             <w:pPr>
-              <w:spacing w:before="0" w:after="0"/>
+              <w:spacing w:before="0" w:after="0" w:line="25" w:lineRule="exact"/>
             </w:pPr>
             <w:r>
               <w:rPr>
@@ -2506,7 +2512,7 @@
     </w:tbl>
     <w:p>
       <w:pPr>
-        <w:spacing w:before="0" w:after="40"/>
+        <w:spacing w:before="0" w:after="40" w:line="75" w:lineRule="exact"/>
       </w:pPr>
       <w:r>
         <w:rPr>
@@ -2551,7 +2557,7 @@
           </w:tcPr>
           <w:p>
             <w:pPr>
-              <w:spacing w:before="0" w:after="0"/>
+              <w:spacing w:before="0" w:after="0" w:line="214" w:lineRule="exact"/>
             </w:pPr>
             <w:r>
               <w:rPr>
@@ -2572,7 +2578,7 @@
     </w:tbl>
     <w:p>
       <w:pPr>
-        <w:spacing w:before="0" w:after="90"/>
+        <w:spacing w:before="0" w:after="90" w:line="126" w:lineRule="exact"/>
       </w:pPr>
       <w:r>
         <w:rPr>
@@ -2602,7 +2608,7 @@
       <w:tr>
         <w:trPr>
           <w:cantSplit/>
-          <w:trHeight w:val="235" w:hRule="atLeast"/>
+          <w:trHeight w:val="250" w:hRule="atLeast"/>
         </w:trPr>
         <w:tc>
           <w:tcPr>
@@ -2702,7 +2708,7 @@
       <w:tr>
         <w:trPr>
           <w:cantSplit/>
-          <w:trHeight w:val="235" w:hRule="atLeast"/>
+          <w:trHeight w:val="250" w:hRule="atLeast"/>
         </w:trPr>
         <w:tc>
           <w:tcPr>
@@ -2802,7 +2808,7 @@
       <w:tr>
         <w:trPr>
           <w:cantSplit/>
-          <w:trHeight w:val="235" w:hRule="atLeast"/>
+          <w:trHeight w:val="250" w:hRule="atLeast"/>
         </w:trPr>
         <w:tc>
           <w:tcPr>
@@ -2902,7 +2908,7 @@
       <w:tr>
         <w:trPr>
           <w:cantSplit/>
-          <w:trHeight w:val="235" w:hRule="atLeast"/>
+          <w:trHeight w:val="250" w:hRule="atLeast"/>
         </w:trPr>
         <w:tc>
           <w:tcPr>
@@ -3002,7 +3008,7 @@
       <w:tr>
         <w:trPr>
           <w:cantSplit/>
-          <w:trHeight w:val="235" w:hRule="atLeast"/>
+          <w:trHeight w:val="250" w:hRule="atLeast"/>
         </w:trPr>
         <w:tc>
           <w:tcPr>
@@ -3136,7 +3142,7 @@
               <w:pBdr>
                 <w:top w:val="single" w:sz="6" w:space="0" w:color="111111"/>
               </w:pBdr>
-              <w:spacing w:before="120" w:after="0"/>
+              <w:spacing w:before="120" w:after="0" w:line="25" w:lineRule="exact"/>
               <w:ind w:left="700" w:right="700"/>
             </w:pPr>
             <w:r>
@@ -3150,7 +3156,7 @@
           </w:p>
           <w:p>
             <w:pPr>
-              <w:spacing w:before="110" w:after="50"/>
+              <w:spacing w:before="110" w:after="50" w:line="214" w:lineRule="exact"/>
               <w:jc w:val="center"/>
             </w:pPr>
             <w:r>
@@ -3169,7 +3175,7 @@
           </w:p>
           <w:p>
             <w:pPr>
-              <w:spacing w:before="0" w:after="0"/>
+              <w:spacing w:before="0" w:after="0" w:line="189" w:lineRule="exact"/>
               <w:jc w:val="center"/>
             </w:pPr>
             <w:r>
@@ -3199,7 +3205,7 @@
               <w:pBdr>
                 <w:top w:val="single" w:sz="6" w:space="0" w:color="111111"/>
               </w:pBdr>
-              <w:spacing w:before="120" w:after="0"/>
+              <w:spacing w:before="120" w:after="0" w:line="25" w:lineRule="exact"/>
               <w:ind w:left="700" w:right="700"/>
             </w:pPr>
             <w:r>
@@ -3213,7 +3219,7 @@
           </w:p>
           <w:p>
             <w:pPr>
-              <w:spacing w:before="110" w:after="50"/>
+              <w:spacing w:before="110" w:after="50" w:line="214" w:lineRule="exact"/>
               <w:jc w:val="center"/>
             </w:pPr>
             <w:r>
@@ -3232,7 +3238,7 @@
           </w:p>
           <w:p>
             <w:pPr>
-              <w:spacing w:before="0" w:after="0"/>
+              <w:spacing w:before="0" w:after="0" w:line="189" w:lineRule="exact"/>
               <w:jc w:val="center"/>
             </w:pPr>
             <w:r>
@@ -3250,7 +3256,7 @@
     </w:tbl>
     <w:p>
       <w:pPr>
-        <w:spacing w:before="20" w:after="0"/>
+        <w:spacing w:before="20" w:after="0" w:line="163" w:lineRule="exact"/>
         <w:jc w:val="center"/>
       </w:pPr>
       <w:r>
@@ -3313,7 +3319,7 @@
         </w:tcPr>
         <w:p>
           <w:pPr>
-            <w:spacing w:before="0" w:after="0"/>
+            <w:spacing w:before="0" w:after="0" w:line="25" w:lineRule="exact"/>
           </w:pPr>
           <w:r>
             <w:rPr>
@@ -3338,7 +3344,7 @@
         </w:tcPr>
         <w:p>
           <w:pPr>
-            <w:spacing w:before="0" w:after="0"/>
+            <w:spacing w:before="0" w:after="0" w:line="277" w:lineRule="exact"/>
             <w:jc w:val="center"/>
           </w:pPr>
           <w:r>
@@ -3385,7 +3391,7 @@
         </w:tcPr>
         <w:p>
           <w:pPr>
-            <w:spacing w:before="0" w:after="0"/>
+            <w:spacing w:before="0" w:after="0" w:line="163" w:lineRule="exact"/>
             <w:jc w:val="right"/>
           </w:pPr>
           <w:r>
@@ -3525,7 +3531,7 @@
       <w:pBdr>
         <w:bottom w:val="single" w:sz="4" w:space="0" w:color="E4E4E4"/>
       </w:pBdr>
-      <w:spacing w:before="70" w:after="0"/>
+      <w:spacing w:before="70" w:after="0" w:line="25" w:lineRule="exact"/>
     </w:pPr>
     <w:r>
       <w:rPr>
@@ -3538,7 +3544,7 @@
   </w:p>
   <w:p>
     <w:pPr>
-      <w:spacing w:before="0" w:after="70"/>
+      <w:spacing w:before="0" w:after="70" w:line="50" w:lineRule="exact"/>
     </w:pPr>
     <w:r>
       <w:rPr>
@@ -3584,7 +3590,7 @@
         </w:tcPr>
         <w:p>
           <w:pPr>
-            <w:spacing w:before="0" w:after="40"/>
+            <w:spacing w:before="0" w:after="40" w:line="151" w:lineRule="exact"/>
           </w:pPr>
           <w:r>
             <w:rPr>
@@ -3653,7 +3659,7 @@
         </w:tcPr>
         <w:p>
           <w:pPr>
-            <w:spacing w:before="0" w:after="40"/>
+            <w:spacing w:before="0" w:after="40" w:line="151" w:lineRule="exact"/>
           </w:pPr>
           <w:r>
             <w:rPr>
@@ -3671,7 +3677,7 @@
         </w:p>
         <w:p>
           <w:pPr>
-            <w:spacing w:before="0" w:after="12"/>
+            <w:spacing w:before="0" w:after="12" w:line="138" w:lineRule="exact"/>
           </w:pPr>
           <w:r>
             <w:rPr>
@@ -3685,7 +3691,7 @@
         </w:p>
         <w:p>
           <w:pPr>
-            <w:spacing w:before="0" w:after="12"/>
+            <w:spacing w:before="0" w:after="12" w:line="138" w:lineRule="exact"/>
           </w:pPr>
           <w:r>
             <w:rPr>
@@ -3711,7 +3717,7 @@
         </w:tcPr>
         <w:p>
           <w:pPr>
-            <w:spacing w:before="0" w:after="40"/>
+            <w:spacing w:before="0" w:after="40" w:line="151" w:lineRule="exact"/>
           </w:pPr>
           <w:r>
             <w:rPr>
@@ -3729,7 +3735,7 @@
         </w:p>
         <w:p>
           <w:pPr>
-            <w:spacing w:before="0" w:after="12"/>
+            <w:spacing w:before="0" w:after="12" w:line="138" w:lineRule="exact"/>
           </w:pPr>
           <w:r>
             <w:rPr>
@@ -3743,7 +3749,7 @@
         </w:p>
         <w:p>
           <w:pPr>
-            <w:spacing w:before="0" w:after="12"/>
+            <w:spacing w:before="0" w:after="12" w:line="138" w:lineRule="exact"/>
           </w:pPr>
           <w:r>
             <w:rPr>
@@ -3769,7 +3775,7 @@
         </w:tcPr>
         <w:p>
           <w:pPr>
-            <w:spacing w:before="0" w:after="40"/>
+            <w:spacing w:before="0" w:after="40" w:line="151" w:lineRule="exact"/>
           </w:pPr>
           <w:r>
             <w:rPr>
@@ -3787,7 +3793,7 @@
         </w:p>
         <w:p>
           <w:pPr>
-            <w:spacing w:before="0" w:after="12"/>
+            <w:spacing w:before="0" w:after="12" w:line="138" w:lineRule="exact"/>
           </w:pPr>
           <w:r>
             <w:rPr>
@@ -3801,7 +3807,7 @@
         </w:p>
         <w:p>
           <w:pPr>
-            <w:spacing w:before="0" w:after="12"/>
+            <w:spacing w:before="0" w:after="12" w:line="138" w:lineRule="exact"/>
           </w:pPr>
           <w:r>
             <w:rPr>

</xml_diff>

<commit_message>
Cotizaciones: fuera el apartado de firmas del formato de una hoja
Se quitan ELABORO y ACEPTACION DEL CLIENTE con sus lineas y pies. Queda
la nota de aceptacion, que es una condicion comercial y no una firma.

El espacio liberado se deja como margen: la hoja cierra con 19 mm libres
antes del pie de pagina, para que quepa en una sola pagina aunque Word
mida un poco distinto.

Co-Authored-By: Claude Opus 5 <noreply@anthropic.com>
Claude-Session: https://claude.ai/code/session_017DE5RtjtLFhQ3FcsP1iHRy
</commit_message>
<xml_diff>
--- a/plantillas/cotizador/salida/FORMATO_COTIZACION_FLETES_TAURO.docx
+++ b/plantillas/cotizador/salida/FORMATO_COTIZACION_FLETES_TAURO.docx
@@ -1427,9 +1427,9 @@
             </w:tcBorders>
             <w:shd w:val="clear" w:color="auto" w:fill="FFFFFF"/>
             <w:tcMar>
-              <w:top w:w="185" w:type="dxa"/>
+              <w:top w:w="190" w:type="dxa"/>
               <w:left w:w="100" w:type="dxa"/>
-              <w:bottom w:w="185" w:type="dxa"/>
+              <w:bottom w:w="190" w:type="dxa"/>
               <w:right w:w="100" w:type="dxa"/>
             </w:tcMar>
             <w:vAlign w:val="center"/>
@@ -1462,9 +1462,9 @@
             </w:tcBorders>
             <w:shd w:val="clear" w:color="auto" w:fill="FFFFFF"/>
             <w:tcMar>
-              <w:top w:w="185" w:type="dxa"/>
+              <w:top w:w="190" w:type="dxa"/>
               <w:left w:w="200" w:type="dxa"/>
-              <w:bottom w:w="185" w:type="dxa"/>
+              <w:bottom w:w="190" w:type="dxa"/>
               <w:right w:w="200" w:type="dxa"/>
             </w:tcMar>
             <w:vAlign w:val="center"/>
@@ -1516,9 +1516,9 @@
             </w:tcBorders>
             <w:shd w:val="clear" w:color="auto" w:fill="FFFFFF"/>
             <w:tcMar>
-              <w:top w:w="185" w:type="dxa"/>
+              <w:top w:w="190" w:type="dxa"/>
               <w:left w:w="200" w:type="dxa"/>
-              <w:bottom w:w="185" w:type="dxa"/>
+              <w:bottom w:w="190" w:type="dxa"/>
               <w:right w:w="200" w:type="dxa"/>
             </w:tcMar>
             <w:vAlign w:val="center"/>
@@ -1579,9 +1579,9 @@
             </w:tcBorders>
             <w:shd w:val="clear" w:color="auto" w:fill="FAFAFA"/>
             <w:tcMar>
-              <w:top w:w="185" w:type="dxa"/>
+              <w:top w:w="190" w:type="dxa"/>
               <w:left w:w="100" w:type="dxa"/>
-              <w:bottom w:w="185" w:type="dxa"/>
+              <w:bottom w:w="190" w:type="dxa"/>
               <w:right w:w="100" w:type="dxa"/>
             </w:tcMar>
             <w:vAlign w:val="center"/>
@@ -1614,9 +1614,9 @@
             </w:tcBorders>
             <w:shd w:val="clear" w:color="auto" w:fill="FAFAFA"/>
             <w:tcMar>
-              <w:top w:w="185" w:type="dxa"/>
+              <w:top w:w="190" w:type="dxa"/>
               <w:left w:w="200" w:type="dxa"/>
-              <w:bottom w:w="185" w:type="dxa"/>
+              <w:bottom w:w="190" w:type="dxa"/>
               <w:right w:w="200" w:type="dxa"/>
             </w:tcMar>
             <w:vAlign w:val="center"/>
@@ -1668,9 +1668,9 @@
             </w:tcBorders>
             <w:shd w:val="clear" w:color="auto" w:fill="FAFAFA"/>
             <w:tcMar>
-              <w:top w:w="185" w:type="dxa"/>
+              <w:top w:w="190" w:type="dxa"/>
               <w:left w:w="200" w:type="dxa"/>
-              <w:bottom w:w="185" w:type="dxa"/>
+              <w:bottom w:w="190" w:type="dxa"/>
               <w:right w:w="200" w:type="dxa"/>
             </w:tcMar>
             <w:vAlign w:val="center"/>
@@ -1731,9 +1731,9 @@
             </w:tcBorders>
             <w:shd w:val="clear" w:color="auto" w:fill="FFFFFF"/>
             <w:tcMar>
-              <w:top w:w="185" w:type="dxa"/>
+              <w:top w:w="190" w:type="dxa"/>
               <w:left w:w="100" w:type="dxa"/>
-              <w:bottom w:w="185" w:type="dxa"/>
+              <w:bottom w:w="190" w:type="dxa"/>
               <w:right w:w="100" w:type="dxa"/>
             </w:tcMar>
             <w:vAlign w:val="center"/>
@@ -1766,9 +1766,9 @@
             </w:tcBorders>
             <w:shd w:val="clear" w:color="auto" w:fill="FFFFFF"/>
             <w:tcMar>
-              <w:top w:w="185" w:type="dxa"/>
+              <w:top w:w="190" w:type="dxa"/>
               <w:left w:w="200" w:type="dxa"/>
-              <w:bottom w:w="185" w:type="dxa"/>
+              <w:bottom w:w="190" w:type="dxa"/>
               <w:right w:w="200" w:type="dxa"/>
             </w:tcMar>
             <w:vAlign w:val="center"/>
@@ -1820,9 +1820,9 @@
             </w:tcBorders>
             <w:shd w:val="clear" w:color="auto" w:fill="FFFFFF"/>
             <w:tcMar>
-              <w:top w:w="185" w:type="dxa"/>
+              <w:top w:w="190" w:type="dxa"/>
               <w:left w:w="200" w:type="dxa"/>
-              <w:bottom w:w="185" w:type="dxa"/>
+              <w:bottom w:w="190" w:type="dxa"/>
               <w:right w:w="200" w:type="dxa"/>
             </w:tcMar>
             <w:vAlign w:val="center"/>
@@ -1883,9 +1883,9 @@
             </w:tcBorders>
             <w:shd w:val="clear" w:color="auto" w:fill="FAFAFA"/>
             <w:tcMar>
-              <w:top w:w="185" w:type="dxa"/>
+              <w:top w:w="190" w:type="dxa"/>
               <w:left w:w="100" w:type="dxa"/>
-              <w:bottom w:w="185" w:type="dxa"/>
+              <w:bottom w:w="190" w:type="dxa"/>
               <w:right w:w="100" w:type="dxa"/>
             </w:tcMar>
             <w:vAlign w:val="center"/>
@@ -1918,9 +1918,9 @@
             </w:tcBorders>
             <w:shd w:val="clear" w:color="auto" w:fill="FAFAFA"/>
             <w:tcMar>
-              <w:top w:w="185" w:type="dxa"/>
+              <w:top w:w="190" w:type="dxa"/>
               <w:left w:w="200" w:type="dxa"/>
-              <w:bottom w:w="185" w:type="dxa"/>
+              <w:bottom w:w="190" w:type="dxa"/>
               <w:right w:w="200" w:type="dxa"/>
             </w:tcMar>
             <w:vAlign w:val="center"/>
@@ -1972,9 +1972,9 @@
             </w:tcBorders>
             <w:shd w:val="clear" w:color="auto" w:fill="FAFAFA"/>
             <w:tcMar>
-              <w:top w:w="185" w:type="dxa"/>
+              <w:top w:w="190" w:type="dxa"/>
               <w:left w:w="200" w:type="dxa"/>
-              <w:bottom w:w="185" w:type="dxa"/>
+              <w:bottom w:w="190" w:type="dxa"/>
               <w:right w:w="200" w:type="dxa"/>
             </w:tcMar>
             <w:vAlign w:val="center"/>
@@ -2035,9 +2035,9 @@
             </w:tcBorders>
             <w:shd w:val="clear" w:color="auto" w:fill="FFFFFF"/>
             <w:tcMar>
-              <w:top w:w="185" w:type="dxa"/>
+              <w:top w:w="190" w:type="dxa"/>
               <w:left w:w="100" w:type="dxa"/>
-              <w:bottom w:w="185" w:type="dxa"/>
+              <w:bottom w:w="190" w:type="dxa"/>
               <w:right w:w="100" w:type="dxa"/>
             </w:tcMar>
             <w:vAlign w:val="center"/>
@@ -2070,9 +2070,9 @@
             </w:tcBorders>
             <w:shd w:val="clear" w:color="auto" w:fill="FFFFFF"/>
             <w:tcMar>
-              <w:top w:w="185" w:type="dxa"/>
+              <w:top w:w="190" w:type="dxa"/>
               <w:left w:w="200" w:type="dxa"/>
-              <w:bottom w:w="185" w:type="dxa"/>
+              <w:bottom w:w="190" w:type="dxa"/>
               <w:right w:w="200" w:type="dxa"/>
             </w:tcMar>
             <w:vAlign w:val="center"/>
@@ -2124,9 +2124,9 @@
             </w:tcBorders>
             <w:shd w:val="clear" w:color="auto" w:fill="FFFFFF"/>
             <w:tcMar>
-              <w:top w:w="185" w:type="dxa"/>
+              <w:top w:w="190" w:type="dxa"/>
               <w:left w:w="200" w:type="dxa"/>
-              <w:bottom w:w="185" w:type="dxa"/>
+              <w:bottom w:w="190" w:type="dxa"/>
               <w:right w:w="200" w:type="dxa"/>
             </w:tcMar>
             <w:vAlign w:val="center"/>
@@ -2240,7 +2240,7 @@
               <w:pBdr>
                 <w:bottom w:val="single" w:sz="6" w:space="4" w:color="C9C9C9"/>
               </w:pBdr>
-              <w:spacing w:before="40" w:after="90" w:line="239" w:lineRule="exact"/>
+              <w:spacing w:before="50" w:after="120" w:line="239" w:lineRule="exact"/>
             </w:pPr>
             <w:sdt>
               <w:sdtPr>
@@ -2297,7 +2297,7 @@
               <w:pBdr>
                 <w:bottom w:val="single" w:sz="6" w:space="4" w:color="C9C9C9"/>
               </w:pBdr>
-              <w:spacing w:before="40" w:after="90" w:line="239" w:lineRule="exact"/>
+              <w:spacing w:before="50" w:after="120" w:line="239" w:lineRule="exact"/>
             </w:pPr>
             <w:sdt>
               <w:sdtPr>
@@ -2336,7 +2336,7 @@
               <w:pBdr>
                 <w:bottom w:val="single" w:sz="6" w:space="4" w:color="C9C9C9"/>
               </w:pBdr>
-              <w:spacing w:before="40" w:after="90" w:line="239" w:lineRule="exact"/>
+              <w:spacing w:before="50" w:after="120" w:line="239" w:lineRule="exact"/>
             </w:pPr>
             <w:sdt>
               <w:sdtPr>
@@ -3106,157 +3106,9 @@
         </w:tc>
       </w:tr>
     </w:tbl>
-    <w:tbl>
-      <w:tblPr>
-        <w:tblW w:w="10368" w:type="dxa"/>
-        <w:tblLayout w:type="fixed"/>
-        <w:tblCellMar>
-          <w:top w:w="60" w:type="dxa"/>
-          <w:left w:w="100" w:type="dxa"/>
-          <w:bottom w:w="60" w:type="dxa"/>
-          <w:right w:w="100" w:type="dxa"/>
-        </w:tblCellMar>
-        <w:tblLook w:val="0000" w:firstRow="0" w:lastRow="0" w:firstColumn="0" w:lastColumn="0" w:noHBand="1" w:noVBand="1"/>
-      </w:tblPr>
-      <w:tblGrid>
-        <w:gridCol w:w="5184"/>
-        <w:gridCol w:w="5184"/>
-      </w:tblGrid>
-      <w:tr>
-        <w:trPr>
-          <w:cantSplit/>
-        </w:trPr>
-        <w:tc>
-          <w:tcPr>
-            <w:tcW w:w="5184" w:type="dxa"/>
-            <w:tcMar>
-              <w:top w:w="0" w:type="dxa"/>
-              <w:left w:w="200" w:type="dxa"/>
-              <w:bottom w:w="0" w:type="dxa"/>
-              <w:right w:w="200" w:type="dxa"/>
-            </w:tcMar>
-            <w:vAlign w:val="top"/>
-          </w:tcPr>
-          <w:p>
-            <w:pPr>
-              <w:pBdr>
-                <w:top w:val="single" w:sz="6" w:space="0" w:color="111111"/>
-              </w:pBdr>
-              <w:spacing w:before="120" w:after="0" w:line="25" w:lineRule="exact"/>
-              <w:ind w:left="700" w:right="700"/>
-            </w:pPr>
-            <w:r>
-              <w:rPr>
-                <w:rFonts w:ascii="Segoe UI" w:hAnsi="Segoe UI" w:cs="Segoe UI"/>
-                <w:color w:val="33383D"/>
-                <w:sz w:val="2"/>
-                <w:szCs w:val="2"/>
-              </w:rPr>
-            </w:r>
-          </w:p>
-          <w:p>
-            <w:pPr>
-              <w:spacing w:before="110" w:after="50" w:line="214" w:lineRule="exact"/>
-              <w:jc w:val="center"/>
-            </w:pPr>
-            <w:r>
-              <w:rPr>
-                <w:rFonts w:ascii="Segoe UI Semibold" w:hAnsi="Segoe UI Semibold" w:cs="Segoe UI Semibold"/>
-                <w:b/>
-                <w:bCs/>
-                <w:caps/>
-                <w:color w:val="111111"/>
-                <w:spacing w:val="70"/>
-                <w:sz w:val="17"/>
-                <w:szCs w:val="17"/>
-              </w:rPr>
-              <w:t xml:space="preserve">Elaboró</w:t>
-            </w:r>
-          </w:p>
-          <w:p>
-            <w:pPr>
-              <w:spacing w:before="0" w:after="0" w:line="189" w:lineRule="exact"/>
-              <w:jc w:val="center"/>
-            </w:pPr>
-            <w:r>
-              <w:rPr>
-                <w:rFonts w:ascii="Segoe UI" w:hAnsi="Segoe UI" w:cs="Segoe UI"/>
-                <w:color w:val="6E6E6E"/>
-                <w:sz w:val="15"/>
-                <w:szCs w:val="15"/>
-              </w:rPr>
-              <w:t xml:space="preserve">Ejecutivo de cuenta · Fletes Tauro</w:t>
-            </w:r>
-          </w:p>
-        </w:tc>
-        <w:tc>
-          <w:tcPr>
-            <w:tcW w:w="5184" w:type="dxa"/>
-            <w:tcMar>
-              <w:top w:w="0" w:type="dxa"/>
-              <w:left w:w="200" w:type="dxa"/>
-              <w:bottom w:w="0" w:type="dxa"/>
-              <w:right w:w="200" w:type="dxa"/>
-            </w:tcMar>
-            <w:vAlign w:val="top"/>
-          </w:tcPr>
-          <w:p>
-            <w:pPr>
-              <w:pBdr>
-                <w:top w:val="single" w:sz="6" w:space="0" w:color="111111"/>
-              </w:pBdr>
-              <w:spacing w:before="120" w:after="0" w:line="25" w:lineRule="exact"/>
-              <w:ind w:left="700" w:right="700"/>
-            </w:pPr>
-            <w:r>
-              <w:rPr>
-                <w:rFonts w:ascii="Segoe UI" w:hAnsi="Segoe UI" w:cs="Segoe UI"/>
-                <w:color w:val="33383D"/>
-                <w:sz w:val="2"/>
-                <w:szCs w:val="2"/>
-              </w:rPr>
-            </w:r>
-          </w:p>
-          <w:p>
-            <w:pPr>
-              <w:spacing w:before="110" w:after="50" w:line="214" w:lineRule="exact"/>
-              <w:jc w:val="center"/>
-            </w:pPr>
-            <w:r>
-              <w:rPr>
-                <w:rFonts w:ascii="Segoe UI Semibold" w:hAnsi="Segoe UI Semibold" w:cs="Segoe UI Semibold"/>
-                <w:b/>
-                <w:bCs/>
-                <w:caps/>
-                <w:color w:val="111111"/>
-                <w:spacing w:val="70"/>
-                <w:sz w:val="17"/>
-                <w:szCs w:val="17"/>
-              </w:rPr>
-              <w:t xml:space="preserve">Aceptación del cliente</w:t>
-            </w:r>
-          </w:p>
-          <w:p>
-            <w:pPr>
-              <w:spacing w:before="0" w:after="0" w:line="189" w:lineRule="exact"/>
-              <w:jc w:val="center"/>
-            </w:pPr>
-            <w:r>
-              <w:rPr>
-                <w:rFonts w:ascii="Segoe UI" w:hAnsi="Segoe UI" w:cs="Segoe UI"/>
-                <w:color w:val="6E6E6E"/>
-                <w:sz w:val="15"/>
-                <w:szCs w:val="15"/>
-              </w:rPr>
-              <w:t xml:space="preserve">Nombre, firma y sello</w:t>
-            </w:r>
-          </w:p>
-        </w:tc>
-      </w:tr>
-    </w:tbl>
     <w:p>
       <w:pPr>
-        <w:spacing w:before="20" w:after="0" w:line="163" w:lineRule="exact"/>
+        <w:spacing w:before="170" w:after="0" w:line="163" w:lineRule="exact"/>
         <w:jc w:val="center"/>
       </w:pPr>
       <w:r>

</xml_diff>

<commit_message>
Cotizaciones: el formato usa Arial para que la hoja mida igual en todos lados
Segoe UI no existe en todas las maquinas y al sustituirse ocupa mas ancho:
las condiciones se partian en dos renglones y el documento se iba a una
segunda hoja aunque aqui se viera en una.

Con Arial el problema desaparece por dos razones: esta en cualquier
Windows y Mac con Office, y en este entorno se sustituye por Liberation
Sans, que tiene las mismas metricas. Lo que se mide al construir el
archivo es entonces lo mismo que dibuja Word.

Cada condicion comercial cabe ahora en un renglon, los renglones de
servicio ganan altura para escribir y la hoja cierra con 17 mm libres.

Co-Authored-By: Claude Opus 5 <noreply@anthropic.com>
Claude-Session: https://claude.ai/code/session_017DE5RtjtLFhQ3FcsP1iHRy
</commit_message>
<xml_diff>
--- a/plantillas/cotizador/salida/FORMATO_COTIZACION_FLETES_TAURO.docx
+++ b/plantillas/cotizador/salida/FORMATO_COTIZACION_FLETES_TAURO.docx
@@ -145,7 +145,7 @@
             </w:pPr>
             <w:r>
               <w:rPr>
-                <w:rFonts w:ascii="Segoe UI Semibold" w:hAnsi="Segoe UI Semibold" w:cs="Segoe UI Semibold"/>
+                <w:rFonts w:ascii="Arial" w:hAnsi="Arial" w:cs="Arial"/>
                 <w:b/>
                 <w:bCs/>
                 <w:color w:val="111111"/>
@@ -163,7 +163,7 @@
             </w:pPr>
             <w:r>
               <w:rPr>
-                <w:rFonts w:ascii="Segoe UI" w:hAnsi="Segoe UI" w:cs="Segoe UI"/>
+                <w:rFonts w:ascii="Arial" w:hAnsi="Arial" w:cs="Arial"/>
                 <w:caps/>
                 <w:color w:val="6E6E6E"/>
                 <w:spacing w:val="70"/>
@@ -264,7 +264,7 @@
             </w:pPr>
             <w:r>
               <w:rPr>
-                <w:rFonts w:ascii="Segoe UI Semibold" w:hAnsi="Segoe UI Semibold" w:cs="Segoe UI Semibold"/>
+                <w:rFonts w:ascii="Arial" w:hAnsi="Arial" w:cs="Arial"/>
                 <w:b/>
                 <w:bCs/>
                 <w:caps/>
@@ -321,7 +321,7 @@
             </w:pPr>
             <w:r>
               <w:rPr>
-                <w:rFonts w:ascii="Segoe UI Semibold" w:hAnsi="Segoe UI Semibold" w:cs="Segoe UI Semibold"/>
+                <w:rFonts w:ascii="Arial" w:hAnsi="Arial" w:cs="Arial"/>
                 <w:b/>
                 <w:bCs/>
                 <w:caps/>
@@ -357,7 +357,7 @@
             </w:pPr>
             <w:r>
               <w:rPr>
-                <w:rFonts w:ascii="Segoe UI Semibold" w:hAnsi="Segoe UI Semibold" w:cs="Segoe UI Semibold"/>
+                <w:rFonts w:ascii="Arial" w:hAnsi="Arial" w:cs="Arial"/>
                 <w:b/>
                 <w:bCs/>
                 <w:caps/>
@@ -391,7 +391,7 @@
             <w:sdt>
               <w:sdtPr>
                 <w:rPr>
-                  <w:rFonts w:ascii="Segoe UI" w:hAnsi="Segoe UI" w:cs="Segoe UI"/>
+                  <w:rFonts w:ascii="Arial" w:hAnsi="Arial" w:cs="Arial"/>
                   <w:color w:val="111111"/>
                   <w:sz w:val="19"/>
                   <w:szCs w:val="19"/>
@@ -408,7 +408,7 @@
               <w:sdtContent>
                 <w:r>
                   <w:rPr>
-                    <w:rFonts w:ascii="Segoe UI" w:hAnsi="Segoe UI" w:cs="Segoe UI"/>
+                    <w:rFonts w:ascii="Arial" w:hAnsi="Arial" w:cs="Arial"/>
                     <w:i/>
                     <w:iCs/>
                     <w:color w:val="AFAFAF"/>
@@ -463,7 +463,7 @@
             </w:pPr>
             <w:r>
               <w:rPr>
-                <w:rFonts w:ascii="Segoe UI Semibold" w:hAnsi="Segoe UI Semibold" w:cs="Segoe UI Semibold"/>
+                <w:rFonts w:ascii="Arial" w:hAnsi="Arial" w:cs="Arial"/>
                 <w:b/>
                 <w:bCs/>
                 <w:caps/>
@@ -497,7 +497,7 @@
             <w:sdt>
               <w:sdtPr>
                 <w:rPr>
-                  <w:rFonts w:ascii="Segoe UI" w:hAnsi="Segoe UI" w:cs="Segoe UI"/>
+                  <w:rFonts w:ascii="Arial" w:hAnsi="Arial" w:cs="Arial"/>
                   <w:color w:val="111111"/>
                   <w:sz w:val="19"/>
                   <w:szCs w:val="19"/>
@@ -514,7 +514,7 @@
               <w:sdtContent>
                 <w:r>
                   <w:rPr>
-                    <w:rFonts w:ascii="Segoe UI" w:hAnsi="Segoe UI" w:cs="Segoe UI"/>
+                    <w:rFonts w:ascii="Arial" w:hAnsi="Arial" w:cs="Arial"/>
                     <w:i/>
                     <w:iCs/>
                     <w:color w:val="AFAFAF"/>
@@ -550,7 +550,7 @@
             </w:pPr>
             <w:r>
               <w:rPr>
-                <w:rFonts w:ascii="Segoe UI Semibold" w:hAnsi="Segoe UI Semibold" w:cs="Segoe UI Semibold"/>
+                <w:rFonts w:ascii="Arial" w:hAnsi="Arial" w:cs="Arial"/>
                 <w:b/>
                 <w:bCs/>
                 <w:caps/>
@@ -584,7 +584,7 @@
             <w:sdt>
               <w:sdtPr>
                 <w:rPr>
-                  <w:rFonts w:ascii="Segoe UI" w:hAnsi="Segoe UI" w:cs="Segoe UI"/>
+                  <w:rFonts w:ascii="Arial" w:hAnsi="Arial" w:cs="Arial"/>
                   <w:color w:val="111111"/>
                   <w:sz w:val="19"/>
                   <w:szCs w:val="19"/>
@@ -601,7 +601,7 @@
               <w:sdtContent>
                 <w:r>
                   <w:rPr>
-                    <w:rFonts w:ascii="Segoe UI" w:hAnsi="Segoe UI" w:cs="Segoe UI"/>
+                    <w:rFonts w:ascii="Arial" w:hAnsi="Arial" w:cs="Arial"/>
                     <w:i/>
                     <w:iCs/>
                     <w:color w:val="AFAFAF"/>
@@ -656,7 +656,7 @@
             </w:pPr>
             <w:r>
               <w:rPr>
-                <w:rFonts w:ascii="Segoe UI Semibold" w:hAnsi="Segoe UI Semibold" w:cs="Segoe UI Semibold"/>
+                <w:rFonts w:ascii="Arial" w:hAnsi="Arial" w:cs="Arial"/>
                 <w:b/>
                 <w:bCs/>
                 <w:caps/>
@@ -690,7 +690,7 @@
             <w:sdt>
               <w:sdtPr>
                 <w:rPr>
-                  <w:rFonts w:ascii="Segoe UI" w:hAnsi="Segoe UI" w:cs="Segoe UI"/>
+                  <w:rFonts w:ascii="Arial" w:hAnsi="Arial" w:cs="Arial"/>
                   <w:color w:val="111111"/>
                   <w:sz w:val="19"/>
                   <w:szCs w:val="19"/>
@@ -707,7 +707,7 @@
               <w:sdtContent>
                 <w:r>
                   <w:rPr>
-                    <w:rFonts w:ascii="Segoe UI" w:hAnsi="Segoe UI" w:cs="Segoe UI"/>
+                    <w:rFonts w:ascii="Arial" w:hAnsi="Arial" w:cs="Arial"/>
                     <w:i/>
                     <w:iCs/>
                     <w:color w:val="AFAFAF"/>
@@ -743,7 +743,7 @@
             </w:pPr>
             <w:r>
               <w:rPr>
-                <w:rFonts w:ascii="Segoe UI Semibold" w:hAnsi="Segoe UI Semibold" w:cs="Segoe UI Semibold"/>
+                <w:rFonts w:ascii="Arial" w:hAnsi="Arial" w:cs="Arial"/>
                 <w:b/>
                 <w:bCs/>
                 <w:caps/>
@@ -777,7 +777,7 @@
             <w:sdt>
               <w:sdtPr>
                 <w:rPr>
-                  <w:rFonts w:ascii="Segoe UI" w:hAnsi="Segoe UI" w:cs="Segoe UI"/>
+                  <w:rFonts w:ascii="Arial" w:hAnsi="Arial" w:cs="Arial"/>
                   <w:color w:val="111111"/>
                   <w:sz w:val="19"/>
                   <w:szCs w:val="19"/>
@@ -794,7 +794,7 @@
               <w:sdtContent>
                 <w:r>
                   <w:rPr>
-                    <w:rFonts w:ascii="Segoe UI" w:hAnsi="Segoe UI" w:cs="Segoe UI"/>
+                    <w:rFonts w:ascii="Arial" w:hAnsi="Arial" w:cs="Arial"/>
                     <w:i/>
                     <w:iCs/>
                     <w:color w:val="AFAFAF"/>
@@ -849,7 +849,7 @@
             </w:pPr>
             <w:r>
               <w:rPr>
-                <w:rFonts w:ascii="Segoe UI Semibold" w:hAnsi="Segoe UI Semibold" w:cs="Segoe UI Semibold"/>
+                <w:rFonts w:ascii="Arial" w:hAnsi="Arial" w:cs="Arial"/>
                 <w:b/>
                 <w:bCs/>
                 <w:caps/>
@@ -883,7 +883,7 @@
             <w:sdt>
               <w:sdtPr>
                 <w:rPr>
-                  <w:rFonts w:ascii="Segoe UI" w:hAnsi="Segoe UI" w:cs="Segoe UI"/>
+                  <w:rFonts w:ascii="Arial" w:hAnsi="Arial" w:cs="Arial"/>
                   <w:color w:val="111111"/>
                   <w:sz w:val="19"/>
                   <w:szCs w:val="19"/>
@@ -900,7 +900,7 @@
               <w:sdtContent>
                 <w:r>
                   <w:rPr>
-                    <w:rFonts w:ascii="Segoe UI" w:hAnsi="Segoe UI" w:cs="Segoe UI"/>
+                    <w:rFonts w:ascii="Arial" w:hAnsi="Arial" w:cs="Arial"/>
                     <w:i/>
                     <w:iCs/>
                     <w:color w:val="AFAFAF"/>
@@ -936,7 +936,7 @@
             </w:pPr>
             <w:r>
               <w:rPr>
-                <w:rFonts w:ascii="Segoe UI Semibold" w:hAnsi="Segoe UI Semibold" w:cs="Segoe UI Semibold"/>
+                <w:rFonts w:ascii="Arial" w:hAnsi="Arial" w:cs="Arial"/>
                 <w:b/>
                 <w:bCs/>
                 <w:caps/>
@@ -970,7 +970,7 @@
             <w:sdt>
               <w:sdtPr>
                 <w:rPr>
-                  <w:rFonts w:ascii="Segoe UI" w:hAnsi="Segoe UI" w:cs="Segoe UI"/>
+                  <w:rFonts w:ascii="Arial" w:hAnsi="Arial" w:cs="Arial"/>
                   <w:color w:val="111111"/>
                   <w:sz w:val="19"/>
                   <w:szCs w:val="19"/>
@@ -987,7 +987,7 @@
               <w:sdtContent>
                 <w:r>
                   <w:rPr>
-                    <w:rFonts w:ascii="Segoe UI" w:hAnsi="Segoe UI" w:cs="Segoe UI"/>
+                    <w:rFonts w:ascii="Arial" w:hAnsi="Arial" w:cs="Arial"/>
                     <w:i/>
                     <w:iCs/>
                     <w:color w:val="AFAFAF"/>
@@ -1042,7 +1042,7 @@
             </w:pPr>
             <w:r>
               <w:rPr>
-                <w:rFonts w:ascii="Segoe UI Semibold" w:hAnsi="Segoe UI Semibold" w:cs="Segoe UI Semibold"/>
+                <w:rFonts w:ascii="Arial" w:hAnsi="Arial" w:cs="Arial"/>
                 <w:b/>
                 <w:bCs/>
                 <w:caps/>
@@ -1076,7 +1076,7 @@
             <w:sdt>
               <w:sdtPr>
                 <w:rPr>
-                  <w:rFonts w:ascii="Segoe UI" w:hAnsi="Segoe UI" w:cs="Segoe UI"/>
+                  <w:rFonts w:ascii="Arial" w:hAnsi="Arial" w:cs="Arial"/>
                   <w:color w:val="111111"/>
                   <w:sz w:val="19"/>
                   <w:szCs w:val="19"/>
@@ -1093,7 +1093,7 @@
               <w:sdtContent>
                 <w:r>
                   <w:rPr>
-                    <w:rFonts w:ascii="Segoe UI" w:hAnsi="Segoe UI" w:cs="Segoe UI"/>
+                    <w:rFonts w:ascii="Arial" w:hAnsi="Arial" w:cs="Arial"/>
                     <w:i/>
                     <w:iCs/>
                     <w:color w:val="AFAFAF"/>
@@ -1129,7 +1129,7 @@
             </w:pPr>
             <w:r>
               <w:rPr>
-                <w:rFonts w:ascii="Segoe UI Semibold" w:hAnsi="Segoe UI Semibold" w:cs="Segoe UI Semibold"/>
+                <w:rFonts w:ascii="Arial" w:hAnsi="Arial" w:cs="Arial"/>
                 <w:b/>
                 <w:bCs/>
                 <w:caps/>
@@ -1163,7 +1163,7 @@
             <w:sdt>
               <w:sdtPr>
                 <w:rPr>
-                  <w:rFonts w:ascii="Segoe UI" w:hAnsi="Segoe UI" w:cs="Segoe UI"/>
+                  <w:rFonts w:ascii="Arial" w:hAnsi="Arial" w:cs="Arial"/>
                   <w:color w:val="111111"/>
                   <w:sz w:val="19"/>
                   <w:szCs w:val="19"/>
@@ -1180,7 +1180,7 @@
               <w:sdtContent>
                 <w:r>
                   <w:rPr>
-                    <w:rFonts w:ascii="Segoe UI" w:hAnsi="Segoe UI" w:cs="Segoe UI"/>
+                    <w:rFonts w:ascii="Arial" w:hAnsi="Arial" w:cs="Arial"/>
                     <w:i/>
                     <w:iCs/>
                     <w:color w:val="AFAFAF"/>
@@ -1329,7 +1329,7 @@
             </w:pPr>
             <w:r>
               <w:rPr>
-                <w:rFonts w:ascii="Segoe UI Semibold" w:hAnsi="Segoe UI Semibold" w:cs="Segoe UI Semibold"/>
+                <w:rFonts w:ascii="Arial" w:hAnsi="Arial" w:cs="Arial"/>
                 <w:b/>
                 <w:bCs/>
                 <w:color w:val="FFFFFF"/>
@@ -1363,7 +1363,7 @@
             </w:pPr>
             <w:r>
               <w:rPr>
-                <w:rFonts w:ascii="Segoe UI Semibold" w:hAnsi="Segoe UI Semibold" w:cs="Segoe UI Semibold"/>
+                <w:rFonts w:ascii="Arial" w:hAnsi="Arial" w:cs="Arial"/>
                 <w:b/>
                 <w:bCs/>
                 <w:caps/>
@@ -1398,7 +1398,7 @@
             </w:pPr>
             <w:r>
               <w:rPr>
-                <w:rFonts w:ascii="Segoe UI Semibold" w:hAnsi="Segoe UI Semibold" w:cs="Segoe UI Semibold"/>
+                <w:rFonts w:ascii="Arial" w:hAnsi="Arial" w:cs="Arial"/>
                 <w:b/>
                 <w:bCs/>
                 <w:caps/>
@@ -1427,9 +1427,9 @@
             </w:tcBorders>
             <w:shd w:val="clear" w:color="auto" w:fill="FFFFFF"/>
             <w:tcMar>
-              <w:top w:w="190" w:type="dxa"/>
+              <w:top w:w="245" w:type="dxa"/>
               <w:left w:w="100" w:type="dxa"/>
-              <w:bottom w:w="190" w:type="dxa"/>
+              <w:bottom w:w="245" w:type="dxa"/>
               <w:right w:w="100" w:type="dxa"/>
             </w:tcMar>
             <w:vAlign w:val="center"/>
@@ -1441,7 +1441,7 @@
             </w:pPr>
             <w:r>
               <w:rPr>
-                <w:rFonts w:ascii="Segoe UI Semibold" w:hAnsi="Segoe UI Semibold" w:cs="Segoe UI Semibold"/>
+                <w:rFonts w:ascii="Arial" w:hAnsi="Arial" w:cs="Arial"/>
                 <w:b/>
                 <w:bCs/>
                 <w:color w:val="6E6E6E"/>
@@ -1462,9 +1462,9 @@
             </w:tcBorders>
             <w:shd w:val="clear" w:color="auto" w:fill="FFFFFF"/>
             <w:tcMar>
-              <w:top w:w="190" w:type="dxa"/>
+              <w:top w:w="245" w:type="dxa"/>
               <w:left w:w="200" w:type="dxa"/>
-              <w:bottom w:w="190" w:type="dxa"/>
+              <w:bottom w:w="245" w:type="dxa"/>
               <w:right w:w="200" w:type="dxa"/>
             </w:tcMar>
             <w:vAlign w:val="center"/>
@@ -1476,7 +1476,7 @@
             <w:sdt>
               <w:sdtPr>
                 <w:rPr>
-                  <w:rFonts w:ascii="Segoe UI" w:hAnsi="Segoe UI" w:cs="Segoe UI"/>
+                  <w:rFonts w:ascii="Arial" w:hAnsi="Arial" w:cs="Arial"/>
                   <w:color w:val="111111"/>
                   <w:sz w:val="19"/>
                   <w:szCs w:val="19"/>
@@ -1493,7 +1493,7 @@
               <w:sdtContent>
                 <w:r>
                   <w:rPr>
-                    <w:rFonts w:ascii="Segoe UI" w:hAnsi="Segoe UI" w:cs="Segoe UI"/>
+                    <w:rFonts w:ascii="Arial" w:hAnsi="Arial" w:cs="Arial"/>
                     <w:i/>
                     <w:iCs/>
                     <w:color w:val="AFAFAF"/>
@@ -1516,9 +1516,9 @@
             </w:tcBorders>
             <w:shd w:val="clear" w:color="auto" w:fill="FFFFFF"/>
             <w:tcMar>
-              <w:top w:w="190" w:type="dxa"/>
+              <w:top w:w="245" w:type="dxa"/>
               <w:left w:w="200" w:type="dxa"/>
-              <w:bottom w:w="190" w:type="dxa"/>
+              <w:bottom w:w="245" w:type="dxa"/>
               <w:right w:w="200" w:type="dxa"/>
             </w:tcMar>
             <w:vAlign w:val="center"/>
@@ -1531,7 +1531,7 @@
             <w:sdt>
               <w:sdtPr>
                 <w:rPr>
-                  <w:rFonts w:ascii="Segoe UI Semibold" w:hAnsi="Segoe UI Semibold" w:cs="Segoe UI Semibold"/>
+                  <w:rFonts w:ascii="Arial" w:hAnsi="Arial" w:cs="Arial"/>
                   <w:b/>
                   <w:bCs/>
                   <w:color w:val="111111"/>
@@ -1550,7 +1550,7 @@
               <w:sdtContent>
                 <w:r>
                   <w:rPr>
-                    <w:rFonts w:ascii="Segoe UI" w:hAnsi="Segoe UI" w:cs="Segoe UI"/>
+                    <w:rFonts w:ascii="Arial" w:hAnsi="Arial" w:cs="Arial"/>
                     <w:i/>
                     <w:iCs/>
                     <w:color w:val="AFAFAF"/>
@@ -1579,9 +1579,9 @@
             </w:tcBorders>
             <w:shd w:val="clear" w:color="auto" w:fill="FAFAFA"/>
             <w:tcMar>
-              <w:top w:w="190" w:type="dxa"/>
+              <w:top w:w="245" w:type="dxa"/>
               <w:left w:w="100" w:type="dxa"/>
-              <w:bottom w:w="190" w:type="dxa"/>
+              <w:bottom w:w="245" w:type="dxa"/>
               <w:right w:w="100" w:type="dxa"/>
             </w:tcMar>
             <w:vAlign w:val="center"/>
@@ -1593,7 +1593,7 @@
             </w:pPr>
             <w:r>
               <w:rPr>
-                <w:rFonts w:ascii="Segoe UI Semibold" w:hAnsi="Segoe UI Semibold" w:cs="Segoe UI Semibold"/>
+                <w:rFonts w:ascii="Arial" w:hAnsi="Arial" w:cs="Arial"/>
                 <w:b/>
                 <w:bCs/>
                 <w:color w:val="6E6E6E"/>
@@ -1614,9 +1614,9 @@
             </w:tcBorders>
             <w:shd w:val="clear" w:color="auto" w:fill="FAFAFA"/>
             <w:tcMar>
-              <w:top w:w="190" w:type="dxa"/>
+              <w:top w:w="245" w:type="dxa"/>
               <w:left w:w="200" w:type="dxa"/>
-              <w:bottom w:w="190" w:type="dxa"/>
+              <w:bottom w:w="245" w:type="dxa"/>
               <w:right w:w="200" w:type="dxa"/>
             </w:tcMar>
             <w:vAlign w:val="center"/>
@@ -1628,7 +1628,7 @@
             <w:sdt>
               <w:sdtPr>
                 <w:rPr>
-                  <w:rFonts w:ascii="Segoe UI" w:hAnsi="Segoe UI" w:cs="Segoe UI"/>
+                  <w:rFonts w:ascii="Arial" w:hAnsi="Arial" w:cs="Arial"/>
                   <w:color w:val="111111"/>
                   <w:sz w:val="19"/>
                   <w:szCs w:val="19"/>
@@ -1645,7 +1645,7 @@
               <w:sdtContent>
                 <w:r>
                   <w:rPr>
-                    <w:rFonts w:ascii="Segoe UI" w:hAnsi="Segoe UI" w:cs="Segoe UI"/>
+                    <w:rFonts w:ascii="Arial" w:hAnsi="Arial" w:cs="Arial"/>
                     <w:i/>
                     <w:iCs/>
                     <w:color w:val="AFAFAF"/>
@@ -1668,9 +1668,9 @@
             </w:tcBorders>
             <w:shd w:val="clear" w:color="auto" w:fill="FAFAFA"/>
             <w:tcMar>
-              <w:top w:w="190" w:type="dxa"/>
+              <w:top w:w="245" w:type="dxa"/>
               <w:left w:w="200" w:type="dxa"/>
-              <w:bottom w:w="190" w:type="dxa"/>
+              <w:bottom w:w="245" w:type="dxa"/>
               <w:right w:w="200" w:type="dxa"/>
             </w:tcMar>
             <w:vAlign w:val="center"/>
@@ -1683,7 +1683,7 @@
             <w:sdt>
               <w:sdtPr>
                 <w:rPr>
-                  <w:rFonts w:ascii="Segoe UI Semibold" w:hAnsi="Segoe UI Semibold" w:cs="Segoe UI Semibold"/>
+                  <w:rFonts w:ascii="Arial" w:hAnsi="Arial" w:cs="Arial"/>
                   <w:b/>
                   <w:bCs/>
                   <w:color w:val="111111"/>
@@ -1702,7 +1702,7 @@
               <w:sdtContent>
                 <w:r>
                   <w:rPr>
-                    <w:rFonts w:ascii="Segoe UI" w:hAnsi="Segoe UI" w:cs="Segoe UI"/>
+                    <w:rFonts w:ascii="Arial" w:hAnsi="Arial" w:cs="Arial"/>
                     <w:i/>
                     <w:iCs/>
                     <w:color w:val="AFAFAF"/>
@@ -1731,9 +1731,9 @@
             </w:tcBorders>
             <w:shd w:val="clear" w:color="auto" w:fill="FFFFFF"/>
             <w:tcMar>
-              <w:top w:w="190" w:type="dxa"/>
+              <w:top w:w="245" w:type="dxa"/>
               <w:left w:w="100" w:type="dxa"/>
-              <w:bottom w:w="190" w:type="dxa"/>
+              <w:bottom w:w="245" w:type="dxa"/>
               <w:right w:w="100" w:type="dxa"/>
             </w:tcMar>
             <w:vAlign w:val="center"/>
@@ -1745,7 +1745,7 @@
             </w:pPr>
             <w:r>
               <w:rPr>
-                <w:rFonts w:ascii="Segoe UI Semibold" w:hAnsi="Segoe UI Semibold" w:cs="Segoe UI Semibold"/>
+                <w:rFonts w:ascii="Arial" w:hAnsi="Arial" w:cs="Arial"/>
                 <w:b/>
                 <w:bCs/>
                 <w:color w:val="6E6E6E"/>
@@ -1766,9 +1766,9 @@
             </w:tcBorders>
             <w:shd w:val="clear" w:color="auto" w:fill="FFFFFF"/>
             <w:tcMar>
-              <w:top w:w="190" w:type="dxa"/>
+              <w:top w:w="245" w:type="dxa"/>
               <w:left w:w="200" w:type="dxa"/>
-              <w:bottom w:w="190" w:type="dxa"/>
+              <w:bottom w:w="245" w:type="dxa"/>
               <w:right w:w="200" w:type="dxa"/>
             </w:tcMar>
             <w:vAlign w:val="center"/>
@@ -1780,7 +1780,7 @@
             <w:sdt>
               <w:sdtPr>
                 <w:rPr>
-                  <w:rFonts w:ascii="Segoe UI" w:hAnsi="Segoe UI" w:cs="Segoe UI"/>
+                  <w:rFonts w:ascii="Arial" w:hAnsi="Arial" w:cs="Arial"/>
                   <w:color w:val="111111"/>
                   <w:sz w:val="19"/>
                   <w:szCs w:val="19"/>
@@ -1797,7 +1797,7 @@
               <w:sdtContent>
                 <w:r>
                   <w:rPr>
-                    <w:rFonts w:ascii="Segoe UI" w:hAnsi="Segoe UI" w:cs="Segoe UI"/>
+                    <w:rFonts w:ascii="Arial" w:hAnsi="Arial" w:cs="Arial"/>
                     <w:i/>
                     <w:iCs/>
                     <w:color w:val="AFAFAF"/>
@@ -1820,9 +1820,9 @@
             </w:tcBorders>
             <w:shd w:val="clear" w:color="auto" w:fill="FFFFFF"/>
             <w:tcMar>
-              <w:top w:w="190" w:type="dxa"/>
+              <w:top w:w="245" w:type="dxa"/>
               <w:left w:w="200" w:type="dxa"/>
-              <w:bottom w:w="190" w:type="dxa"/>
+              <w:bottom w:w="245" w:type="dxa"/>
               <w:right w:w="200" w:type="dxa"/>
             </w:tcMar>
             <w:vAlign w:val="center"/>
@@ -1835,7 +1835,7 @@
             <w:sdt>
               <w:sdtPr>
                 <w:rPr>
-                  <w:rFonts w:ascii="Segoe UI Semibold" w:hAnsi="Segoe UI Semibold" w:cs="Segoe UI Semibold"/>
+                  <w:rFonts w:ascii="Arial" w:hAnsi="Arial" w:cs="Arial"/>
                   <w:b/>
                   <w:bCs/>
                   <w:color w:val="111111"/>
@@ -1854,7 +1854,7 @@
               <w:sdtContent>
                 <w:r>
                   <w:rPr>
-                    <w:rFonts w:ascii="Segoe UI" w:hAnsi="Segoe UI" w:cs="Segoe UI"/>
+                    <w:rFonts w:ascii="Arial" w:hAnsi="Arial" w:cs="Arial"/>
                     <w:i/>
                     <w:iCs/>
                     <w:color w:val="AFAFAF"/>
@@ -1883,9 +1883,9 @@
             </w:tcBorders>
             <w:shd w:val="clear" w:color="auto" w:fill="FAFAFA"/>
             <w:tcMar>
-              <w:top w:w="190" w:type="dxa"/>
+              <w:top w:w="245" w:type="dxa"/>
               <w:left w:w="100" w:type="dxa"/>
-              <w:bottom w:w="190" w:type="dxa"/>
+              <w:bottom w:w="245" w:type="dxa"/>
               <w:right w:w="100" w:type="dxa"/>
             </w:tcMar>
             <w:vAlign w:val="center"/>
@@ -1897,7 +1897,7 @@
             </w:pPr>
             <w:r>
               <w:rPr>
-                <w:rFonts w:ascii="Segoe UI Semibold" w:hAnsi="Segoe UI Semibold" w:cs="Segoe UI Semibold"/>
+                <w:rFonts w:ascii="Arial" w:hAnsi="Arial" w:cs="Arial"/>
                 <w:b/>
                 <w:bCs/>
                 <w:color w:val="6E6E6E"/>
@@ -1918,9 +1918,9 @@
             </w:tcBorders>
             <w:shd w:val="clear" w:color="auto" w:fill="FAFAFA"/>
             <w:tcMar>
-              <w:top w:w="190" w:type="dxa"/>
+              <w:top w:w="245" w:type="dxa"/>
               <w:left w:w="200" w:type="dxa"/>
-              <w:bottom w:w="190" w:type="dxa"/>
+              <w:bottom w:w="245" w:type="dxa"/>
               <w:right w:w="200" w:type="dxa"/>
             </w:tcMar>
             <w:vAlign w:val="center"/>
@@ -1932,7 +1932,7 @@
             <w:sdt>
               <w:sdtPr>
                 <w:rPr>
-                  <w:rFonts w:ascii="Segoe UI" w:hAnsi="Segoe UI" w:cs="Segoe UI"/>
+                  <w:rFonts w:ascii="Arial" w:hAnsi="Arial" w:cs="Arial"/>
                   <w:color w:val="111111"/>
                   <w:sz w:val="19"/>
                   <w:szCs w:val="19"/>
@@ -1949,7 +1949,7 @@
               <w:sdtContent>
                 <w:r>
                   <w:rPr>
-                    <w:rFonts w:ascii="Segoe UI" w:hAnsi="Segoe UI" w:cs="Segoe UI"/>
+                    <w:rFonts w:ascii="Arial" w:hAnsi="Arial" w:cs="Arial"/>
                     <w:i/>
                     <w:iCs/>
                     <w:color w:val="AFAFAF"/>
@@ -1972,9 +1972,9 @@
             </w:tcBorders>
             <w:shd w:val="clear" w:color="auto" w:fill="FAFAFA"/>
             <w:tcMar>
-              <w:top w:w="190" w:type="dxa"/>
+              <w:top w:w="245" w:type="dxa"/>
               <w:left w:w="200" w:type="dxa"/>
-              <w:bottom w:w="190" w:type="dxa"/>
+              <w:bottom w:w="245" w:type="dxa"/>
               <w:right w:w="200" w:type="dxa"/>
             </w:tcMar>
             <w:vAlign w:val="center"/>
@@ -1987,7 +1987,7 @@
             <w:sdt>
               <w:sdtPr>
                 <w:rPr>
-                  <w:rFonts w:ascii="Segoe UI Semibold" w:hAnsi="Segoe UI Semibold" w:cs="Segoe UI Semibold"/>
+                  <w:rFonts w:ascii="Arial" w:hAnsi="Arial" w:cs="Arial"/>
                   <w:b/>
                   <w:bCs/>
                   <w:color w:val="111111"/>
@@ -2006,7 +2006,7 @@
               <w:sdtContent>
                 <w:r>
                   <w:rPr>
-                    <w:rFonts w:ascii="Segoe UI" w:hAnsi="Segoe UI" w:cs="Segoe UI"/>
+                    <w:rFonts w:ascii="Arial" w:hAnsi="Arial" w:cs="Arial"/>
                     <w:i/>
                     <w:iCs/>
                     <w:color w:val="AFAFAF"/>
@@ -2035,9 +2035,9 @@
             </w:tcBorders>
             <w:shd w:val="clear" w:color="auto" w:fill="FFFFFF"/>
             <w:tcMar>
-              <w:top w:w="190" w:type="dxa"/>
+              <w:top w:w="245" w:type="dxa"/>
               <w:left w:w="100" w:type="dxa"/>
-              <w:bottom w:w="190" w:type="dxa"/>
+              <w:bottom w:w="245" w:type="dxa"/>
               <w:right w:w="100" w:type="dxa"/>
             </w:tcMar>
             <w:vAlign w:val="center"/>
@@ -2049,7 +2049,7 @@
             </w:pPr>
             <w:r>
               <w:rPr>
-                <w:rFonts w:ascii="Segoe UI Semibold" w:hAnsi="Segoe UI Semibold" w:cs="Segoe UI Semibold"/>
+                <w:rFonts w:ascii="Arial" w:hAnsi="Arial" w:cs="Arial"/>
                 <w:b/>
                 <w:bCs/>
                 <w:color w:val="6E6E6E"/>
@@ -2070,9 +2070,9 @@
             </w:tcBorders>
             <w:shd w:val="clear" w:color="auto" w:fill="FFFFFF"/>
             <w:tcMar>
-              <w:top w:w="190" w:type="dxa"/>
+              <w:top w:w="245" w:type="dxa"/>
               <w:left w:w="200" w:type="dxa"/>
-              <w:bottom w:w="190" w:type="dxa"/>
+              <w:bottom w:w="245" w:type="dxa"/>
               <w:right w:w="200" w:type="dxa"/>
             </w:tcMar>
             <w:vAlign w:val="center"/>
@@ -2084,7 +2084,7 @@
             <w:sdt>
               <w:sdtPr>
                 <w:rPr>
-                  <w:rFonts w:ascii="Segoe UI" w:hAnsi="Segoe UI" w:cs="Segoe UI"/>
+                  <w:rFonts w:ascii="Arial" w:hAnsi="Arial" w:cs="Arial"/>
                   <w:color w:val="111111"/>
                   <w:sz w:val="19"/>
                   <w:szCs w:val="19"/>
@@ -2101,7 +2101,7 @@
               <w:sdtContent>
                 <w:r>
                   <w:rPr>
-                    <w:rFonts w:ascii="Segoe UI" w:hAnsi="Segoe UI" w:cs="Segoe UI"/>
+                    <w:rFonts w:ascii="Arial" w:hAnsi="Arial" w:cs="Arial"/>
                     <w:i/>
                     <w:iCs/>
                     <w:color w:val="AFAFAF"/>
@@ -2124,9 +2124,9 @@
             </w:tcBorders>
             <w:shd w:val="clear" w:color="auto" w:fill="FFFFFF"/>
             <w:tcMar>
-              <w:top w:w="190" w:type="dxa"/>
+              <w:top w:w="245" w:type="dxa"/>
               <w:left w:w="200" w:type="dxa"/>
-              <w:bottom w:w="190" w:type="dxa"/>
+              <w:bottom w:w="245" w:type="dxa"/>
               <w:right w:w="200" w:type="dxa"/>
             </w:tcMar>
             <w:vAlign w:val="center"/>
@@ -2139,7 +2139,7 @@
             <w:sdt>
               <w:sdtPr>
                 <w:rPr>
-                  <w:rFonts w:ascii="Segoe UI Semibold" w:hAnsi="Segoe UI Semibold" w:cs="Segoe UI Semibold"/>
+                  <w:rFonts w:ascii="Arial" w:hAnsi="Arial" w:cs="Arial"/>
                   <w:b/>
                   <w:bCs/>
                   <w:color w:val="111111"/>
@@ -2158,7 +2158,7 @@
               <w:sdtContent>
                 <w:r>
                   <w:rPr>
-                    <w:rFonts w:ascii="Segoe UI" w:hAnsi="Segoe UI" w:cs="Segoe UI"/>
+                    <w:rFonts w:ascii="Arial" w:hAnsi="Arial" w:cs="Arial"/>
                     <w:i/>
                     <w:iCs/>
                     <w:color w:val="AFAFAF"/>
@@ -2223,7 +2223,7 @@
             </w:pPr>
             <w:r>
               <w:rPr>
-                <w:rFonts w:ascii="Segoe UI Semibold" w:hAnsi="Segoe UI Semibold" w:cs="Segoe UI Semibold"/>
+                <w:rFonts w:ascii="Arial" w:hAnsi="Arial" w:cs="Arial"/>
                 <w:b/>
                 <w:bCs/>
                 <w:caps/>
@@ -2245,7 +2245,7 @@
             <w:sdt>
               <w:sdtPr>
                 <w:rPr>
-                  <w:rFonts w:ascii="Segoe UI" w:hAnsi="Segoe UI" w:cs="Segoe UI"/>
+                  <w:rFonts w:ascii="Arial" w:hAnsi="Arial" w:cs="Arial"/>
                   <w:color w:val="111111"/>
                   <w:sz w:val="19"/>
                   <w:szCs w:val="19"/>
@@ -2262,7 +2262,7 @@
               <w:sdtContent>
                 <w:r>
                   <w:rPr>
-                    <w:rFonts w:ascii="Segoe UI" w:hAnsi="Segoe UI" w:cs="Segoe UI"/>
+                    <w:rFonts w:ascii="Arial" w:hAnsi="Arial" w:cs="Arial"/>
                     <w:i/>
                     <w:iCs/>
                     <w:color w:val="AFAFAF"/>
@@ -2280,7 +2280,7 @@
             </w:pPr>
             <w:r>
               <w:rPr>
-                <w:rFonts w:ascii="Segoe UI Semibold" w:hAnsi="Segoe UI Semibold" w:cs="Segoe UI Semibold"/>
+                <w:rFonts w:ascii="Arial" w:hAnsi="Arial" w:cs="Arial"/>
                 <w:b/>
                 <w:bCs/>
                 <w:caps/>
@@ -2302,7 +2302,7 @@
             <w:sdt>
               <w:sdtPr>
                 <w:rPr>
-                  <w:rFonts w:ascii="Segoe UI" w:hAnsi="Segoe UI" w:cs="Segoe UI"/>
+                  <w:rFonts w:ascii="Arial" w:hAnsi="Arial" w:cs="Arial"/>
                   <w:color w:val="111111"/>
                   <w:sz w:val="19"/>
                   <w:szCs w:val="19"/>
@@ -2319,7 +2319,7 @@
               <w:sdtContent>
                 <w:r>
                   <w:rPr>
-                    <w:rFonts w:ascii="Segoe UI" w:hAnsi="Segoe UI" w:cs="Segoe UI"/>
+                    <w:rFonts w:ascii="Arial" w:hAnsi="Arial" w:cs="Arial"/>
                     <w:i/>
                     <w:iCs/>
                     <w:color w:val="AFAFAF"/>
@@ -2341,7 +2341,7 @@
             <w:sdt>
               <w:sdtPr>
                 <w:rPr>
-                  <w:rFonts w:ascii="Segoe UI" w:hAnsi="Segoe UI" w:cs="Segoe UI"/>
+                  <w:rFonts w:ascii="Arial" w:hAnsi="Arial" w:cs="Arial"/>
                   <w:color w:val="111111"/>
                   <w:sz w:val="19"/>
                   <w:szCs w:val="19"/>
@@ -2358,7 +2358,7 @@
               <w:sdtContent>
                 <w:r>
                   <w:rPr>
-                    <w:rFonts w:ascii="Segoe UI" w:hAnsi="Segoe UI" w:cs="Segoe UI"/>
+                    <w:rFonts w:ascii="Arial" w:hAnsi="Arial" w:cs="Arial"/>
                     <w:i/>
                     <w:iCs/>
                     <w:color w:val="AFAFAF"/>
@@ -2424,7 +2424,7 @@
                   </w:pPr>
                   <w:r>
                     <w:rPr>
-                      <w:rFonts w:ascii="Segoe UI Semibold" w:hAnsi="Segoe UI Semibold" w:cs="Segoe UI Semibold"/>
+                      <w:rFonts w:ascii="Arial" w:hAnsi="Arial" w:cs="Arial"/>
                       <w:b/>
                       <w:bCs/>
                       <w:caps/>
@@ -2460,7 +2460,7 @@
                   <w:sdt>
                     <w:sdtPr>
                       <w:rPr>
-                        <w:rFonts w:ascii="Segoe UI Semibold" w:hAnsi="Segoe UI Semibold" w:cs="Segoe UI Semibold"/>
+                        <w:rFonts w:ascii="Arial" w:hAnsi="Arial" w:cs="Arial"/>
                         <w:b/>
                         <w:bCs/>
                         <w:color w:val="FFFFFF"/>
@@ -2479,7 +2479,7 @@
                     <w:sdtContent>
                       <w:r>
                         <w:rPr>
-                          <w:rFonts w:ascii="Segoe UI" w:hAnsi="Segoe UI" w:cs="Segoe UI"/>
+                          <w:rFonts w:ascii="Arial" w:hAnsi="Arial" w:cs="Arial"/>
                           <w:i/>
                           <w:iCs/>
                           <w:color w:val="F3C9C9"/>
@@ -2561,7 +2561,7 @@
             </w:pPr>
             <w:r>
               <w:rPr>
-                <w:rFonts w:ascii="Segoe UI Semibold" w:hAnsi="Segoe UI Semibold" w:cs="Segoe UI Semibold"/>
+                <w:rFonts w:ascii="Arial" w:hAnsi="Arial" w:cs="Arial"/>
                 <w:b/>
                 <w:bCs/>
                 <w:caps/>
@@ -2628,7 +2628,7 @@
             </w:pPr>
             <w:r>
               <w:rPr>
-                <w:rFonts w:ascii="Segoe UI" w:hAnsi="Segoe UI" w:cs="Segoe UI"/>
+                <w:rFonts w:ascii="Arial" w:hAnsi="Arial" w:cs="Arial"/>
                 <w:b/>
                 <w:bCs/>
                 <w:color w:val="C21112"/>
@@ -2639,7 +2639,7 @@
             </w:r>
             <w:r>
               <w:rPr>
-                <w:rFonts w:ascii="Segoe UI" w:hAnsi="Segoe UI" w:cs="Segoe UI"/>
+                <w:rFonts w:ascii="Arial" w:hAnsi="Arial" w:cs="Arial"/>
                 <w:color w:val="33383D"/>
                 <w:sz w:val="13"/>
                 <w:szCs w:val="13"/>
@@ -2648,7 +2648,7 @@
             </w:r>
             <w:r>
               <w:rPr>
-                <w:rFonts w:ascii="Segoe UI" w:hAnsi="Segoe UI" w:cs="Segoe UI"/>
+                <w:rFonts w:ascii="Arial" w:hAnsi="Arial" w:cs="Arial"/>
                 <w:color w:val="6E6E6E"/>
                 <w:sz w:val="13"/>
                 <w:szCs w:val="13"/>
@@ -2675,7 +2675,7 @@
             </w:pPr>
             <w:r>
               <w:rPr>
-                <w:rFonts w:ascii="Segoe UI" w:hAnsi="Segoe UI" w:cs="Segoe UI"/>
+                <w:rFonts w:ascii="Arial" w:hAnsi="Arial" w:cs="Arial"/>
                 <w:b/>
                 <w:bCs/>
                 <w:color w:val="C21112"/>
@@ -2686,7 +2686,7 @@
             </w:r>
             <w:r>
               <w:rPr>
-                <w:rFonts w:ascii="Segoe UI" w:hAnsi="Segoe UI" w:cs="Segoe UI"/>
+                <w:rFonts w:ascii="Arial" w:hAnsi="Arial" w:cs="Arial"/>
                 <w:color w:val="33383D"/>
                 <w:sz w:val="13"/>
                 <w:szCs w:val="13"/>
@@ -2695,7 +2695,7 @@
             </w:r>
             <w:r>
               <w:rPr>
-                <w:rFonts w:ascii="Segoe UI" w:hAnsi="Segoe UI" w:cs="Segoe UI"/>
+                <w:rFonts w:ascii="Arial" w:hAnsi="Arial" w:cs="Arial"/>
                 <w:color w:val="6E6E6E"/>
                 <w:sz w:val="13"/>
                 <w:szCs w:val="13"/>
@@ -2728,7 +2728,7 @@
             </w:pPr>
             <w:r>
               <w:rPr>
-                <w:rFonts w:ascii="Segoe UI" w:hAnsi="Segoe UI" w:cs="Segoe UI"/>
+                <w:rFonts w:ascii="Arial" w:hAnsi="Arial" w:cs="Arial"/>
                 <w:b/>
                 <w:bCs/>
                 <w:color w:val="C21112"/>
@@ -2739,7 +2739,7 @@
             </w:r>
             <w:r>
               <w:rPr>
-                <w:rFonts w:ascii="Segoe UI" w:hAnsi="Segoe UI" w:cs="Segoe UI"/>
+                <w:rFonts w:ascii="Arial" w:hAnsi="Arial" w:cs="Arial"/>
                 <w:color w:val="33383D"/>
                 <w:sz w:val="13"/>
                 <w:szCs w:val="13"/>
@@ -2748,7 +2748,7 @@
             </w:r>
             <w:r>
               <w:rPr>
-                <w:rFonts w:ascii="Segoe UI" w:hAnsi="Segoe UI" w:cs="Segoe UI"/>
+                <w:rFonts w:ascii="Arial" w:hAnsi="Arial" w:cs="Arial"/>
                 <w:color w:val="6E6E6E"/>
                 <w:sz w:val="13"/>
                 <w:szCs w:val="13"/>
@@ -2775,7 +2775,7 @@
             </w:pPr>
             <w:r>
               <w:rPr>
-                <w:rFonts w:ascii="Segoe UI" w:hAnsi="Segoe UI" w:cs="Segoe UI"/>
+                <w:rFonts w:ascii="Arial" w:hAnsi="Arial" w:cs="Arial"/>
                 <w:b/>
                 <w:bCs/>
                 <w:color w:val="C21112"/>
@@ -2786,7 +2786,7 @@
             </w:r>
             <w:r>
               <w:rPr>
-                <w:rFonts w:ascii="Segoe UI" w:hAnsi="Segoe UI" w:cs="Segoe UI"/>
+                <w:rFonts w:ascii="Arial" w:hAnsi="Arial" w:cs="Arial"/>
                 <w:color w:val="33383D"/>
                 <w:sz w:val="13"/>
                 <w:szCs w:val="13"/>
@@ -2795,7 +2795,7 @@
             </w:r>
             <w:r>
               <w:rPr>
-                <w:rFonts w:ascii="Segoe UI" w:hAnsi="Segoe UI" w:cs="Segoe UI"/>
+                <w:rFonts w:ascii="Arial" w:hAnsi="Arial" w:cs="Arial"/>
                 <w:color w:val="6E6E6E"/>
                 <w:sz w:val="13"/>
                 <w:szCs w:val="13"/>
@@ -2828,7 +2828,7 @@
             </w:pPr>
             <w:r>
               <w:rPr>
-                <w:rFonts w:ascii="Segoe UI" w:hAnsi="Segoe UI" w:cs="Segoe UI"/>
+                <w:rFonts w:ascii="Arial" w:hAnsi="Arial" w:cs="Arial"/>
                 <w:b/>
                 <w:bCs/>
                 <w:color w:val="C21112"/>
@@ -2839,7 +2839,7 @@
             </w:r>
             <w:r>
               <w:rPr>
-                <w:rFonts w:ascii="Segoe UI" w:hAnsi="Segoe UI" w:cs="Segoe UI"/>
+                <w:rFonts w:ascii="Arial" w:hAnsi="Arial" w:cs="Arial"/>
                 <w:color w:val="33383D"/>
                 <w:sz w:val="13"/>
                 <w:szCs w:val="13"/>
@@ -2848,7 +2848,7 @@
             </w:r>
             <w:r>
               <w:rPr>
-                <w:rFonts w:ascii="Segoe UI" w:hAnsi="Segoe UI" w:cs="Segoe UI"/>
+                <w:rFonts w:ascii="Arial" w:hAnsi="Arial" w:cs="Arial"/>
                 <w:color w:val="6E6E6E"/>
                 <w:sz w:val="13"/>
                 <w:szCs w:val="13"/>
@@ -2875,7 +2875,7 @@
             </w:pPr>
             <w:r>
               <w:rPr>
-                <w:rFonts w:ascii="Segoe UI" w:hAnsi="Segoe UI" w:cs="Segoe UI"/>
+                <w:rFonts w:ascii="Arial" w:hAnsi="Arial" w:cs="Arial"/>
                 <w:b/>
                 <w:bCs/>
                 <w:color w:val="C21112"/>
@@ -2886,7 +2886,7 @@
             </w:r>
             <w:r>
               <w:rPr>
-                <w:rFonts w:ascii="Segoe UI" w:hAnsi="Segoe UI" w:cs="Segoe UI"/>
+                <w:rFonts w:ascii="Arial" w:hAnsi="Arial" w:cs="Arial"/>
                 <w:color w:val="33383D"/>
                 <w:sz w:val="13"/>
                 <w:szCs w:val="13"/>
@@ -2895,7 +2895,7 @@
             </w:r>
             <w:r>
               <w:rPr>
-                <w:rFonts w:ascii="Segoe UI" w:hAnsi="Segoe UI" w:cs="Segoe UI"/>
+                <w:rFonts w:ascii="Arial" w:hAnsi="Arial" w:cs="Arial"/>
                 <w:color w:val="6E6E6E"/>
                 <w:sz w:val="13"/>
                 <w:szCs w:val="13"/>
@@ -2928,7 +2928,7 @@
             </w:pPr>
             <w:r>
               <w:rPr>
-                <w:rFonts w:ascii="Segoe UI" w:hAnsi="Segoe UI" w:cs="Segoe UI"/>
+                <w:rFonts w:ascii="Arial" w:hAnsi="Arial" w:cs="Arial"/>
                 <w:b/>
                 <w:bCs/>
                 <w:color w:val="C21112"/>
@@ -2939,7 +2939,7 @@
             </w:r>
             <w:r>
               <w:rPr>
-                <w:rFonts w:ascii="Segoe UI" w:hAnsi="Segoe UI" w:cs="Segoe UI"/>
+                <w:rFonts w:ascii="Arial" w:hAnsi="Arial" w:cs="Arial"/>
                 <w:color w:val="33383D"/>
                 <w:sz w:val="13"/>
                 <w:szCs w:val="13"/>
@@ -2948,7 +2948,7 @@
             </w:r>
             <w:r>
               <w:rPr>
-                <w:rFonts w:ascii="Segoe UI" w:hAnsi="Segoe UI" w:cs="Segoe UI"/>
+                <w:rFonts w:ascii="Arial" w:hAnsi="Arial" w:cs="Arial"/>
                 <w:color w:val="6E6E6E"/>
                 <w:sz w:val="13"/>
                 <w:szCs w:val="13"/>
@@ -2975,7 +2975,7 @@
             </w:pPr>
             <w:r>
               <w:rPr>
-                <w:rFonts w:ascii="Segoe UI" w:hAnsi="Segoe UI" w:cs="Segoe UI"/>
+                <w:rFonts w:ascii="Arial" w:hAnsi="Arial" w:cs="Arial"/>
                 <w:b/>
                 <w:bCs/>
                 <w:color w:val="C21112"/>
@@ -2986,7 +2986,7 @@
             </w:r>
             <w:r>
               <w:rPr>
-                <w:rFonts w:ascii="Segoe UI" w:hAnsi="Segoe UI" w:cs="Segoe UI"/>
+                <w:rFonts w:ascii="Arial" w:hAnsi="Arial" w:cs="Arial"/>
                 <w:color w:val="33383D"/>
                 <w:sz w:val="13"/>
                 <w:szCs w:val="13"/>
@@ -2995,7 +2995,7 @@
             </w:r>
             <w:r>
               <w:rPr>
-                <w:rFonts w:ascii="Segoe UI" w:hAnsi="Segoe UI" w:cs="Segoe UI"/>
+                <w:rFonts w:ascii="Arial" w:hAnsi="Arial" w:cs="Arial"/>
                 <w:color w:val="6E6E6E"/>
                 <w:sz w:val="13"/>
                 <w:szCs w:val="13"/>
@@ -3028,7 +3028,7 @@
             </w:pPr>
             <w:r>
               <w:rPr>
-                <w:rFonts w:ascii="Segoe UI" w:hAnsi="Segoe UI" w:cs="Segoe UI"/>
+                <w:rFonts w:ascii="Arial" w:hAnsi="Arial" w:cs="Arial"/>
                 <w:b/>
                 <w:bCs/>
                 <w:color w:val="C21112"/>
@@ -3039,7 +3039,7 @@
             </w:r>
             <w:r>
               <w:rPr>
-                <w:rFonts w:ascii="Segoe UI" w:hAnsi="Segoe UI" w:cs="Segoe UI"/>
+                <w:rFonts w:ascii="Arial" w:hAnsi="Arial" w:cs="Arial"/>
                 <w:color w:val="33383D"/>
                 <w:sz w:val="13"/>
                 <w:szCs w:val="13"/>
@@ -3048,7 +3048,7 @@
             </w:r>
             <w:r>
               <w:rPr>
-                <w:rFonts w:ascii="Segoe UI" w:hAnsi="Segoe UI" w:cs="Segoe UI"/>
+                <w:rFonts w:ascii="Arial" w:hAnsi="Arial" w:cs="Arial"/>
                 <w:color w:val="6E6E6E"/>
                 <w:sz w:val="13"/>
                 <w:szCs w:val="13"/>
@@ -3075,7 +3075,7 @@
             </w:pPr>
             <w:r>
               <w:rPr>
-                <w:rFonts w:ascii="Segoe UI" w:hAnsi="Segoe UI" w:cs="Segoe UI"/>
+                <w:rFonts w:ascii="Arial" w:hAnsi="Arial" w:cs="Arial"/>
                 <w:b/>
                 <w:bCs/>
                 <w:color w:val="C21112"/>
@@ -3086,7 +3086,7 @@
             </w:r>
             <w:r>
               <w:rPr>
-                <w:rFonts w:ascii="Segoe UI" w:hAnsi="Segoe UI" w:cs="Segoe UI"/>
+                <w:rFonts w:ascii="Arial" w:hAnsi="Arial" w:cs="Arial"/>
                 <w:color w:val="33383D"/>
                 <w:sz w:val="13"/>
                 <w:szCs w:val="13"/>
@@ -3095,7 +3095,7 @@
             </w:r>
             <w:r>
               <w:rPr>
-                <w:rFonts w:ascii="Segoe UI" w:hAnsi="Segoe UI" w:cs="Segoe UI"/>
+                <w:rFonts w:ascii="Arial" w:hAnsi="Arial" w:cs="Arial"/>
                 <w:color w:val="6E6E6E"/>
                 <w:sz w:val="13"/>
                 <w:szCs w:val="13"/>
@@ -3113,7 +3113,7 @@
       </w:pPr>
       <w:r>
         <w:rPr>
-          <w:rFonts w:ascii="Segoe UI" w:hAnsi="Segoe UI" w:cs="Segoe UI"/>
+          <w:rFonts w:ascii="Arial" w:hAnsi="Arial" w:cs="Arial"/>
           <w:i/>
           <w:iCs/>
           <w:color w:val="6E6E6E"/>
@@ -3201,7 +3201,7 @@
           </w:pPr>
           <w:r>
             <w:rPr>
-              <w:rFonts w:ascii="Segoe UI Semibold" w:hAnsi="Segoe UI Semibold" w:cs="Segoe UI Semibold"/>
+              <w:rFonts w:ascii="Arial" w:hAnsi="Arial" w:cs="Arial"/>
               <w:b/>
               <w:bCs/>
               <w:color w:val="C21112"/>
@@ -3212,7 +3212,7 @@
           </w:r>
           <w:r>
             <w:rPr>
-              <w:rFonts w:ascii="Segoe UI" w:hAnsi="Segoe UI" w:cs="Segoe UI"/>
+              <w:rFonts w:ascii="Arial" w:hAnsi="Arial" w:cs="Arial"/>
               <w:color w:val="C9C9C9"/>
               <w:sz w:val="13"/>
               <w:szCs w:val="13"/>
@@ -3221,7 +3221,7 @@
           </w:r>
           <w:r>
             <w:rPr>
-              <w:rFonts w:ascii="Segoe UI" w:hAnsi="Segoe UI" w:cs="Segoe UI"/>
+              <w:rFonts w:ascii="Arial" w:hAnsi="Arial" w:cs="Arial"/>
               <w:color w:val="6E6E6E"/>
               <w:sz w:val="12"/>
               <w:szCs w:val="12"/>
@@ -3248,7 +3248,7 @@
           </w:pPr>
           <w:r>
             <w:rPr>
-              <w:rFonts w:ascii="Segoe UI" w:hAnsi="Segoe UI" w:cs="Segoe UI"/>
+              <w:rFonts w:ascii="Arial" w:hAnsi="Arial" w:cs="Arial"/>
               <w:color w:val="6E6E6E"/>
               <w:sz w:val="13"/>
               <w:szCs w:val="13"/>
@@ -3257,7 +3257,7 @@
           </w:r>
           <w:r>
             <w:rPr>
-              <w:rFonts w:ascii="Segoe UI Semibold" w:hAnsi="Segoe UI Semibold" w:cs="Segoe UI Semibold"/>
+              <w:rFonts w:ascii="Arial" w:hAnsi="Arial" w:cs="Arial"/>
               <w:b/>
               <w:bCs/>
               <w:color w:val="111111"/>
@@ -3268,7 +3268,7 @@
           </w:r>
           <w:r>
             <w:rPr>
-              <w:rFonts w:ascii="Segoe UI Semibold" w:hAnsi="Segoe UI Semibold" w:cs="Segoe UI Semibold"/>
+              <w:rFonts w:ascii="Arial" w:hAnsi="Arial" w:cs="Arial"/>
               <w:b/>
               <w:bCs/>
               <w:color w:val="111111"/>
@@ -3279,7 +3279,7 @@
           </w:r>
           <w:r>
             <w:rPr>
-              <w:rFonts w:ascii="Segoe UI Semibold" w:hAnsi="Segoe UI Semibold" w:cs="Segoe UI Semibold"/>
+              <w:rFonts w:ascii="Arial" w:hAnsi="Arial" w:cs="Arial"/>
               <w:b/>
               <w:bCs/>
               <w:color w:val="111111"/>
@@ -3290,7 +3290,7 @@
           </w:r>
           <w:r>
             <w:rPr>
-              <w:rFonts w:ascii="Segoe UI Semibold" w:hAnsi="Segoe UI Semibold" w:cs="Segoe UI Semibold"/>
+              <w:rFonts w:ascii="Arial" w:hAnsi="Arial" w:cs="Arial"/>
               <w:b/>
               <w:bCs/>
               <w:color w:val="111111"/>
@@ -3301,7 +3301,7 @@
           </w:r>
           <w:r>
             <w:rPr>
-              <w:rFonts w:ascii="Segoe UI Semibold" w:hAnsi="Segoe UI Semibold" w:cs="Segoe UI Semibold"/>
+              <w:rFonts w:ascii="Arial" w:hAnsi="Arial" w:cs="Arial"/>
               <w:b/>
               <w:bCs/>
               <w:color w:val="111111"/>
@@ -3312,7 +3312,7 @@
           </w:r>
           <w:r>
             <w:rPr>
-              <w:rFonts w:ascii="Segoe UI" w:hAnsi="Segoe UI" w:cs="Segoe UI"/>
+              <w:rFonts w:ascii="Arial" w:hAnsi="Arial" w:cs="Arial"/>
               <w:color w:val="6E6E6E"/>
               <w:sz w:val="13"/>
               <w:szCs w:val="13"/>
@@ -3321,7 +3321,7 @@
           </w:r>
           <w:r>
             <w:rPr>
-              <w:rFonts w:ascii="Segoe UI Semibold" w:hAnsi="Segoe UI Semibold" w:cs="Segoe UI Semibold"/>
+              <w:rFonts w:ascii="Arial" w:hAnsi="Arial" w:cs="Arial"/>
               <w:b/>
               <w:bCs/>
               <w:color w:val="111111"/>
@@ -3332,7 +3332,7 @@
           </w:r>
           <w:r>
             <w:rPr>
-              <w:rFonts w:ascii="Segoe UI Semibold" w:hAnsi="Segoe UI Semibold" w:cs="Segoe UI Semibold"/>
+              <w:rFonts w:ascii="Arial" w:hAnsi="Arial" w:cs="Arial"/>
               <w:b/>
               <w:bCs/>
               <w:color w:val="111111"/>
@@ -3343,7 +3343,7 @@
           </w:r>
           <w:r>
             <w:rPr>
-              <w:rFonts w:ascii="Segoe UI Semibold" w:hAnsi="Segoe UI Semibold" w:cs="Segoe UI Semibold"/>
+              <w:rFonts w:ascii="Arial" w:hAnsi="Arial" w:cs="Arial"/>
               <w:b/>
               <w:bCs/>
               <w:color w:val="111111"/>
@@ -3354,7 +3354,7 @@
           </w:r>
           <w:r>
             <w:rPr>
-              <w:rFonts w:ascii="Segoe UI Semibold" w:hAnsi="Segoe UI Semibold" w:cs="Segoe UI Semibold"/>
+              <w:rFonts w:ascii="Arial" w:hAnsi="Arial" w:cs="Arial"/>
               <w:b/>
               <w:bCs/>
               <w:color w:val="111111"/>
@@ -3365,7 +3365,7 @@
           </w:r>
           <w:r>
             <w:rPr>
-              <w:rFonts w:ascii="Segoe UI Semibold" w:hAnsi="Segoe UI Semibold" w:cs="Segoe UI Semibold"/>
+              <w:rFonts w:ascii="Arial" w:hAnsi="Arial" w:cs="Arial"/>
               <w:b/>
               <w:bCs/>
               <w:color w:val="111111"/>
@@ -3446,7 +3446,7 @@
           </w:pPr>
           <w:r>
             <w:rPr>
-              <w:rFonts w:ascii="Segoe UI" w:hAnsi="Segoe UI" w:cs="Segoe UI"/>
+              <w:rFonts w:ascii="Arial" w:hAnsi="Arial" w:cs="Arial"/>
               <w:caps/>
               <w:color w:val="6E6E6E"/>
               <w:sz w:val="12"/>
@@ -3515,7 +3515,7 @@
           </w:pPr>
           <w:r>
             <w:rPr>
-              <w:rFonts w:ascii="Segoe UI Semibold" w:hAnsi="Segoe UI Semibold" w:cs="Segoe UI Semibold"/>
+              <w:rFonts w:ascii="Arial" w:hAnsi="Arial" w:cs="Arial"/>
               <w:b/>
               <w:bCs/>
               <w:caps/>
@@ -3533,7 +3533,7 @@
           </w:pPr>
           <w:r>
             <w:rPr>
-              <w:rFonts w:ascii="Segoe UI" w:hAnsi="Segoe UI" w:cs="Segoe UI"/>
+              <w:rFonts w:ascii="Arial" w:hAnsi="Arial" w:cs="Arial"/>
               <w:color w:val="6E6E6E"/>
               <w:sz w:val="11"/>
               <w:szCs w:val="11"/>
@@ -3547,7 +3547,7 @@
           </w:pPr>
           <w:r>
             <w:rPr>
-              <w:rFonts w:ascii="Segoe UI" w:hAnsi="Segoe UI" w:cs="Segoe UI"/>
+              <w:rFonts w:ascii="Arial" w:hAnsi="Arial" w:cs="Arial"/>
               <w:color w:val="6E6E6E"/>
               <w:sz w:val="11"/>
               <w:szCs w:val="11"/>
@@ -3573,7 +3573,7 @@
           </w:pPr>
           <w:r>
             <w:rPr>
-              <w:rFonts w:ascii="Segoe UI Semibold" w:hAnsi="Segoe UI Semibold" w:cs="Segoe UI Semibold"/>
+              <w:rFonts w:ascii="Arial" w:hAnsi="Arial" w:cs="Arial"/>
               <w:b/>
               <w:bCs/>
               <w:caps/>
@@ -3591,7 +3591,7 @@
           </w:pPr>
           <w:r>
             <w:rPr>
-              <w:rFonts w:ascii="Segoe UI" w:hAnsi="Segoe UI" w:cs="Segoe UI"/>
+              <w:rFonts w:ascii="Arial" w:hAnsi="Arial" w:cs="Arial"/>
               <w:color w:val="6E6E6E"/>
               <w:sz w:val="11"/>
               <w:szCs w:val="11"/>
@@ -3605,7 +3605,7 @@
           </w:pPr>
           <w:r>
             <w:rPr>
-              <w:rFonts w:ascii="Segoe UI" w:hAnsi="Segoe UI" w:cs="Segoe UI"/>
+              <w:rFonts w:ascii="Arial" w:hAnsi="Arial" w:cs="Arial"/>
               <w:color w:val="6E6E6E"/>
               <w:sz w:val="11"/>
               <w:szCs w:val="11"/>
@@ -3631,7 +3631,7 @@
           </w:pPr>
           <w:r>
             <w:rPr>
-              <w:rFonts w:ascii="Segoe UI Semibold" w:hAnsi="Segoe UI Semibold" w:cs="Segoe UI Semibold"/>
+              <w:rFonts w:ascii="Arial" w:hAnsi="Arial" w:cs="Arial"/>
               <w:b/>
               <w:bCs/>
               <w:caps/>
@@ -3649,7 +3649,7 @@
           </w:pPr>
           <w:r>
             <w:rPr>
-              <w:rFonts w:ascii="Segoe UI" w:hAnsi="Segoe UI" w:cs="Segoe UI"/>
+              <w:rFonts w:ascii="Arial" w:hAnsi="Arial" w:cs="Arial"/>
               <w:color w:val="6E6E6E"/>
               <w:sz w:val="11"/>
               <w:szCs w:val="11"/>
@@ -3663,7 +3663,7 @@
           </w:pPr>
           <w:r>
             <w:rPr>
-              <w:rFonts w:ascii="Segoe UI" w:hAnsi="Segoe UI" w:cs="Segoe UI"/>
+              <w:rFonts w:ascii="Arial" w:hAnsi="Arial" w:cs="Arial"/>
               <w:color w:val="6E6E6E"/>
               <w:sz w:val="11"/>
               <w:szCs w:val="11"/>

</xml_diff>

<commit_message>
Cotizaciones: la hoja cierra con 51 mm libres, no al limite
El cambio a Arial fue un error: el equipo del usuario si tiene Segoe UI y
Arial es mas ancha, asi que provoco mas renglones y empeoro el desborde.

Se regresa a Segoe UI y se deja de ajustar al milimetro: se recortan
rellenos de la tabla de servicios, del encabezado, de los paneles y de las
condiciones hasta que la vista previa cierra con 51 mm libres. Como la
vista previa sustituye Segoe UI por una fuente MAS ancha, en Word sobra
todavia mas espacio.

Co-Authored-By: Claude Opus 5 <noreply@anthropic.com>
Claude-Session: https://claude.ai/code/session_017DE5RtjtLFhQ3FcsP1iHRy
</commit_message>
<xml_diff>
--- a/plantillas/cotizador/salida/FORMATO_COTIZACION_FLETES_TAURO.docx
+++ b/plantillas/cotizador/salida/FORMATO_COTIZACION_FLETES_TAURO.docx
@@ -71,7 +71,7 @@
       <w:tr>
         <w:trPr>
           <w:cantSplit/>
-          <w:trHeight w:val="800" w:hRule="atLeast"/>
+          <w:trHeight w:val="660" w:hRule="atLeast"/>
         </w:trPr>
         <w:tc>
           <w:tcPr>
@@ -91,7 +91,7 @@
             <w:r>
               <w:drawing>
                 <wp:inline distT="0" distB="0" distL="0" distR="0">
-                  <wp:extent cx="1152144" cy="766684"/>
+                  <wp:extent cx="932688" cy="620649"/>
                   <wp:effectExtent l="0" t="0" r="0" b="0"/>
                   <wp:docPr id="1003" name="Fletes Tauro"/>
                   <wp:cNvGraphicFramePr>
@@ -113,7 +113,7 @@
                         <pic:spPr>
                           <a:xfrm>
                             <a:off x="0" y="0"/>
-                            <a:ext cx="1152144" cy="766684"/>
+                            <a:ext cx="932688" cy="620649"/>
                           </a:xfrm>
                           <a:prstGeom prst="rect">
                             <a:avLst/>
@@ -145,7 +145,7 @@
             </w:pPr>
             <w:r>
               <w:rPr>
-                <w:rFonts w:ascii="Arial" w:hAnsi="Arial" w:cs="Arial"/>
+                <w:rFonts w:ascii="Segoe UI Semibold" w:hAnsi="Segoe UI Semibold" w:cs="Segoe UI Semibold"/>
                 <w:b/>
                 <w:bCs/>
                 <w:color w:val="111111"/>
@@ -163,7 +163,7 @@
             </w:pPr>
             <w:r>
               <w:rPr>
-                <w:rFonts w:ascii="Arial" w:hAnsi="Arial" w:cs="Arial"/>
+                <w:rFonts w:ascii="Segoe UI" w:hAnsi="Segoe UI" w:cs="Segoe UI"/>
                 <w:caps/>
                 <w:color w:val="6E6E6E"/>
                 <w:spacing w:val="70"/>
@@ -210,7 +210,7 @@
     </w:p>
     <w:p>
       <w:pPr>
-        <w:spacing w:before="0" w:after="40" w:line="75" w:lineRule="exact"/>
+        <w:spacing w:before="0" w:after="30" w:line="75" w:lineRule="exact"/>
       </w:pPr>
       <w:r>
         <w:rPr>
@@ -264,7 +264,7 @@
             </w:pPr>
             <w:r>
               <w:rPr>
-                <w:rFonts w:ascii="Arial" w:hAnsi="Arial" w:cs="Arial"/>
+                <w:rFonts w:ascii="Segoe UI Semibold" w:hAnsi="Segoe UI Semibold" w:cs="Segoe UI Semibold"/>
                 <w:b/>
                 <w:bCs/>
                 <w:caps/>
@@ -321,7 +321,7 @@
             </w:pPr>
             <w:r>
               <w:rPr>
-                <w:rFonts w:ascii="Arial" w:hAnsi="Arial" w:cs="Arial"/>
+                <w:rFonts w:ascii="Segoe UI Semibold" w:hAnsi="Segoe UI Semibold" w:cs="Segoe UI Semibold"/>
                 <w:b/>
                 <w:bCs/>
                 <w:caps/>
@@ -344,9 +344,9 @@
           <w:tcPr>
             <w:tcW w:w="1560" w:type="dxa"/>
             <w:tcMar>
-              <w:top w:w="40" w:type="dxa"/>
+              <w:top w:w="30" w:type="dxa"/>
               <w:left w:w="0" w:type="dxa"/>
-              <w:bottom w:w="60" w:type="dxa"/>
+              <w:bottom w:w="45" w:type="dxa"/>
               <w:right w:w="60" w:type="dxa"/>
             </w:tcMar>
             <w:vAlign w:val="bottom"/>
@@ -357,7 +357,7 @@
             </w:pPr>
             <w:r>
               <w:rPr>
-                <w:rFonts w:ascii="Arial" w:hAnsi="Arial" w:cs="Arial"/>
+                <w:rFonts w:ascii="Segoe UI Semibold" w:hAnsi="Segoe UI Semibold" w:cs="Segoe UI Semibold"/>
                 <w:b/>
                 <w:bCs/>
                 <w:caps/>
@@ -377,9 +377,9 @@
               <w:bottom w:val="single" w:sz="6" w:space="0" w:color="C9C9C9"/>
             </w:tcBorders>
             <w:tcMar>
-              <w:top w:w="40" w:type="dxa"/>
+              <w:top w:w="30" w:type="dxa"/>
               <w:left w:w="60" w:type="dxa"/>
-              <w:bottom w:w="60" w:type="dxa"/>
+              <w:bottom w:w="45" w:type="dxa"/>
               <w:right w:w="60" w:type="dxa"/>
             </w:tcMar>
             <w:vAlign w:val="bottom"/>
@@ -391,7 +391,7 @@
             <w:sdt>
               <w:sdtPr>
                 <w:rPr>
-                  <w:rFonts w:ascii="Arial" w:hAnsi="Arial" w:cs="Arial"/>
+                  <w:rFonts w:ascii="Segoe UI" w:hAnsi="Segoe UI" w:cs="Segoe UI"/>
                   <w:color w:val="111111"/>
                   <w:sz w:val="19"/>
                   <w:szCs w:val="19"/>
@@ -408,7 +408,7 @@
               <w:sdtContent>
                 <w:r>
                   <w:rPr>
-                    <w:rFonts w:ascii="Arial" w:hAnsi="Arial" w:cs="Arial"/>
+                    <w:rFonts w:ascii="Segoe UI" w:hAnsi="Segoe UI" w:cs="Segoe UI"/>
                     <w:i/>
                     <w:iCs/>
                     <w:color w:val="AFAFAF"/>
@@ -450,9 +450,9 @@
           <w:tcPr>
             <w:tcW w:w="1560" w:type="dxa"/>
             <w:tcMar>
-              <w:top w:w="40" w:type="dxa"/>
+              <w:top w:w="30" w:type="dxa"/>
               <w:left w:w="0" w:type="dxa"/>
-              <w:bottom w:w="60" w:type="dxa"/>
+              <w:bottom w:w="45" w:type="dxa"/>
               <w:right w:w="60" w:type="dxa"/>
             </w:tcMar>
             <w:vAlign w:val="bottom"/>
@@ -463,7 +463,7 @@
             </w:pPr>
             <w:r>
               <w:rPr>
-                <w:rFonts w:ascii="Arial" w:hAnsi="Arial" w:cs="Arial"/>
+                <w:rFonts w:ascii="Segoe UI Semibold" w:hAnsi="Segoe UI Semibold" w:cs="Segoe UI Semibold"/>
                 <w:b/>
                 <w:bCs/>
                 <w:caps/>
@@ -483,9 +483,9 @@
               <w:bottom w:val="single" w:sz="6" w:space="0" w:color="C9C9C9"/>
             </w:tcBorders>
             <w:tcMar>
-              <w:top w:w="40" w:type="dxa"/>
+              <w:top w:w="30" w:type="dxa"/>
               <w:left w:w="60" w:type="dxa"/>
-              <w:bottom w:w="60" w:type="dxa"/>
+              <w:bottom w:w="45" w:type="dxa"/>
               <w:right w:w="60" w:type="dxa"/>
             </w:tcMar>
             <w:vAlign w:val="bottom"/>
@@ -497,7 +497,7 @@
             <w:sdt>
               <w:sdtPr>
                 <w:rPr>
-                  <w:rFonts w:ascii="Arial" w:hAnsi="Arial" w:cs="Arial"/>
+                  <w:rFonts w:ascii="Segoe UI" w:hAnsi="Segoe UI" w:cs="Segoe UI"/>
                   <w:color w:val="111111"/>
                   <w:sz w:val="19"/>
                   <w:szCs w:val="19"/>
@@ -514,7 +514,7 @@
               <w:sdtContent>
                 <w:r>
                   <w:rPr>
-                    <w:rFonts w:ascii="Arial" w:hAnsi="Arial" w:cs="Arial"/>
+                    <w:rFonts w:ascii="Segoe UI" w:hAnsi="Segoe UI" w:cs="Segoe UI"/>
                     <w:i/>
                     <w:iCs/>
                     <w:color w:val="AFAFAF"/>
@@ -537,9 +537,9 @@
           <w:tcPr>
             <w:tcW w:w="1560" w:type="dxa"/>
             <w:tcMar>
-              <w:top w:w="40" w:type="dxa"/>
+              <w:top w:w="30" w:type="dxa"/>
               <w:left w:w="0" w:type="dxa"/>
-              <w:bottom w:w="60" w:type="dxa"/>
+              <w:bottom w:w="45" w:type="dxa"/>
               <w:right w:w="60" w:type="dxa"/>
             </w:tcMar>
             <w:vAlign w:val="bottom"/>
@@ -550,7 +550,7 @@
             </w:pPr>
             <w:r>
               <w:rPr>
-                <w:rFonts w:ascii="Arial" w:hAnsi="Arial" w:cs="Arial"/>
+                <w:rFonts w:ascii="Segoe UI Semibold" w:hAnsi="Segoe UI Semibold" w:cs="Segoe UI Semibold"/>
                 <w:b/>
                 <w:bCs/>
                 <w:caps/>
@@ -570,9 +570,9 @@
               <w:bottom w:val="single" w:sz="6" w:space="0" w:color="C9C9C9"/>
             </w:tcBorders>
             <w:tcMar>
-              <w:top w:w="40" w:type="dxa"/>
+              <w:top w:w="30" w:type="dxa"/>
               <w:left w:w="60" w:type="dxa"/>
-              <w:bottom w:w="60" w:type="dxa"/>
+              <w:bottom w:w="45" w:type="dxa"/>
               <w:right w:w="60" w:type="dxa"/>
             </w:tcMar>
             <w:vAlign w:val="bottom"/>
@@ -584,7 +584,7 @@
             <w:sdt>
               <w:sdtPr>
                 <w:rPr>
-                  <w:rFonts w:ascii="Arial" w:hAnsi="Arial" w:cs="Arial"/>
+                  <w:rFonts w:ascii="Segoe UI" w:hAnsi="Segoe UI" w:cs="Segoe UI"/>
                   <w:color w:val="111111"/>
                   <w:sz w:val="19"/>
                   <w:szCs w:val="19"/>
@@ -601,7 +601,7 @@
               <w:sdtContent>
                 <w:r>
                   <w:rPr>
-                    <w:rFonts w:ascii="Arial" w:hAnsi="Arial" w:cs="Arial"/>
+                    <w:rFonts w:ascii="Segoe UI" w:hAnsi="Segoe UI" w:cs="Segoe UI"/>
                     <w:i/>
                     <w:iCs/>
                     <w:color w:val="AFAFAF"/>
@@ -643,9 +643,9 @@
           <w:tcPr>
             <w:tcW w:w="1560" w:type="dxa"/>
             <w:tcMar>
-              <w:top w:w="40" w:type="dxa"/>
+              <w:top w:w="30" w:type="dxa"/>
               <w:left w:w="0" w:type="dxa"/>
-              <w:bottom w:w="60" w:type="dxa"/>
+              <w:bottom w:w="45" w:type="dxa"/>
               <w:right w:w="60" w:type="dxa"/>
             </w:tcMar>
             <w:vAlign w:val="bottom"/>
@@ -656,7 +656,7 @@
             </w:pPr>
             <w:r>
               <w:rPr>
-                <w:rFonts w:ascii="Arial" w:hAnsi="Arial" w:cs="Arial"/>
+                <w:rFonts w:ascii="Segoe UI Semibold" w:hAnsi="Segoe UI Semibold" w:cs="Segoe UI Semibold"/>
                 <w:b/>
                 <w:bCs/>
                 <w:caps/>
@@ -676,9 +676,9 @@
               <w:bottom w:val="single" w:sz="6" w:space="0" w:color="C9C9C9"/>
             </w:tcBorders>
             <w:tcMar>
-              <w:top w:w="40" w:type="dxa"/>
+              <w:top w:w="30" w:type="dxa"/>
               <w:left w:w="60" w:type="dxa"/>
-              <w:bottom w:w="60" w:type="dxa"/>
+              <w:bottom w:w="45" w:type="dxa"/>
               <w:right w:w="60" w:type="dxa"/>
             </w:tcMar>
             <w:vAlign w:val="bottom"/>
@@ -690,7 +690,7 @@
             <w:sdt>
               <w:sdtPr>
                 <w:rPr>
-                  <w:rFonts w:ascii="Arial" w:hAnsi="Arial" w:cs="Arial"/>
+                  <w:rFonts w:ascii="Segoe UI" w:hAnsi="Segoe UI" w:cs="Segoe UI"/>
                   <w:color w:val="111111"/>
                   <w:sz w:val="19"/>
                   <w:szCs w:val="19"/>
@@ -707,7 +707,7 @@
               <w:sdtContent>
                 <w:r>
                   <w:rPr>
-                    <w:rFonts w:ascii="Arial" w:hAnsi="Arial" w:cs="Arial"/>
+                    <w:rFonts w:ascii="Segoe UI" w:hAnsi="Segoe UI" w:cs="Segoe UI"/>
                     <w:i/>
                     <w:iCs/>
                     <w:color w:val="AFAFAF"/>
@@ -730,9 +730,9 @@
           <w:tcPr>
             <w:tcW w:w="1560" w:type="dxa"/>
             <w:tcMar>
-              <w:top w:w="40" w:type="dxa"/>
+              <w:top w:w="30" w:type="dxa"/>
               <w:left w:w="0" w:type="dxa"/>
-              <w:bottom w:w="60" w:type="dxa"/>
+              <w:bottom w:w="45" w:type="dxa"/>
               <w:right w:w="60" w:type="dxa"/>
             </w:tcMar>
             <w:vAlign w:val="bottom"/>
@@ -743,7 +743,7 @@
             </w:pPr>
             <w:r>
               <w:rPr>
-                <w:rFonts w:ascii="Arial" w:hAnsi="Arial" w:cs="Arial"/>
+                <w:rFonts w:ascii="Segoe UI Semibold" w:hAnsi="Segoe UI Semibold" w:cs="Segoe UI Semibold"/>
                 <w:b/>
                 <w:bCs/>
                 <w:caps/>
@@ -763,9 +763,9 @@
               <w:bottom w:val="single" w:sz="6" w:space="0" w:color="C9C9C9"/>
             </w:tcBorders>
             <w:tcMar>
-              <w:top w:w="40" w:type="dxa"/>
+              <w:top w:w="30" w:type="dxa"/>
               <w:left w:w="60" w:type="dxa"/>
-              <w:bottom w:w="60" w:type="dxa"/>
+              <w:bottom w:w="45" w:type="dxa"/>
               <w:right w:w="60" w:type="dxa"/>
             </w:tcMar>
             <w:vAlign w:val="bottom"/>
@@ -777,7 +777,7 @@
             <w:sdt>
               <w:sdtPr>
                 <w:rPr>
-                  <w:rFonts w:ascii="Arial" w:hAnsi="Arial" w:cs="Arial"/>
+                  <w:rFonts w:ascii="Segoe UI" w:hAnsi="Segoe UI" w:cs="Segoe UI"/>
                   <w:color w:val="111111"/>
                   <w:sz w:val="19"/>
                   <w:szCs w:val="19"/>
@@ -794,7 +794,7 @@
               <w:sdtContent>
                 <w:r>
                   <w:rPr>
-                    <w:rFonts w:ascii="Arial" w:hAnsi="Arial" w:cs="Arial"/>
+                    <w:rFonts w:ascii="Segoe UI" w:hAnsi="Segoe UI" w:cs="Segoe UI"/>
                     <w:i/>
                     <w:iCs/>
                     <w:color w:val="AFAFAF"/>
@@ -836,9 +836,9 @@
           <w:tcPr>
             <w:tcW w:w="1560" w:type="dxa"/>
             <w:tcMar>
-              <w:top w:w="40" w:type="dxa"/>
+              <w:top w:w="30" w:type="dxa"/>
               <w:left w:w="0" w:type="dxa"/>
-              <w:bottom w:w="60" w:type="dxa"/>
+              <w:bottom w:w="45" w:type="dxa"/>
               <w:right w:w="60" w:type="dxa"/>
             </w:tcMar>
             <w:vAlign w:val="bottom"/>
@@ -849,7 +849,7 @@
             </w:pPr>
             <w:r>
               <w:rPr>
-                <w:rFonts w:ascii="Arial" w:hAnsi="Arial" w:cs="Arial"/>
+                <w:rFonts w:ascii="Segoe UI Semibold" w:hAnsi="Segoe UI Semibold" w:cs="Segoe UI Semibold"/>
                 <w:b/>
                 <w:bCs/>
                 <w:caps/>
@@ -869,9 +869,9 @@
               <w:bottom w:val="single" w:sz="6" w:space="0" w:color="C9C9C9"/>
             </w:tcBorders>
             <w:tcMar>
-              <w:top w:w="40" w:type="dxa"/>
+              <w:top w:w="30" w:type="dxa"/>
               <w:left w:w="60" w:type="dxa"/>
-              <w:bottom w:w="60" w:type="dxa"/>
+              <w:bottom w:w="45" w:type="dxa"/>
               <w:right w:w="60" w:type="dxa"/>
             </w:tcMar>
             <w:vAlign w:val="bottom"/>
@@ -883,7 +883,7 @@
             <w:sdt>
               <w:sdtPr>
                 <w:rPr>
-                  <w:rFonts w:ascii="Arial" w:hAnsi="Arial" w:cs="Arial"/>
+                  <w:rFonts w:ascii="Segoe UI" w:hAnsi="Segoe UI" w:cs="Segoe UI"/>
                   <w:color w:val="111111"/>
                   <w:sz w:val="19"/>
                   <w:szCs w:val="19"/>
@@ -900,7 +900,7 @@
               <w:sdtContent>
                 <w:r>
                   <w:rPr>
-                    <w:rFonts w:ascii="Arial" w:hAnsi="Arial" w:cs="Arial"/>
+                    <w:rFonts w:ascii="Segoe UI" w:hAnsi="Segoe UI" w:cs="Segoe UI"/>
                     <w:i/>
                     <w:iCs/>
                     <w:color w:val="AFAFAF"/>
@@ -923,9 +923,9 @@
           <w:tcPr>
             <w:tcW w:w="1560" w:type="dxa"/>
             <w:tcMar>
-              <w:top w:w="40" w:type="dxa"/>
+              <w:top w:w="30" w:type="dxa"/>
               <w:left w:w="0" w:type="dxa"/>
-              <w:bottom w:w="60" w:type="dxa"/>
+              <w:bottom w:w="45" w:type="dxa"/>
               <w:right w:w="60" w:type="dxa"/>
             </w:tcMar>
             <w:vAlign w:val="bottom"/>
@@ -936,7 +936,7 @@
             </w:pPr>
             <w:r>
               <w:rPr>
-                <w:rFonts w:ascii="Arial" w:hAnsi="Arial" w:cs="Arial"/>
+                <w:rFonts w:ascii="Segoe UI Semibold" w:hAnsi="Segoe UI Semibold" w:cs="Segoe UI Semibold"/>
                 <w:b/>
                 <w:bCs/>
                 <w:caps/>
@@ -956,9 +956,9 @@
               <w:bottom w:val="single" w:sz="6" w:space="0" w:color="C9C9C9"/>
             </w:tcBorders>
             <w:tcMar>
-              <w:top w:w="40" w:type="dxa"/>
+              <w:top w:w="30" w:type="dxa"/>
               <w:left w:w="60" w:type="dxa"/>
-              <w:bottom w:w="60" w:type="dxa"/>
+              <w:bottom w:w="45" w:type="dxa"/>
               <w:right w:w="60" w:type="dxa"/>
             </w:tcMar>
             <w:vAlign w:val="bottom"/>
@@ -970,7 +970,7 @@
             <w:sdt>
               <w:sdtPr>
                 <w:rPr>
-                  <w:rFonts w:ascii="Arial" w:hAnsi="Arial" w:cs="Arial"/>
+                  <w:rFonts w:ascii="Segoe UI" w:hAnsi="Segoe UI" w:cs="Segoe UI"/>
                   <w:color w:val="111111"/>
                   <w:sz w:val="19"/>
                   <w:szCs w:val="19"/>
@@ -987,7 +987,7 @@
               <w:sdtContent>
                 <w:r>
                   <w:rPr>
-                    <w:rFonts w:ascii="Arial" w:hAnsi="Arial" w:cs="Arial"/>
+                    <w:rFonts w:ascii="Segoe UI" w:hAnsi="Segoe UI" w:cs="Segoe UI"/>
                     <w:i/>
                     <w:iCs/>
                     <w:color w:val="AFAFAF"/>
@@ -1029,9 +1029,9 @@
           <w:tcPr>
             <w:tcW w:w="1560" w:type="dxa"/>
             <w:tcMar>
-              <w:top w:w="40" w:type="dxa"/>
+              <w:top w:w="30" w:type="dxa"/>
               <w:left w:w="0" w:type="dxa"/>
-              <w:bottom w:w="60" w:type="dxa"/>
+              <w:bottom w:w="45" w:type="dxa"/>
               <w:right w:w="60" w:type="dxa"/>
             </w:tcMar>
             <w:vAlign w:val="bottom"/>
@@ -1042,7 +1042,7 @@
             </w:pPr>
             <w:r>
               <w:rPr>
-                <w:rFonts w:ascii="Arial" w:hAnsi="Arial" w:cs="Arial"/>
+                <w:rFonts w:ascii="Segoe UI Semibold" w:hAnsi="Segoe UI Semibold" w:cs="Segoe UI Semibold"/>
                 <w:b/>
                 <w:bCs/>
                 <w:caps/>
@@ -1062,9 +1062,9 @@
               <w:bottom w:val="single" w:sz="6" w:space="0" w:color="C9C9C9"/>
             </w:tcBorders>
             <w:tcMar>
-              <w:top w:w="40" w:type="dxa"/>
+              <w:top w:w="30" w:type="dxa"/>
               <w:left w:w="60" w:type="dxa"/>
-              <w:bottom w:w="60" w:type="dxa"/>
+              <w:bottom w:w="45" w:type="dxa"/>
               <w:right w:w="60" w:type="dxa"/>
             </w:tcMar>
             <w:vAlign w:val="bottom"/>
@@ -1076,7 +1076,7 @@
             <w:sdt>
               <w:sdtPr>
                 <w:rPr>
-                  <w:rFonts w:ascii="Arial" w:hAnsi="Arial" w:cs="Arial"/>
+                  <w:rFonts w:ascii="Segoe UI" w:hAnsi="Segoe UI" w:cs="Segoe UI"/>
                   <w:color w:val="111111"/>
                   <w:sz w:val="19"/>
                   <w:szCs w:val="19"/>
@@ -1093,7 +1093,7 @@
               <w:sdtContent>
                 <w:r>
                   <w:rPr>
-                    <w:rFonts w:ascii="Arial" w:hAnsi="Arial" w:cs="Arial"/>
+                    <w:rFonts w:ascii="Segoe UI" w:hAnsi="Segoe UI" w:cs="Segoe UI"/>
                     <w:i/>
                     <w:iCs/>
                     <w:color w:val="AFAFAF"/>
@@ -1116,9 +1116,9 @@
           <w:tcPr>
             <w:tcW w:w="1560" w:type="dxa"/>
             <w:tcMar>
-              <w:top w:w="40" w:type="dxa"/>
+              <w:top w:w="30" w:type="dxa"/>
               <w:left w:w="0" w:type="dxa"/>
-              <w:bottom w:w="60" w:type="dxa"/>
+              <w:bottom w:w="45" w:type="dxa"/>
               <w:right w:w="60" w:type="dxa"/>
             </w:tcMar>
             <w:vAlign w:val="bottom"/>
@@ -1129,7 +1129,7 @@
             </w:pPr>
             <w:r>
               <w:rPr>
-                <w:rFonts w:ascii="Arial" w:hAnsi="Arial" w:cs="Arial"/>
+                <w:rFonts w:ascii="Segoe UI Semibold" w:hAnsi="Segoe UI Semibold" w:cs="Segoe UI Semibold"/>
                 <w:b/>
                 <w:bCs/>
                 <w:caps/>
@@ -1149,9 +1149,9 @@
               <w:bottom w:val="single" w:sz="6" w:space="0" w:color="C9C9C9"/>
             </w:tcBorders>
             <w:tcMar>
-              <w:top w:w="40" w:type="dxa"/>
+              <w:top w:w="30" w:type="dxa"/>
               <w:left w:w="60" w:type="dxa"/>
-              <w:bottom w:w="60" w:type="dxa"/>
+              <w:bottom w:w="45" w:type="dxa"/>
               <w:right w:w="60" w:type="dxa"/>
             </w:tcMar>
             <w:vAlign w:val="bottom"/>
@@ -1163,7 +1163,7 @@
             <w:sdt>
               <w:sdtPr>
                 <w:rPr>
-                  <w:rFonts w:ascii="Arial" w:hAnsi="Arial" w:cs="Arial"/>
+                  <w:rFonts w:ascii="Segoe UI" w:hAnsi="Segoe UI" w:cs="Segoe UI"/>
                   <w:color w:val="111111"/>
                   <w:sz w:val="19"/>
                   <w:szCs w:val="19"/>
@@ -1180,7 +1180,7 @@
               <w:sdtContent>
                 <w:r>
                   <w:rPr>
-                    <w:rFonts w:ascii="Arial" w:hAnsi="Arial" w:cs="Arial"/>
+                    <w:rFonts w:ascii="Segoe UI" w:hAnsi="Segoe UI" w:cs="Segoe UI"/>
                     <w:i/>
                     <w:iCs/>
                     <w:color w:val="AFAFAF"/>
@@ -1272,14 +1272,14 @@
     </w:tbl>
     <w:p>
       <w:pPr>
-        <w:spacing w:before="0" w:after="70" w:line="100" w:lineRule="exact"/>
+        <w:spacing w:before="0" w:after="50" w:line="75" w:lineRule="exact"/>
       </w:pPr>
       <w:r>
         <w:rPr>
           <w:rFonts w:ascii="Segoe UI" w:hAnsi="Segoe UI" w:cs="Segoe UI"/>
           <w:color w:val="33383D"/>
-          <w:sz w:val="8"/>
-          <w:szCs w:val="8"/>
+          <w:sz w:val="6"/>
+          <w:szCs w:val="6"/>
         </w:rPr>
       </w:r>
     </w:p>
@@ -1329,7 +1329,7 @@
             </w:pPr>
             <w:r>
               <w:rPr>
-                <w:rFonts w:ascii="Arial" w:hAnsi="Arial" w:cs="Arial"/>
+                <w:rFonts w:ascii="Segoe UI Semibold" w:hAnsi="Segoe UI Semibold" w:cs="Segoe UI Semibold"/>
                 <w:b/>
                 <w:bCs/>
                 <w:color w:val="FFFFFF"/>
@@ -1363,7 +1363,7 @@
             </w:pPr>
             <w:r>
               <w:rPr>
-                <w:rFonts w:ascii="Arial" w:hAnsi="Arial" w:cs="Arial"/>
+                <w:rFonts w:ascii="Segoe UI Semibold" w:hAnsi="Segoe UI Semibold" w:cs="Segoe UI Semibold"/>
                 <w:b/>
                 <w:bCs/>
                 <w:caps/>
@@ -1398,7 +1398,7 @@
             </w:pPr>
             <w:r>
               <w:rPr>
-                <w:rFonts w:ascii="Arial" w:hAnsi="Arial" w:cs="Arial"/>
+                <w:rFonts w:ascii="Segoe UI Semibold" w:hAnsi="Segoe UI Semibold" w:cs="Segoe UI Semibold"/>
                 <w:b/>
                 <w:bCs/>
                 <w:caps/>
@@ -1427,9 +1427,9 @@
             </w:tcBorders>
             <w:shd w:val="clear" w:color="auto" w:fill="FFFFFF"/>
             <w:tcMar>
-              <w:top w:w="245" w:type="dxa"/>
+              <w:top w:w="130" w:type="dxa"/>
               <w:left w:w="100" w:type="dxa"/>
-              <w:bottom w:w="245" w:type="dxa"/>
+              <w:bottom w:w="130" w:type="dxa"/>
               <w:right w:w="100" w:type="dxa"/>
             </w:tcMar>
             <w:vAlign w:val="center"/>
@@ -1441,7 +1441,7 @@
             </w:pPr>
             <w:r>
               <w:rPr>
-                <w:rFonts w:ascii="Arial" w:hAnsi="Arial" w:cs="Arial"/>
+                <w:rFonts w:ascii="Segoe UI Semibold" w:hAnsi="Segoe UI Semibold" w:cs="Segoe UI Semibold"/>
                 <w:b/>
                 <w:bCs/>
                 <w:color w:val="6E6E6E"/>
@@ -1462,9 +1462,9 @@
             </w:tcBorders>
             <w:shd w:val="clear" w:color="auto" w:fill="FFFFFF"/>
             <w:tcMar>
-              <w:top w:w="245" w:type="dxa"/>
+              <w:top w:w="130" w:type="dxa"/>
               <w:left w:w="200" w:type="dxa"/>
-              <w:bottom w:w="245" w:type="dxa"/>
+              <w:bottom w:w="130" w:type="dxa"/>
               <w:right w:w="200" w:type="dxa"/>
             </w:tcMar>
             <w:vAlign w:val="center"/>
@@ -1476,7 +1476,7 @@
             <w:sdt>
               <w:sdtPr>
                 <w:rPr>
-                  <w:rFonts w:ascii="Arial" w:hAnsi="Arial" w:cs="Arial"/>
+                  <w:rFonts w:ascii="Segoe UI" w:hAnsi="Segoe UI" w:cs="Segoe UI"/>
                   <w:color w:val="111111"/>
                   <w:sz w:val="19"/>
                   <w:szCs w:val="19"/>
@@ -1493,7 +1493,7 @@
               <w:sdtContent>
                 <w:r>
                   <w:rPr>
-                    <w:rFonts w:ascii="Arial" w:hAnsi="Arial" w:cs="Arial"/>
+                    <w:rFonts w:ascii="Segoe UI" w:hAnsi="Segoe UI" w:cs="Segoe UI"/>
                     <w:i/>
                     <w:iCs/>
                     <w:color w:val="AFAFAF"/>
@@ -1516,9 +1516,9 @@
             </w:tcBorders>
             <w:shd w:val="clear" w:color="auto" w:fill="FFFFFF"/>
             <w:tcMar>
-              <w:top w:w="245" w:type="dxa"/>
+              <w:top w:w="130" w:type="dxa"/>
               <w:left w:w="200" w:type="dxa"/>
-              <w:bottom w:w="245" w:type="dxa"/>
+              <w:bottom w:w="130" w:type="dxa"/>
               <w:right w:w="200" w:type="dxa"/>
             </w:tcMar>
             <w:vAlign w:val="center"/>
@@ -1531,7 +1531,7 @@
             <w:sdt>
               <w:sdtPr>
                 <w:rPr>
-                  <w:rFonts w:ascii="Arial" w:hAnsi="Arial" w:cs="Arial"/>
+                  <w:rFonts w:ascii="Segoe UI Semibold" w:hAnsi="Segoe UI Semibold" w:cs="Segoe UI Semibold"/>
                   <w:b/>
                   <w:bCs/>
                   <w:color w:val="111111"/>
@@ -1550,7 +1550,7 @@
               <w:sdtContent>
                 <w:r>
                   <w:rPr>
-                    <w:rFonts w:ascii="Arial" w:hAnsi="Arial" w:cs="Arial"/>
+                    <w:rFonts w:ascii="Segoe UI" w:hAnsi="Segoe UI" w:cs="Segoe UI"/>
                     <w:i/>
                     <w:iCs/>
                     <w:color w:val="AFAFAF"/>
@@ -1579,9 +1579,9 @@
             </w:tcBorders>
             <w:shd w:val="clear" w:color="auto" w:fill="FAFAFA"/>
             <w:tcMar>
-              <w:top w:w="245" w:type="dxa"/>
+              <w:top w:w="130" w:type="dxa"/>
               <w:left w:w="100" w:type="dxa"/>
-              <w:bottom w:w="245" w:type="dxa"/>
+              <w:bottom w:w="130" w:type="dxa"/>
               <w:right w:w="100" w:type="dxa"/>
             </w:tcMar>
             <w:vAlign w:val="center"/>
@@ -1593,7 +1593,7 @@
             </w:pPr>
             <w:r>
               <w:rPr>
-                <w:rFonts w:ascii="Arial" w:hAnsi="Arial" w:cs="Arial"/>
+                <w:rFonts w:ascii="Segoe UI Semibold" w:hAnsi="Segoe UI Semibold" w:cs="Segoe UI Semibold"/>
                 <w:b/>
                 <w:bCs/>
                 <w:color w:val="6E6E6E"/>
@@ -1614,9 +1614,9 @@
             </w:tcBorders>
             <w:shd w:val="clear" w:color="auto" w:fill="FAFAFA"/>
             <w:tcMar>
-              <w:top w:w="245" w:type="dxa"/>
+              <w:top w:w="130" w:type="dxa"/>
               <w:left w:w="200" w:type="dxa"/>
-              <w:bottom w:w="245" w:type="dxa"/>
+              <w:bottom w:w="130" w:type="dxa"/>
               <w:right w:w="200" w:type="dxa"/>
             </w:tcMar>
             <w:vAlign w:val="center"/>
@@ -1628,7 +1628,7 @@
             <w:sdt>
               <w:sdtPr>
                 <w:rPr>
-                  <w:rFonts w:ascii="Arial" w:hAnsi="Arial" w:cs="Arial"/>
+                  <w:rFonts w:ascii="Segoe UI" w:hAnsi="Segoe UI" w:cs="Segoe UI"/>
                   <w:color w:val="111111"/>
                   <w:sz w:val="19"/>
                   <w:szCs w:val="19"/>
@@ -1645,7 +1645,7 @@
               <w:sdtContent>
                 <w:r>
                   <w:rPr>
-                    <w:rFonts w:ascii="Arial" w:hAnsi="Arial" w:cs="Arial"/>
+                    <w:rFonts w:ascii="Segoe UI" w:hAnsi="Segoe UI" w:cs="Segoe UI"/>
                     <w:i/>
                     <w:iCs/>
                     <w:color w:val="AFAFAF"/>
@@ -1668,9 +1668,9 @@
             </w:tcBorders>
             <w:shd w:val="clear" w:color="auto" w:fill="FAFAFA"/>
             <w:tcMar>
-              <w:top w:w="245" w:type="dxa"/>
+              <w:top w:w="130" w:type="dxa"/>
               <w:left w:w="200" w:type="dxa"/>
-              <w:bottom w:w="245" w:type="dxa"/>
+              <w:bottom w:w="130" w:type="dxa"/>
               <w:right w:w="200" w:type="dxa"/>
             </w:tcMar>
             <w:vAlign w:val="center"/>
@@ -1683,7 +1683,7 @@
             <w:sdt>
               <w:sdtPr>
                 <w:rPr>
-                  <w:rFonts w:ascii="Arial" w:hAnsi="Arial" w:cs="Arial"/>
+                  <w:rFonts w:ascii="Segoe UI Semibold" w:hAnsi="Segoe UI Semibold" w:cs="Segoe UI Semibold"/>
                   <w:b/>
                   <w:bCs/>
                   <w:color w:val="111111"/>
@@ -1702,7 +1702,7 @@
               <w:sdtContent>
                 <w:r>
                   <w:rPr>
-                    <w:rFonts w:ascii="Arial" w:hAnsi="Arial" w:cs="Arial"/>
+                    <w:rFonts w:ascii="Segoe UI" w:hAnsi="Segoe UI" w:cs="Segoe UI"/>
                     <w:i/>
                     <w:iCs/>
                     <w:color w:val="AFAFAF"/>
@@ -1731,9 +1731,9 @@
             </w:tcBorders>
             <w:shd w:val="clear" w:color="auto" w:fill="FFFFFF"/>
             <w:tcMar>
-              <w:top w:w="245" w:type="dxa"/>
+              <w:top w:w="130" w:type="dxa"/>
               <w:left w:w="100" w:type="dxa"/>
-              <w:bottom w:w="245" w:type="dxa"/>
+              <w:bottom w:w="130" w:type="dxa"/>
               <w:right w:w="100" w:type="dxa"/>
             </w:tcMar>
             <w:vAlign w:val="center"/>
@@ -1745,7 +1745,7 @@
             </w:pPr>
             <w:r>
               <w:rPr>
-                <w:rFonts w:ascii="Arial" w:hAnsi="Arial" w:cs="Arial"/>
+                <w:rFonts w:ascii="Segoe UI Semibold" w:hAnsi="Segoe UI Semibold" w:cs="Segoe UI Semibold"/>
                 <w:b/>
                 <w:bCs/>
                 <w:color w:val="6E6E6E"/>
@@ -1766,9 +1766,9 @@
             </w:tcBorders>
             <w:shd w:val="clear" w:color="auto" w:fill="FFFFFF"/>
             <w:tcMar>
-              <w:top w:w="245" w:type="dxa"/>
+              <w:top w:w="130" w:type="dxa"/>
               <w:left w:w="200" w:type="dxa"/>
-              <w:bottom w:w="245" w:type="dxa"/>
+              <w:bottom w:w="130" w:type="dxa"/>
               <w:right w:w="200" w:type="dxa"/>
             </w:tcMar>
             <w:vAlign w:val="center"/>
@@ -1780,7 +1780,7 @@
             <w:sdt>
               <w:sdtPr>
                 <w:rPr>
-                  <w:rFonts w:ascii="Arial" w:hAnsi="Arial" w:cs="Arial"/>
+                  <w:rFonts w:ascii="Segoe UI" w:hAnsi="Segoe UI" w:cs="Segoe UI"/>
                   <w:color w:val="111111"/>
                   <w:sz w:val="19"/>
                   <w:szCs w:val="19"/>
@@ -1797,7 +1797,7 @@
               <w:sdtContent>
                 <w:r>
                   <w:rPr>
-                    <w:rFonts w:ascii="Arial" w:hAnsi="Arial" w:cs="Arial"/>
+                    <w:rFonts w:ascii="Segoe UI" w:hAnsi="Segoe UI" w:cs="Segoe UI"/>
                     <w:i/>
                     <w:iCs/>
                     <w:color w:val="AFAFAF"/>
@@ -1820,9 +1820,9 @@
             </w:tcBorders>
             <w:shd w:val="clear" w:color="auto" w:fill="FFFFFF"/>
             <w:tcMar>
-              <w:top w:w="245" w:type="dxa"/>
+              <w:top w:w="130" w:type="dxa"/>
               <w:left w:w="200" w:type="dxa"/>
-              <w:bottom w:w="245" w:type="dxa"/>
+              <w:bottom w:w="130" w:type="dxa"/>
               <w:right w:w="200" w:type="dxa"/>
             </w:tcMar>
             <w:vAlign w:val="center"/>
@@ -1835,7 +1835,7 @@
             <w:sdt>
               <w:sdtPr>
                 <w:rPr>
-                  <w:rFonts w:ascii="Arial" w:hAnsi="Arial" w:cs="Arial"/>
+                  <w:rFonts w:ascii="Segoe UI Semibold" w:hAnsi="Segoe UI Semibold" w:cs="Segoe UI Semibold"/>
                   <w:b/>
                   <w:bCs/>
                   <w:color w:val="111111"/>
@@ -1854,7 +1854,7 @@
               <w:sdtContent>
                 <w:r>
                   <w:rPr>
-                    <w:rFonts w:ascii="Arial" w:hAnsi="Arial" w:cs="Arial"/>
+                    <w:rFonts w:ascii="Segoe UI" w:hAnsi="Segoe UI" w:cs="Segoe UI"/>
                     <w:i/>
                     <w:iCs/>
                     <w:color w:val="AFAFAF"/>
@@ -1883,9 +1883,9 @@
             </w:tcBorders>
             <w:shd w:val="clear" w:color="auto" w:fill="FAFAFA"/>
             <w:tcMar>
-              <w:top w:w="245" w:type="dxa"/>
+              <w:top w:w="130" w:type="dxa"/>
               <w:left w:w="100" w:type="dxa"/>
-              <w:bottom w:w="245" w:type="dxa"/>
+              <w:bottom w:w="130" w:type="dxa"/>
               <w:right w:w="100" w:type="dxa"/>
             </w:tcMar>
             <w:vAlign w:val="center"/>
@@ -1897,7 +1897,7 @@
             </w:pPr>
             <w:r>
               <w:rPr>
-                <w:rFonts w:ascii="Arial" w:hAnsi="Arial" w:cs="Arial"/>
+                <w:rFonts w:ascii="Segoe UI Semibold" w:hAnsi="Segoe UI Semibold" w:cs="Segoe UI Semibold"/>
                 <w:b/>
                 <w:bCs/>
                 <w:color w:val="6E6E6E"/>
@@ -1918,9 +1918,9 @@
             </w:tcBorders>
             <w:shd w:val="clear" w:color="auto" w:fill="FAFAFA"/>
             <w:tcMar>
-              <w:top w:w="245" w:type="dxa"/>
+              <w:top w:w="130" w:type="dxa"/>
               <w:left w:w="200" w:type="dxa"/>
-              <w:bottom w:w="245" w:type="dxa"/>
+              <w:bottom w:w="130" w:type="dxa"/>
               <w:right w:w="200" w:type="dxa"/>
             </w:tcMar>
             <w:vAlign w:val="center"/>
@@ -1932,7 +1932,7 @@
             <w:sdt>
               <w:sdtPr>
                 <w:rPr>
-                  <w:rFonts w:ascii="Arial" w:hAnsi="Arial" w:cs="Arial"/>
+                  <w:rFonts w:ascii="Segoe UI" w:hAnsi="Segoe UI" w:cs="Segoe UI"/>
                   <w:color w:val="111111"/>
                   <w:sz w:val="19"/>
                   <w:szCs w:val="19"/>
@@ -1949,7 +1949,7 @@
               <w:sdtContent>
                 <w:r>
                   <w:rPr>
-                    <w:rFonts w:ascii="Arial" w:hAnsi="Arial" w:cs="Arial"/>
+                    <w:rFonts w:ascii="Segoe UI" w:hAnsi="Segoe UI" w:cs="Segoe UI"/>
                     <w:i/>
                     <w:iCs/>
                     <w:color w:val="AFAFAF"/>
@@ -1972,9 +1972,9 @@
             </w:tcBorders>
             <w:shd w:val="clear" w:color="auto" w:fill="FAFAFA"/>
             <w:tcMar>
-              <w:top w:w="245" w:type="dxa"/>
+              <w:top w:w="130" w:type="dxa"/>
               <w:left w:w="200" w:type="dxa"/>
-              <w:bottom w:w="245" w:type="dxa"/>
+              <w:bottom w:w="130" w:type="dxa"/>
               <w:right w:w="200" w:type="dxa"/>
             </w:tcMar>
             <w:vAlign w:val="center"/>
@@ -1987,7 +1987,7 @@
             <w:sdt>
               <w:sdtPr>
                 <w:rPr>
-                  <w:rFonts w:ascii="Arial" w:hAnsi="Arial" w:cs="Arial"/>
+                  <w:rFonts w:ascii="Segoe UI Semibold" w:hAnsi="Segoe UI Semibold" w:cs="Segoe UI Semibold"/>
                   <w:b/>
                   <w:bCs/>
                   <w:color w:val="111111"/>
@@ -2006,7 +2006,7 @@
               <w:sdtContent>
                 <w:r>
                   <w:rPr>
-                    <w:rFonts w:ascii="Arial" w:hAnsi="Arial" w:cs="Arial"/>
+                    <w:rFonts w:ascii="Segoe UI" w:hAnsi="Segoe UI" w:cs="Segoe UI"/>
                     <w:i/>
                     <w:iCs/>
                     <w:color w:val="AFAFAF"/>
@@ -2035,9 +2035,9 @@
             </w:tcBorders>
             <w:shd w:val="clear" w:color="auto" w:fill="FFFFFF"/>
             <w:tcMar>
-              <w:top w:w="245" w:type="dxa"/>
+              <w:top w:w="130" w:type="dxa"/>
               <w:left w:w="100" w:type="dxa"/>
-              <w:bottom w:w="245" w:type="dxa"/>
+              <w:bottom w:w="130" w:type="dxa"/>
               <w:right w:w="100" w:type="dxa"/>
             </w:tcMar>
             <w:vAlign w:val="center"/>
@@ -2049,7 +2049,7 @@
             </w:pPr>
             <w:r>
               <w:rPr>
-                <w:rFonts w:ascii="Arial" w:hAnsi="Arial" w:cs="Arial"/>
+                <w:rFonts w:ascii="Segoe UI Semibold" w:hAnsi="Segoe UI Semibold" w:cs="Segoe UI Semibold"/>
                 <w:b/>
                 <w:bCs/>
                 <w:color w:val="6E6E6E"/>
@@ -2070,9 +2070,9 @@
             </w:tcBorders>
             <w:shd w:val="clear" w:color="auto" w:fill="FFFFFF"/>
             <w:tcMar>
-              <w:top w:w="245" w:type="dxa"/>
+              <w:top w:w="130" w:type="dxa"/>
               <w:left w:w="200" w:type="dxa"/>
-              <w:bottom w:w="245" w:type="dxa"/>
+              <w:bottom w:w="130" w:type="dxa"/>
               <w:right w:w="200" w:type="dxa"/>
             </w:tcMar>
             <w:vAlign w:val="center"/>
@@ -2084,7 +2084,7 @@
             <w:sdt>
               <w:sdtPr>
                 <w:rPr>
-                  <w:rFonts w:ascii="Arial" w:hAnsi="Arial" w:cs="Arial"/>
+                  <w:rFonts w:ascii="Segoe UI" w:hAnsi="Segoe UI" w:cs="Segoe UI"/>
                   <w:color w:val="111111"/>
                   <w:sz w:val="19"/>
                   <w:szCs w:val="19"/>
@@ -2101,7 +2101,7 @@
               <w:sdtContent>
                 <w:r>
                   <w:rPr>
-                    <w:rFonts w:ascii="Arial" w:hAnsi="Arial" w:cs="Arial"/>
+                    <w:rFonts w:ascii="Segoe UI" w:hAnsi="Segoe UI" w:cs="Segoe UI"/>
                     <w:i/>
                     <w:iCs/>
                     <w:color w:val="AFAFAF"/>
@@ -2124,9 +2124,9 @@
             </w:tcBorders>
             <w:shd w:val="clear" w:color="auto" w:fill="FFFFFF"/>
             <w:tcMar>
-              <w:top w:w="245" w:type="dxa"/>
+              <w:top w:w="130" w:type="dxa"/>
               <w:left w:w="200" w:type="dxa"/>
-              <w:bottom w:w="245" w:type="dxa"/>
+              <w:bottom w:w="130" w:type="dxa"/>
               <w:right w:w="200" w:type="dxa"/>
             </w:tcMar>
             <w:vAlign w:val="center"/>
@@ -2139,7 +2139,7 @@
             <w:sdt>
               <w:sdtPr>
                 <w:rPr>
-                  <w:rFonts w:ascii="Arial" w:hAnsi="Arial" w:cs="Arial"/>
+                  <w:rFonts w:ascii="Segoe UI Semibold" w:hAnsi="Segoe UI Semibold" w:cs="Segoe UI Semibold"/>
                   <w:b/>
                   <w:bCs/>
                   <w:color w:val="111111"/>
@@ -2158,7 +2158,7 @@
               <w:sdtContent>
                 <w:r>
                   <w:rPr>
-                    <w:rFonts w:ascii="Arial" w:hAnsi="Arial" w:cs="Arial"/>
+                    <w:rFonts w:ascii="Segoe UI" w:hAnsi="Segoe UI" w:cs="Segoe UI"/>
                     <w:i/>
                     <w:iCs/>
                     <w:color w:val="AFAFAF"/>
@@ -2175,14 +2175,14 @@
     </w:tbl>
     <w:p>
       <w:pPr>
-        <w:spacing w:before="0" w:after="70" w:line="100" w:lineRule="exact"/>
+        <w:spacing w:before="0" w:after="50" w:line="75" w:lineRule="exact"/>
       </w:pPr>
       <w:r>
         <w:rPr>
           <w:rFonts w:ascii="Segoe UI" w:hAnsi="Segoe UI" w:cs="Segoe UI"/>
           <w:color w:val="33383D"/>
-          <w:sz w:val="8"/>
-          <w:szCs w:val="8"/>
+          <w:sz w:val="6"/>
+          <w:szCs w:val="6"/>
         </w:rPr>
       </w:r>
     </w:p>
@@ -2223,7 +2223,7 @@
             </w:pPr>
             <w:r>
               <w:rPr>
-                <w:rFonts w:ascii="Arial" w:hAnsi="Arial" w:cs="Arial"/>
+                <w:rFonts w:ascii="Segoe UI Semibold" w:hAnsi="Segoe UI Semibold" w:cs="Segoe UI Semibold"/>
                 <w:b/>
                 <w:bCs/>
                 <w:caps/>
@@ -2240,12 +2240,12 @@
               <w:pBdr>
                 <w:bottom w:val="single" w:sz="6" w:space="4" w:color="C9C9C9"/>
               </w:pBdr>
-              <w:spacing w:before="50" w:after="120" w:line="239" w:lineRule="exact"/>
+              <w:spacing w:before="35" w:after="85" w:line="239" w:lineRule="exact"/>
             </w:pPr>
             <w:sdt>
               <w:sdtPr>
                 <w:rPr>
-                  <w:rFonts w:ascii="Arial" w:hAnsi="Arial" w:cs="Arial"/>
+                  <w:rFonts w:ascii="Segoe UI" w:hAnsi="Segoe UI" w:cs="Segoe UI"/>
                   <w:color w:val="111111"/>
                   <w:sz w:val="19"/>
                   <w:szCs w:val="19"/>
@@ -2262,7 +2262,7 @@
               <w:sdtContent>
                 <w:r>
                   <w:rPr>
-                    <w:rFonts w:ascii="Arial" w:hAnsi="Arial" w:cs="Arial"/>
+                    <w:rFonts w:ascii="Segoe UI" w:hAnsi="Segoe UI" w:cs="Segoe UI"/>
                     <w:i/>
                     <w:iCs/>
                     <w:color w:val="AFAFAF"/>
@@ -2280,7 +2280,7 @@
             </w:pPr>
             <w:r>
               <w:rPr>
-                <w:rFonts w:ascii="Arial" w:hAnsi="Arial" w:cs="Arial"/>
+                <w:rFonts w:ascii="Segoe UI Semibold" w:hAnsi="Segoe UI Semibold" w:cs="Segoe UI Semibold"/>
                 <w:b/>
                 <w:bCs/>
                 <w:caps/>
@@ -2297,12 +2297,12 @@
               <w:pBdr>
                 <w:bottom w:val="single" w:sz="6" w:space="4" w:color="C9C9C9"/>
               </w:pBdr>
-              <w:spacing w:before="50" w:after="120" w:line="239" w:lineRule="exact"/>
+              <w:spacing w:before="35" w:after="85" w:line="239" w:lineRule="exact"/>
             </w:pPr>
             <w:sdt>
               <w:sdtPr>
                 <w:rPr>
-                  <w:rFonts w:ascii="Arial" w:hAnsi="Arial" w:cs="Arial"/>
+                  <w:rFonts w:ascii="Segoe UI" w:hAnsi="Segoe UI" w:cs="Segoe UI"/>
                   <w:color w:val="111111"/>
                   <w:sz w:val="19"/>
                   <w:szCs w:val="19"/>
@@ -2319,7 +2319,7 @@
               <w:sdtContent>
                 <w:r>
                   <w:rPr>
-                    <w:rFonts w:ascii="Arial" w:hAnsi="Arial" w:cs="Arial"/>
+                    <w:rFonts w:ascii="Segoe UI" w:hAnsi="Segoe UI" w:cs="Segoe UI"/>
                     <w:i/>
                     <w:iCs/>
                     <w:color w:val="AFAFAF"/>
@@ -2336,12 +2336,12 @@
               <w:pBdr>
                 <w:bottom w:val="single" w:sz="6" w:space="4" w:color="C9C9C9"/>
               </w:pBdr>
-              <w:spacing w:before="50" w:after="120" w:line="239" w:lineRule="exact"/>
+              <w:spacing w:before="35" w:after="85" w:line="239" w:lineRule="exact"/>
             </w:pPr>
             <w:sdt>
               <w:sdtPr>
                 <w:rPr>
-                  <w:rFonts w:ascii="Arial" w:hAnsi="Arial" w:cs="Arial"/>
+                  <w:rFonts w:ascii="Segoe UI" w:hAnsi="Segoe UI" w:cs="Segoe UI"/>
                   <w:color w:val="111111"/>
                   <w:sz w:val="19"/>
                   <w:szCs w:val="19"/>
@@ -2358,7 +2358,7 @@
               <w:sdtContent>
                 <w:r>
                   <w:rPr>
-                    <w:rFonts w:ascii="Arial" w:hAnsi="Arial" w:cs="Arial"/>
+                    <w:rFonts w:ascii="Segoe UI" w:hAnsi="Segoe UI" w:cs="Segoe UI"/>
                     <w:i/>
                     <w:iCs/>
                     <w:color w:val="AFAFAF"/>
@@ -2424,7 +2424,7 @@
                   </w:pPr>
                   <w:r>
                     <w:rPr>
-                      <w:rFonts w:ascii="Arial" w:hAnsi="Arial" w:cs="Arial"/>
+                      <w:rFonts w:ascii="Segoe UI Semibold" w:hAnsi="Segoe UI Semibold" w:cs="Segoe UI Semibold"/>
                       <w:b/>
                       <w:bCs/>
                       <w:caps/>
@@ -2460,7 +2460,7 @@
                   <w:sdt>
                     <w:sdtPr>
                       <w:rPr>
-                        <w:rFonts w:ascii="Arial" w:hAnsi="Arial" w:cs="Arial"/>
+                        <w:rFonts w:ascii="Segoe UI Semibold" w:hAnsi="Segoe UI Semibold" w:cs="Segoe UI Semibold"/>
                         <w:b/>
                         <w:bCs/>
                         <w:color w:val="FFFFFF"/>
@@ -2479,7 +2479,7 @@
                     <w:sdtContent>
                       <w:r>
                         <w:rPr>
-                          <w:rFonts w:ascii="Arial" w:hAnsi="Arial" w:cs="Arial"/>
+                          <w:rFonts w:ascii="Segoe UI" w:hAnsi="Segoe UI" w:cs="Segoe UI"/>
                           <w:i/>
                           <w:iCs/>
                           <w:color w:val="F3C9C9"/>
@@ -2561,7 +2561,7 @@
             </w:pPr>
             <w:r>
               <w:rPr>
-                <w:rFonts w:ascii="Arial" w:hAnsi="Arial" w:cs="Arial"/>
+                <w:rFonts w:ascii="Segoe UI Semibold" w:hAnsi="Segoe UI Semibold" w:cs="Segoe UI Semibold"/>
                 <w:b/>
                 <w:bCs/>
                 <w:caps/>
@@ -2608,50 +2608,50 @@
       <w:tr>
         <w:trPr>
           <w:cantSplit/>
-          <w:trHeight w:val="250" w:hRule="atLeast"/>
+          <w:trHeight w:val="210" w:hRule="atLeast"/>
         </w:trPr>
         <w:tc>
           <w:tcPr>
             <w:tcW w:w="5184" w:type="dxa"/>
             <w:tcMar>
-              <w:top w:w="40" w:type="dxa"/>
+              <w:top w:w="30" w:type="dxa"/>
               <w:left w:w="90" w:type="dxa"/>
-              <w:bottom w:w="40" w:type="dxa"/>
+              <w:bottom w:w="30" w:type="dxa"/>
               <w:right w:w="160" w:type="dxa"/>
             </w:tcMar>
             <w:vAlign w:val="top"/>
           </w:tcPr>
           <w:p>
             <w:pPr>
-              <w:spacing w:before="0" w:after="0" w:line="220" w:lineRule="auto"/>
-              <w:ind w:left="250" w:hanging="250"/>
-            </w:pPr>
-            <w:r>
-              <w:rPr>
-                <w:rFonts w:ascii="Arial" w:hAnsi="Arial" w:cs="Arial"/>
+              <w:spacing w:before="0" w:after="0" w:line="151" w:lineRule="exact"/>
+              <w:ind w:left="230" w:hanging="230"/>
+            </w:pPr>
+            <w:r>
+              <w:rPr>
+                <w:rFonts w:ascii="Segoe UI" w:hAnsi="Segoe UI" w:cs="Segoe UI"/>
                 <w:b/>
                 <w:bCs/>
                 <w:color w:val="C21112"/>
-                <w:sz w:val="13"/>
-                <w:szCs w:val="13"/>
+                <w:sz w:val="12"/>
+                <w:szCs w:val="12"/>
               </w:rPr>
               <w:t xml:space="preserve">▪</w:t>
             </w:r>
             <w:r>
               <w:rPr>
-                <w:rFonts w:ascii="Arial" w:hAnsi="Arial" w:cs="Arial"/>
+                <w:rFonts w:ascii="Segoe UI" w:hAnsi="Segoe UI" w:cs="Segoe UI"/>
                 <w:color w:val="33383D"/>
-                <w:sz w:val="13"/>
-                <w:szCs w:val="13"/>
+                <w:sz w:val="12"/>
+                <w:szCs w:val="12"/>
               </w:rPr>
               <w:t xml:space="preserve">  </w:t>
             </w:r>
             <w:r>
               <w:rPr>
-                <w:rFonts w:ascii="Arial" w:hAnsi="Arial" w:cs="Arial"/>
+                <w:rFonts w:ascii="Segoe UI" w:hAnsi="Segoe UI" w:cs="Segoe UI"/>
                 <w:color w:val="6E6E6E"/>
-                <w:sz w:val="13"/>
-                <w:szCs w:val="13"/>
+                <w:sz w:val="12"/>
+                <w:szCs w:val="12"/>
               </w:rPr>
               <w:t xml:space="preserve">Vigencia de la cotización: 15 días naturales a partir de la fecha de emisión.</w:t>
             </w:r>
@@ -2661,44 +2661,44 @@
           <w:tcPr>
             <w:tcW w:w="5184" w:type="dxa"/>
             <w:tcMar>
-              <w:top w:w="40" w:type="dxa"/>
+              <w:top w:w="30" w:type="dxa"/>
               <w:left w:w="200" w:type="dxa"/>
-              <w:bottom w:w="40" w:type="dxa"/>
+              <w:bottom w:w="30" w:type="dxa"/>
               <w:right w:w="160" w:type="dxa"/>
             </w:tcMar>
             <w:vAlign w:val="top"/>
           </w:tcPr>
           <w:p>
             <w:pPr>
-              <w:spacing w:before="0" w:after="0" w:line="220" w:lineRule="auto"/>
-              <w:ind w:left="250" w:hanging="250"/>
-            </w:pPr>
-            <w:r>
-              <w:rPr>
-                <w:rFonts w:ascii="Arial" w:hAnsi="Arial" w:cs="Arial"/>
+              <w:spacing w:before="0" w:after="0" w:line="151" w:lineRule="exact"/>
+              <w:ind w:left="230" w:hanging="230"/>
+            </w:pPr>
+            <w:r>
+              <w:rPr>
+                <w:rFonts w:ascii="Segoe UI" w:hAnsi="Segoe UI" w:cs="Segoe UI"/>
                 <w:b/>
                 <w:bCs/>
                 <w:color w:val="C21112"/>
-                <w:sz w:val="13"/>
-                <w:szCs w:val="13"/>
+                <w:sz w:val="12"/>
+                <w:szCs w:val="12"/>
               </w:rPr>
               <w:t xml:space="preserve">▪</w:t>
             </w:r>
             <w:r>
               <w:rPr>
-                <w:rFonts w:ascii="Arial" w:hAnsi="Arial" w:cs="Arial"/>
+                <w:rFonts w:ascii="Segoe UI" w:hAnsi="Segoe UI" w:cs="Segoe UI"/>
                 <w:color w:val="33383D"/>
-                <w:sz w:val="13"/>
-                <w:szCs w:val="13"/>
+                <w:sz w:val="12"/>
+                <w:szCs w:val="12"/>
               </w:rPr>
               <w:t xml:space="preserve">  </w:t>
             </w:r>
             <w:r>
               <w:rPr>
-                <w:rFonts w:ascii="Arial" w:hAnsi="Arial" w:cs="Arial"/>
+                <w:rFonts w:ascii="Segoe UI" w:hAnsi="Segoe UI" w:cs="Segoe UI"/>
                 <w:color w:val="6E6E6E"/>
-                <w:sz w:val="13"/>
-                <w:szCs w:val="13"/>
+                <w:sz w:val="12"/>
+                <w:szCs w:val="12"/>
               </w:rPr>
               <w:t xml:space="preserve">Maniobras de carga y descarga por cuenta del cliente.</w:t>
             </w:r>
@@ -2708,50 +2708,50 @@
       <w:tr>
         <w:trPr>
           <w:cantSplit/>
-          <w:trHeight w:val="250" w:hRule="atLeast"/>
+          <w:trHeight w:val="210" w:hRule="atLeast"/>
         </w:trPr>
         <w:tc>
           <w:tcPr>
             <w:tcW w:w="5184" w:type="dxa"/>
             <w:tcMar>
-              <w:top w:w="40" w:type="dxa"/>
+              <w:top w:w="30" w:type="dxa"/>
               <w:left w:w="90" w:type="dxa"/>
-              <w:bottom w:w="40" w:type="dxa"/>
+              <w:bottom w:w="30" w:type="dxa"/>
               <w:right w:w="160" w:type="dxa"/>
             </w:tcMar>
             <w:vAlign w:val="top"/>
           </w:tcPr>
           <w:p>
             <w:pPr>
-              <w:spacing w:before="0" w:after="0" w:line="220" w:lineRule="auto"/>
-              <w:ind w:left="250" w:hanging="250"/>
-            </w:pPr>
-            <w:r>
-              <w:rPr>
-                <w:rFonts w:ascii="Arial" w:hAnsi="Arial" w:cs="Arial"/>
+              <w:spacing w:before="0" w:after="0" w:line="151" w:lineRule="exact"/>
+              <w:ind w:left="230" w:hanging="230"/>
+            </w:pPr>
+            <w:r>
+              <w:rPr>
+                <w:rFonts w:ascii="Segoe UI" w:hAnsi="Segoe UI" w:cs="Segoe UI"/>
                 <w:b/>
                 <w:bCs/>
                 <w:color w:val="C21112"/>
-                <w:sz w:val="13"/>
-                <w:szCs w:val="13"/>
+                <w:sz w:val="12"/>
+                <w:szCs w:val="12"/>
               </w:rPr>
               <w:t xml:space="preserve">▪</w:t>
             </w:r>
             <w:r>
               <w:rPr>
-                <w:rFonts w:ascii="Arial" w:hAnsi="Arial" w:cs="Arial"/>
+                <w:rFonts w:ascii="Segoe UI" w:hAnsi="Segoe UI" w:cs="Segoe UI"/>
                 <w:color w:val="33383D"/>
-                <w:sz w:val="13"/>
-                <w:szCs w:val="13"/>
+                <w:sz w:val="12"/>
+                <w:szCs w:val="12"/>
               </w:rPr>
               <w:t xml:space="preserve">  </w:t>
             </w:r>
             <w:r>
               <w:rPr>
-                <w:rFonts w:ascii="Arial" w:hAnsi="Arial" w:cs="Arial"/>
+                <w:rFonts w:ascii="Segoe UI" w:hAnsi="Segoe UI" w:cs="Segoe UI"/>
                 <w:color w:val="6E6E6E"/>
-                <w:sz w:val="13"/>
-                <w:szCs w:val="13"/>
+                <w:sz w:val="12"/>
+                <w:szCs w:val="12"/>
               </w:rPr>
               <w:t xml:space="preserve">Tarifas en pesos mexicanos (MXN); no incluyen I.V.A. ni retenciones.</w:t>
             </w:r>
@@ -2761,44 +2761,44 @@
           <w:tcPr>
             <w:tcW w:w="5184" w:type="dxa"/>
             <w:tcMar>
-              <w:top w:w="40" w:type="dxa"/>
+              <w:top w:w="30" w:type="dxa"/>
               <w:left w:w="200" w:type="dxa"/>
-              <w:bottom w:w="40" w:type="dxa"/>
+              <w:bottom w:w="30" w:type="dxa"/>
               <w:right w:w="160" w:type="dxa"/>
             </w:tcMar>
             <w:vAlign w:val="top"/>
           </w:tcPr>
           <w:p>
             <w:pPr>
-              <w:spacing w:before="0" w:after="0" w:line="220" w:lineRule="auto"/>
-              <w:ind w:left="250" w:hanging="250"/>
-            </w:pPr>
-            <w:r>
-              <w:rPr>
-                <w:rFonts w:ascii="Arial" w:hAnsi="Arial" w:cs="Arial"/>
+              <w:spacing w:before="0" w:after="0" w:line="151" w:lineRule="exact"/>
+              <w:ind w:left="230" w:hanging="230"/>
+            </w:pPr>
+            <w:r>
+              <w:rPr>
+                <w:rFonts w:ascii="Segoe UI" w:hAnsi="Segoe UI" w:cs="Segoe UI"/>
                 <w:b/>
                 <w:bCs/>
                 <w:color w:val="C21112"/>
-                <w:sz w:val="13"/>
-                <w:szCs w:val="13"/>
+                <w:sz w:val="12"/>
+                <w:szCs w:val="12"/>
               </w:rPr>
               <w:t xml:space="preserve">▪</w:t>
             </w:r>
             <w:r>
               <w:rPr>
-                <w:rFonts w:ascii="Arial" w:hAnsi="Arial" w:cs="Arial"/>
+                <w:rFonts w:ascii="Segoe UI" w:hAnsi="Segoe UI" w:cs="Segoe UI"/>
                 <w:color w:val="33383D"/>
-                <w:sz w:val="13"/>
-                <w:szCs w:val="13"/>
+                <w:sz w:val="12"/>
+                <w:szCs w:val="12"/>
               </w:rPr>
               <w:t xml:space="preserve">  </w:t>
             </w:r>
             <w:r>
               <w:rPr>
-                <w:rFonts w:ascii="Arial" w:hAnsi="Arial" w:cs="Arial"/>
+                <w:rFonts w:ascii="Segoe UI" w:hAnsi="Segoe UI" w:cs="Segoe UI"/>
                 <w:color w:val="6E6E6E"/>
-                <w:sz w:val="13"/>
-                <w:szCs w:val="13"/>
+                <w:sz w:val="12"/>
+                <w:szCs w:val="12"/>
               </w:rPr>
               <w:t xml:space="preserve">Seguro de mercancía sujeto a cobertura contratada; excedente cotizable.</w:t>
             </w:r>
@@ -2808,50 +2808,50 @@
       <w:tr>
         <w:trPr>
           <w:cantSplit/>
-          <w:trHeight w:val="250" w:hRule="atLeast"/>
+          <w:trHeight w:val="210" w:hRule="atLeast"/>
         </w:trPr>
         <w:tc>
           <w:tcPr>
             <w:tcW w:w="5184" w:type="dxa"/>
             <w:tcMar>
-              <w:top w:w="40" w:type="dxa"/>
+              <w:top w:w="30" w:type="dxa"/>
               <w:left w:w="90" w:type="dxa"/>
-              <w:bottom w:w="40" w:type="dxa"/>
+              <w:bottom w:w="30" w:type="dxa"/>
               <w:right w:w="160" w:type="dxa"/>
             </w:tcMar>
             <w:vAlign w:val="top"/>
           </w:tcPr>
           <w:p>
             <w:pPr>
-              <w:spacing w:before="0" w:after="0" w:line="220" w:lineRule="auto"/>
-              <w:ind w:left="250" w:hanging="250"/>
-            </w:pPr>
-            <w:r>
-              <w:rPr>
-                <w:rFonts w:ascii="Arial" w:hAnsi="Arial" w:cs="Arial"/>
+              <w:spacing w:before="0" w:after="0" w:line="151" w:lineRule="exact"/>
+              <w:ind w:left="230" w:hanging="230"/>
+            </w:pPr>
+            <w:r>
+              <w:rPr>
+                <w:rFonts w:ascii="Segoe UI" w:hAnsi="Segoe UI" w:cs="Segoe UI"/>
                 <w:b/>
                 <w:bCs/>
                 <w:color w:val="C21112"/>
-                <w:sz w:val="13"/>
-                <w:szCs w:val="13"/>
+                <w:sz w:val="12"/>
+                <w:szCs w:val="12"/>
               </w:rPr>
               <w:t xml:space="preserve">▪</w:t>
             </w:r>
             <w:r>
               <w:rPr>
-                <w:rFonts w:ascii="Arial" w:hAnsi="Arial" w:cs="Arial"/>
+                <w:rFonts w:ascii="Segoe UI" w:hAnsi="Segoe UI" w:cs="Segoe UI"/>
                 <w:color w:val="33383D"/>
-                <w:sz w:val="13"/>
-                <w:szCs w:val="13"/>
+                <w:sz w:val="12"/>
+                <w:szCs w:val="12"/>
               </w:rPr>
               <w:t xml:space="preserve">  </w:t>
             </w:r>
             <w:r>
               <w:rPr>
-                <w:rFonts w:ascii="Arial" w:hAnsi="Arial" w:cs="Arial"/>
+                <w:rFonts w:ascii="Segoe UI" w:hAnsi="Segoe UI" w:cs="Segoe UI"/>
                 <w:color w:val="6E6E6E"/>
-                <w:sz w:val="13"/>
-                <w:szCs w:val="13"/>
+                <w:sz w:val="12"/>
+                <w:szCs w:val="12"/>
               </w:rPr>
               <w:t xml:space="preserve">Incluye operador, combustible y casetas en la ruta cotizada.</w:t>
             </w:r>
@@ -2861,44 +2861,44 @@
           <w:tcPr>
             <w:tcW w:w="5184" w:type="dxa"/>
             <w:tcMar>
-              <w:top w:w="40" w:type="dxa"/>
+              <w:top w:w="30" w:type="dxa"/>
               <w:left w:w="200" w:type="dxa"/>
-              <w:bottom w:w="40" w:type="dxa"/>
+              <w:bottom w:w="30" w:type="dxa"/>
               <w:right w:w="160" w:type="dxa"/>
             </w:tcMar>
             <w:vAlign w:val="top"/>
           </w:tcPr>
           <w:p>
             <w:pPr>
-              <w:spacing w:before="0" w:after="0" w:line="220" w:lineRule="auto"/>
-              <w:ind w:left="250" w:hanging="250"/>
-            </w:pPr>
-            <w:r>
-              <w:rPr>
-                <w:rFonts w:ascii="Arial" w:hAnsi="Arial" w:cs="Arial"/>
+              <w:spacing w:before="0" w:after="0" w:line="151" w:lineRule="exact"/>
+              <w:ind w:left="230" w:hanging="230"/>
+            </w:pPr>
+            <w:r>
+              <w:rPr>
+                <w:rFonts w:ascii="Segoe UI" w:hAnsi="Segoe UI" w:cs="Segoe UI"/>
                 <w:b/>
                 <w:bCs/>
                 <w:color w:val="C21112"/>
-                <w:sz w:val="13"/>
-                <w:szCs w:val="13"/>
+                <w:sz w:val="12"/>
+                <w:szCs w:val="12"/>
               </w:rPr>
               <w:t xml:space="preserve">▪</w:t>
             </w:r>
             <w:r>
               <w:rPr>
-                <w:rFonts w:ascii="Arial" w:hAnsi="Arial" w:cs="Arial"/>
+                <w:rFonts w:ascii="Segoe UI" w:hAnsi="Segoe UI" w:cs="Segoe UI"/>
                 <w:color w:val="33383D"/>
-                <w:sz w:val="13"/>
-                <w:szCs w:val="13"/>
+                <w:sz w:val="12"/>
+                <w:szCs w:val="12"/>
               </w:rPr>
               <w:t xml:space="preserve">  </w:t>
             </w:r>
             <w:r>
               <w:rPr>
-                <w:rFonts w:ascii="Arial" w:hAnsi="Arial" w:cs="Arial"/>
+                <w:rFonts w:ascii="Segoe UI" w:hAnsi="Segoe UI" w:cs="Segoe UI"/>
                 <w:color w:val="6E6E6E"/>
-                <w:sz w:val="13"/>
-                <w:szCs w:val="13"/>
+                <w:sz w:val="12"/>
+                <w:szCs w:val="12"/>
               </w:rPr>
               <w:t xml:space="preserve">Falso flete: 50% de la tarifa si la cancelación es con menos de 12 horas.</w:t>
             </w:r>
@@ -2908,50 +2908,50 @@
       <w:tr>
         <w:trPr>
           <w:cantSplit/>
-          <w:trHeight w:val="250" w:hRule="atLeast"/>
+          <w:trHeight w:val="210" w:hRule="atLeast"/>
         </w:trPr>
         <w:tc>
           <w:tcPr>
             <w:tcW w:w="5184" w:type="dxa"/>
             <w:tcMar>
-              <w:top w:w="40" w:type="dxa"/>
+              <w:top w:w="30" w:type="dxa"/>
               <w:left w:w="90" w:type="dxa"/>
-              <w:bottom w:w="40" w:type="dxa"/>
+              <w:bottom w:w="30" w:type="dxa"/>
               <w:right w:w="160" w:type="dxa"/>
             </w:tcMar>
             <w:vAlign w:val="top"/>
           </w:tcPr>
           <w:p>
             <w:pPr>
-              <w:spacing w:before="0" w:after="0" w:line="220" w:lineRule="auto"/>
-              <w:ind w:left="250" w:hanging="250"/>
-            </w:pPr>
-            <w:r>
-              <w:rPr>
-                <w:rFonts w:ascii="Arial" w:hAnsi="Arial" w:cs="Arial"/>
+              <w:spacing w:before="0" w:after="0" w:line="151" w:lineRule="exact"/>
+              <w:ind w:left="230" w:hanging="230"/>
+            </w:pPr>
+            <w:r>
+              <w:rPr>
+                <w:rFonts w:ascii="Segoe UI" w:hAnsi="Segoe UI" w:cs="Segoe UI"/>
                 <w:b/>
                 <w:bCs/>
                 <w:color w:val="C21112"/>
-                <w:sz w:val="13"/>
-                <w:szCs w:val="13"/>
+                <w:sz w:val="12"/>
+                <w:szCs w:val="12"/>
               </w:rPr>
               <w:t xml:space="preserve">▪</w:t>
             </w:r>
             <w:r>
               <w:rPr>
-                <w:rFonts w:ascii="Arial" w:hAnsi="Arial" w:cs="Arial"/>
+                <w:rFonts w:ascii="Segoe UI" w:hAnsi="Segoe UI" w:cs="Segoe UI"/>
                 <w:color w:val="33383D"/>
-                <w:sz w:val="13"/>
-                <w:szCs w:val="13"/>
+                <w:sz w:val="12"/>
+                <w:szCs w:val="12"/>
               </w:rPr>
               <w:t xml:space="preserve">  </w:t>
             </w:r>
             <w:r>
               <w:rPr>
-                <w:rFonts w:ascii="Arial" w:hAnsi="Arial" w:cs="Arial"/>
+                <w:rFonts w:ascii="Segoe UI" w:hAnsi="Segoe UI" w:cs="Segoe UI"/>
                 <w:color w:val="6E6E6E"/>
-                <w:sz w:val="13"/>
-                <w:szCs w:val="13"/>
+                <w:sz w:val="12"/>
+                <w:szCs w:val="12"/>
               </w:rPr>
               <w:t xml:space="preserve">Tiempo libre de carga y descarga: 6 horas por maniobra.</w:t>
             </w:r>
@@ -2961,44 +2961,44 @@
           <w:tcPr>
             <w:tcW w:w="5184" w:type="dxa"/>
             <w:tcMar>
-              <w:top w:w="40" w:type="dxa"/>
+              <w:top w:w="30" w:type="dxa"/>
               <w:left w:w="200" w:type="dxa"/>
-              <w:bottom w:w="40" w:type="dxa"/>
+              <w:bottom w:w="30" w:type="dxa"/>
               <w:right w:w="160" w:type="dxa"/>
             </w:tcMar>
             <w:vAlign w:val="top"/>
           </w:tcPr>
           <w:p>
             <w:pPr>
-              <w:spacing w:before="0" w:after="0" w:line="220" w:lineRule="auto"/>
-              <w:ind w:left="250" w:hanging="250"/>
-            </w:pPr>
-            <w:r>
-              <w:rPr>
-                <w:rFonts w:ascii="Arial" w:hAnsi="Arial" w:cs="Arial"/>
+              <w:spacing w:before="0" w:after="0" w:line="151" w:lineRule="exact"/>
+              <w:ind w:left="230" w:hanging="230"/>
+            </w:pPr>
+            <w:r>
+              <w:rPr>
+                <w:rFonts w:ascii="Segoe UI" w:hAnsi="Segoe UI" w:cs="Segoe UI"/>
                 <w:b/>
                 <w:bCs/>
                 <w:color w:val="C21112"/>
-                <w:sz w:val="13"/>
-                <w:szCs w:val="13"/>
+                <w:sz w:val="12"/>
+                <w:szCs w:val="12"/>
               </w:rPr>
               <w:t xml:space="preserve">▪</w:t>
             </w:r>
             <w:r>
               <w:rPr>
-                <w:rFonts w:ascii="Arial" w:hAnsi="Arial" w:cs="Arial"/>
+                <w:rFonts w:ascii="Segoe UI" w:hAnsi="Segoe UI" w:cs="Segoe UI"/>
                 <w:color w:val="33383D"/>
-                <w:sz w:val="13"/>
-                <w:szCs w:val="13"/>
+                <w:sz w:val="12"/>
+                <w:szCs w:val="12"/>
               </w:rPr>
               <w:t xml:space="preserve">  </w:t>
             </w:r>
             <w:r>
               <w:rPr>
-                <w:rFonts w:ascii="Arial" w:hAnsi="Arial" w:cs="Arial"/>
+                <w:rFonts w:ascii="Segoe UI" w:hAnsi="Segoe UI" w:cs="Segoe UI"/>
                 <w:color w:val="6E6E6E"/>
-                <w:sz w:val="13"/>
-                <w:szCs w:val="13"/>
+                <w:sz w:val="12"/>
+                <w:szCs w:val="12"/>
               </w:rPr>
               <w:t xml:space="preserve">El cliente proporcionará los datos de la mercancía para la Carta Porte.</w:t>
             </w:r>
@@ -3008,50 +3008,50 @@
       <w:tr>
         <w:trPr>
           <w:cantSplit/>
-          <w:trHeight w:val="250" w:hRule="atLeast"/>
+          <w:trHeight w:val="210" w:hRule="atLeast"/>
         </w:trPr>
         <w:tc>
           <w:tcPr>
             <w:tcW w:w="5184" w:type="dxa"/>
             <w:tcMar>
-              <w:top w:w="40" w:type="dxa"/>
+              <w:top w:w="30" w:type="dxa"/>
               <w:left w:w="90" w:type="dxa"/>
-              <w:bottom w:w="40" w:type="dxa"/>
+              <w:bottom w:w="30" w:type="dxa"/>
               <w:right w:w="160" w:type="dxa"/>
             </w:tcMar>
             <w:vAlign w:val="top"/>
           </w:tcPr>
           <w:p>
             <w:pPr>
-              <w:spacing w:before="0" w:after="0" w:line="220" w:lineRule="auto"/>
-              <w:ind w:left="250" w:hanging="250"/>
-            </w:pPr>
-            <w:r>
-              <w:rPr>
-                <w:rFonts w:ascii="Arial" w:hAnsi="Arial" w:cs="Arial"/>
+              <w:spacing w:before="0" w:after="0" w:line="151" w:lineRule="exact"/>
+              <w:ind w:left="230" w:hanging="230"/>
+            </w:pPr>
+            <w:r>
+              <w:rPr>
+                <w:rFonts w:ascii="Segoe UI" w:hAnsi="Segoe UI" w:cs="Segoe UI"/>
                 <w:b/>
                 <w:bCs/>
                 <w:color w:val="C21112"/>
-                <w:sz w:val="13"/>
-                <w:szCs w:val="13"/>
+                <w:sz w:val="12"/>
+                <w:szCs w:val="12"/>
               </w:rPr>
               <w:t xml:space="preserve">▪</w:t>
             </w:r>
             <w:r>
               <w:rPr>
-                <w:rFonts w:ascii="Arial" w:hAnsi="Arial" w:cs="Arial"/>
+                <w:rFonts w:ascii="Segoe UI" w:hAnsi="Segoe UI" w:cs="Segoe UI"/>
                 <w:color w:val="33383D"/>
-                <w:sz w:val="13"/>
-                <w:szCs w:val="13"/>
+                <w:sz w:val="12"/>
+                <w:szCs w:val="12"/>
               </w:rPr>
               <w:t xml:space="preserve">  </w:t>
             </w:r>
             <w:r>
               <w:rPr>
-                <w:rFonts w:ascii="Arial" w:hAnsi="Arial" w:cs="Arial"/>
+                <w:rFonts w:ascii="Segoe UI" w:hAnsi="Segoe UI" w:cs="Segoe UI"/>
                 <w:color w:val="6E6E6E"/>
-                <w:sz w:val="13"/>
-                <w:szCs w:val="13"/>
+                <w:sz w:val="12"/>
+                <w:szCs w:val="12"/>
               </w:rPr>
               <w:t xml:space="preserve">Estadías después del tiempo libre: se cotizan por cada 24 horas o fracción.</w:t>
             </w:r>
@@ -3061,44 +3061,44 @@
           <w:tcPr>
             <w:tcW w:w="5184" w:type="dxa"/>
             <w:tcMar>
-              <w:top w:w="40" w:type="dxa"/>
+              <w:top w:w="30" w:type="dxa"/>
               <w:left w:w="200" w:type="dxa"/>
-              <w:bottom w:w="40" w:type="dxa"/>
+              <w:bottom w:w="30" w:type="dxa"/>
               <w:right w:w="160" w:type="dxa"/>
             </w:tcMar>
             <w:vAlign w:val="top"/>
           </w:tcPr>
           <w:p>
             <w:pPr>
-              <w:spacing w:before="0" w:after="0" w:line="220" w:lineRule="auto"/>
-              <w:ind w:left="250" w:hanging="250"/>
-            </w:pPr>
-            <w:r>
-              <w:rPr>
-                <w:rFonts w:ascii="Arial" w:hAnsi="Arial" w:cs="Arial"/>
+              <w:spacing w:before="0" w:after="0" w:line="151" w:lineRule="exact"/>
+              <w:ind w:left="230" w:hanging="230"/>
+            </w:pPr>
+            <w:r>
+              <w:rPr>
+                <w:rFonts w:ascii="Segoe UI" w:hAnsi="Segoe UI" w:cs="Segoe UI"/>
                 <w:b/>
                 <w:bCs/>
                 <w:color w:val="C21112"/>
-                <w:sz w:val="13"/>
-                <w:szCs w:val="13"/>
+                <w:sz w:val="12"/>
+                <w:szCs w:val="12"/>
               </w:rPr>
               <w:t xml:space="preserve">▪</w:t>
             </w:r>
             <w:r>
               <w:rPr>
-                <w:rFonts w:ascii="Arial" w:hAnsi="Arial" w:cs="Arial"/>
+                <w:rFonts w:ascii="Segoe UI" w:hAnsi="Segoe UI" w:cs="Segoe UI"/>
                 <w:color w:val="33383D"/>
-                <w:sz w:val="13"/>
-                <w:szCs w:val="13"/>
+                <w:sz w:val="12"/>
+                <w:szCs w:val="12"/>
               </w:rPr>
               <w:t xml:space="preserve">  </w:t>
             </w:r>
             <w:r>
               <w:rPr>
-                <w:rFonts w:ascii="Arial" w:hAnsi="Arial" w:cs="Arial"/>
+                <w:rFonts w:ascii="Segoe UI" w:hAnsi="Segoe UI" w:cs="Segoe UI"/>
                 <w:color w:val="6E6E6E"/>
-                <w:sz w:val="13"/>
-                <w:szCs w:val="13"/>
+                <w:sz w:val="12"/>
+                <w:szCs w:val="12"/>
               </w:rPr>
               <w:t xml:space="preserve">Servicio sujeto a disponibilidad de unidades al confirmar el embarque.</w:t>
             </w:r>
@@ -3108,12 +3108,12 @@
     </w:tbl>
     <w:p>
       <w:pPr>
-        <w:spacing w:before="170" w:after="0" w:line="163" w:lineRule="exact"/>
+        <w:spacing w:before="120" w:after="0" w:line="163" w:lineRule="exact"/>
         <w:jc w:val="center"/>
       </w:pPr>
       <w:r>
         <w:rPr>
-          <w:rFonts w:ascii="Arial" w:hAnsi="Arial" w:cs="Arial"/>
+          <w:rFonts w:ascii="Segoe UI" w:hAnsi="Segoe UI" w:cs="Segoe UI"/>
           <w:i/>
           <w:iCs/>
           <w:color w:val="6E6E6E"/>
@@ -3201,7 +3201,7 @@
           </w:pPr>
           <w:r>
             <w:rPr>
-              <w:rFonts w:ascii="Arial" w:hAnsi="Arial" w:cs="Arial"/>
+              <w:rFonts w:ascii="Segoe UI Semibold" w:hAnsi="Segoe UI Semibold" w:cs="Segoe UI Semibold"/>
               <w:b/>
               <w:bCs/>
               <w:color w:val="C21112"/>
@@ -3212,7 +3212,7 @@
           </w:r>
           <w:r>
             <w:rPr>
-              <w:rFonts w:ascii="Arial" w:hAnsi="Arial" w:cs="Arial"/>
+              <w:rFonts w:ascii="Segoe UI" w:hAnsi="Segoe UI" w:cs="Segoe UI"/>
               <w:color w:val="C9C9C9"/>
               <w:sz w:val="13"/>
               <w:szCs w:val="13"/>
@@ -3221,7 +3221,7 @@
           </w:r>
           <w:r>
             <w:rPr>
-              <w:rFonts w:ascii="Arial" w:hAnsi="Arial" w:cs="Arial"/>
+              <w:rFonts w:ascii="Segoe UI" w:hAnsi="Segoe UI" w:cs="Segoe UI"/>
               <w:color w:val="6E6E6E"/>
               <w:sz w:val="12"/>
               <w:szCs w:val="12"/>
@@ -3248,7 +3248,7 @@
           </w:pPr>
           <w:r>
             <w:rPr>
-              <w:rFonts w:ascii="Arial" w:hAnsi="Arial" w:cs="Arial"/>
+              <w:rFonts w:ascii="Segoe UI" w:hAnsi="Segoe UI" w:cs="Segoe UI"/>
               <w:color w:val="6E6E6E"/>
               <w:sz w:val="13"/>
               <w:szCs w:val="13"/>
@@ -3257,7 +3257,7 @@
           </w:r>
           <w:r>
             <w:rPr>
-              <w:rFonts w:ascii="Arial" w:hAnsi="Arial" w:cs="Arial"/>
+              <w:rFonts w:ascii="Segoe UI Semibold" w:hAnsi="Segoe UI Semibold" w:cs="Segoe UI Semibold"/>
               <w:b/>
               <w:bCs/>
               <w:color w:val="111111"/>
@@ -3268,7 +3268,7 @@
           </w:r>
           <w:r>
             <w:rPr>
-              <w:rFonts w:ascii="Arial" w:hAnsi="Arial" w:cs="Arial"/>
+              <w:rFonts w:ascii="Segoe UI Semibold" w:hAnsi="Segoe UI Semibold" w:cs="Segoe UI Semibold"/>
               <w:b/>
               <w:bCs/>
               <w:color w:val="111111"/>
@@ -3279,7 +3279,7 @@
           </w:r>
           <w:r>
             <w:rPr>
-              <w:rFonts w:ascii="Arial" w:hAnsi="Arial" w:cs="Arial"/>
+              <w:rFonts w:ascii="Segoe UI Semibold" w:hAnsi="Segoe UI Semibold" w:cs="Segoe UI Semibold"/>
               <w:b/>
               <w:bCs/>
               <w:color w:val="111111"/>
@@ -3290,7 +3290,7 @@
           </w:r>
           <w:r>
             <w:rPr>
-              <w:rFonts w:ascii="Arial" w:hAnsi="Arial" w:cs="Arial"/>
+              <w:rFonts w:ascii="Segoe UI Semibold" w:hAnsi="Segoe UI Semibold" w:cs="Segoe UI Semibold"/>
               <w:b/>
               <w:bCs/>
               <w:color w:val="111111"/>
@@ -3301,7 +3301,7 @@
           </w:r>
           <w:r>
             <w:rPr>
-              <w:rFonts w:ascii="Arial" w:hAnsi="Arial" w:cs="Arial"/>
+              <w:rFonts w:ascii="Segoe UI Semibold" w:hAnsi="Segoe UI Semibold" w:cs="Segoe UI Semibold"/>
               <w:b/>
               <w:bCs/>
               <w:color w:val="111111"/>
@@ -3312,7 +3312,7 @@
           </w:r>
           <w:r>
             <w:rPr>
-              <w:rFonts w:ascii="Arial" w:hAnsi="Arial" w:cs="Arial"/>
+              <w:rFonts w:ascii="Segoe UI" w:hAnsi="Segoe UI" w:cs="Segoe UI"/>
               <w:color w:val="6E6E6E"/>
               <w:sz w:val="13"/>
               <w:szCs w:val="13"/>
@@ -3321,7 +3321,7 @@
           </w:r>
           <w:r>
             <w:rPr>
-              <w:rFonts w:ascii="Arial" w:hAnsi="Arial" w:cs="Arial"/>
+              <w:rFonts w:ascii="Segoe UI Semibold" w:hAnsi="Segoe UI Semibold" w:cs="Segoe UI Semibold"/>
               <w:b/>
               <w:bCs/>
               <w:color w:val="111111"/>
@@ -3332,7 +3332,7 @@
           </w:r>
           <w:r>
             <w:rPr>
-              <w:rFonts w:ascii="Arial" w:hAnsi="Arial" w:cs="Arial"/>
+              <w:rFonts w:ascii="Segoe UI Semibold" w:hAnsi="Segoe UI Semibold" w:cs="Segoe UI Semibold"/>
               <w:b/>
               <w:bCs/>
               <w:color w:val="111111"/>
@@ -3343,7 +3343,7 @@
           </w:r>
           <w:r>
             <w:rPr>
-              <w:rFonts w:ascii="Arial" w:hAnsi="Arial" w:cs="Arial"/>
+              <w:rFonts w:ascii="Segoe UI Semibold" w:hAnsi="Segoe UI Semibold" w:cs="Segoe UI Semibold"/>
               <w:b/>
               <w:bCs/>
               <w:color w:val="111111"/>
@@ -3354,7 +3354,7 @@
           </w:r>
           <w:r>
             <w:rPr>
-              <w:rFonts w:ascii="Arial" w:hAnsi="Arial" w:cs="Arial"/>
+              <w:rFonts w:ascii="Segoe UI Semibold" w:hAnsi="Segoe UI Semibold" w:cs="Segoe UI Semibold"/>
               <w:b/>
               <w:bCs/>
               <w:color w:val="111111"/>
@@ -3365,7 +3365,7 @@
           </w:r>
           <w:r>
             <w:rPr>
-              <w:rFonts w:ascii="Arial" w:hAnsi="Arial" w:cs="Arial"/>
+              <w:rFonts w:ascii="Segoe UI Semibold" w:hAnsi="Segoe UI Semibold" w:cs="Segoe UI Semibold"/>
               <w:b/>
               <w:bCs/>
               <w:color w:val="111111"/>
@@ -3446,7 +3446,7 @@
           </w:pPr>
           <w:r>
             <w:rPr>
-              <w:rFonts w:ascii="Arial" w:hAnsi="Arial" w:cs="Arial"/>
+              <w:rFonts w:ascii="Segoe UI" w:hAnsi="Segoe UI" w:cs="Segoe UI"/>
               <w:caps/>
               <w:color w:val="6E6E6E"/>
               <w:sz w:val="12"/>
@@ -3515,7 +3515,7 @@
           </w:pPr>
           <w:r>
             <w:rPr>
-              <w:rFonts w:ascii="Arial" w:hAnsi="Arial" w:cs="Arial"/>
+              <w:rFonts w:ascii="Segoe UI Semibold" w:hAnsi="Segoe UI Semibold" w:cs="Segoe UI Semibold"/>
               <w:b/>
               <w:bCs/>
               <w:caps/>
@@ -3533,7 +3533,7 @@
           </w:pPr>
           <w:r>
             <w:rPr>
-              <w:rFonts w:ascii="Arial" w:hAnsi="Arial" w:cs="Arial"/>
+              <w:rFonts w:ascii="Segoe UI" w:hAnsi="Segoe UI" w:cs="Segoe UI"/>
               <w:color w:val="6E6E6E"/>
               <w:sz w:val="11"/>
               <w:szCs w:val="11"/>
@@ -3547,7 +3547,7 @@
           </w:pPr>
           <w:r>
             <w:rPr>
-              <w:rFonts w:ascii="Arial" w:hAnsi="Arial" w:cs="Arial"/>
+              <w:rFonts w:ascii="Segoe UI" w:hAnsi="Segoe UI" w:cs="Segoe UI"/>
               <w:color w:val="6E6E6E"/>
               <w:sz w:val="11"/>
               <w:szCs w:val="11"/>
@@ -3573,7 +3573,7 @@
           </w:pPr>
           <w:r>
             <w:rPr>
-              <w:rFonts w:ascii="Arial" w:hAnsi="Arial" w:cs="Arial"/>
+              <w:rFonts w:ascii="Segoe UI Semibold" w:hAnsi="Segoe UI Semibold" w:cs="Segoe UI Semibold"/>
               <w:b/>
               <w:bCs/>
               <w:caps/>
@@ -3591,7 +3591,7 @@
           </w:pPr>
           <w:r>
             <w:rPr>
-              <w:rFonts w:ascii="Arial" w:hAnsi="Arial" w:cs="Arial"/>
+              <w:rFonts w:ascii="Segoe UI" w:hAnsi="Segoe UI" w:cs="Segoe UI"/>
               <w:color w:val="6E6E6E"/>
               <w:sz w:val="11"/>
               <w:szCs w:val="11"/>
@@ -3605,7 +3605,7 @@
           </w:pPr>
           <w:r>
             <w:rPr>
-              <w:rFonts w:ascii="Arial" w:hAnsi="Arial" w:cs="Arial"/>
+              <w:rFonts w:ascii="Segoe UI" w:hAnsi="Segoe UI" w:cs="Segoe UI"/>
               <w:color w:val="6E6E6E"/>
               <w:sz w:val="11"/>
               <w:szCs w:val="11"/>
@@ -3631,7 +3631,7 @@
           </w:pPr>
           <w:r>
             <w:rPr>
-              <w:rFonts w:ascii="Arial" w:hAnsi="Arial" w:cs="Arial"/>
+              <w:rFonts w:ascii="Segoe UI Semibold" w:hAnsi="Segoe UI Semibold" w:cs="Segoe UI Semibold"/>
               <w:b/>
               <w:bCs/>
               <w:caps/>
@@ -3649,7 +3649,7 @@
           </w:pPr>
           <w:r>
             <w:rPr>
-              <w:rFonts w:ascii="Arial" w:hAnsi="Arial" w:cs="Arial"/>
+              <w:rFonts w:ascii="Segoe UI" w:hAnsi="Segoe UI" w:cs="Segoe UI"/>
               <w:color w:val="6E6E6E"/>
               <w:sz w:val="11"/>
               <w:szCs w:val="11"/>
@@ -3663,7 +3663,7 @@
           </w:pPr>
           <w:r>
             <w:rPr>
-              <w:rFonts w:ascii="Arial" w:hAnsi="Arial" w:cs="Arial"/>
+              <w:rFonts w:ascii="Segoe UI" w:hAnsi="Segoe UI" w:cs="Segoe UI"/>
               <w:color w:val="6E6E6E"/>
               <w:sz w:val="11"/>
               <w:szCs w:val="11"/>

</xml_diff>

<commit_message>
Cotizaciones: las condiciones se sustituyen por las consideraciones del cliente
Entran las seis consideraciones importantes que entrego Fletes Tauro, tal
cual, y salen las diez condiciones comerciales que traia el formato.

Al ser seis y mas largas, van a todo el ancho de la hoja en vez de en dos
columnas: se leen mejor y ocupan menos alto que apareadas. La vineta usa
un tabulador en lugar de espacios para que el texto arranque siempre en la
misma columna.

La nota de cierre ahora habla de "las consideraciones aqui descritas",
para que no mencione una seccion que ya no existe.

La hoja sigue cerrando con 28 mm libres.

Co-Authored-By: Claude Opus 5 <noreply@anthropic.com>
Claude-Session: https://claude.ai/code/session_017DE5RtjtLFhQ3FcsP1iHRy
</commit_message>
<xml_diff>
--- a/plantillas/cotizador/salida/FORMATO_COTIZACION_FLETES_TAURO.docx
+++ b/plantillas/cotizador/salida/FORMATO_COTIZACION_FLETES_TAURO.docx
@@ -2570,7 +2570,7 @@
                 <w:sz w:val="17"/>
                 <w:szCs w:val="17"/>
               </w:rPr>
-              <w:t xml:space="preserve">Condiciones comerciales</w:t>
+              <w:t xml:space="preserve">Consideraciones importantes</w:t>
             </w:r>
           </w:p>
         </w:tc>
@@ -2578,7 +2578,7 @@
     </w:tbl>
     <w:p>
       <w:pPr>
-        <w:spacing w:before="0" w:after="90" w:line="126" w:lineRule="exact"/>
+        <w:spacing w:before="0" w:after="130" w:line="126" w:lineRule="exact"/>
       </w:pPr>
       <w:r>
         <w:rPr>
@@ -2589,523 +2589,234 @@
         </w:rPr>
       </w:r>
     </w:p>
-    <w:tbl>
-      <w:tblPr>
-        <w:tblW w:w="10368" w:type="dxa"/>
-        <w:tblLayout w:type="fixed"/>
-        <w:tblCellMar>
-          <w:top w:w="60" w:type="dxa"/>
-          <w:left w:w="100" w:type="dxa"/>
-          <w:bottom w:w="60" w:type="dxa"/>
-          <w:right w:w="100" w:type="dxa"/>
-        </w:tblCellMar>
-        <w:tblLook w:val="0000" w:firstRow="0" w:lastRow="0" w:firstColumn="0" w:lastColumn="0" w:noHBand="1" w:noVBand="1"/>
-      </w:tblPr>
-      <w:tblGrid>
-        <w:gridCol w:w="5184"/>
-        <w:gridCol w:w="5184"/>
-      </w:tblGrid>
-      <w:tr>
-        <w:trPr>
-          <w:cantSplit/>
-          <w:trHeight w:val="210" w:hRule="atLeast"/>
-        </w:trPr>
-        <w:tc>
-          <w:tcPr>
-            <w:tcW w:w="5184" w:type="dxa"/>
-            <w:tcMar>
-              <w:top w:w="30" w:type="dxa"/>
-              <w:left w:w="90" w:type="dxa"/>
-              <w:bottom w:w="30" w:type="dxa"/>
-              <w:right w:w="160" w:type="dxa"/>
-            </w:tcMar>
-            <w:vAlign w:val="top"/>
-          </w:tcPr>
-          <w:p>
-            <w:pPr>
-              <w:spacing w:before="0" w:after="0" w:line="151" w:lineRule="exact"/>
-              <w:ind w:left="230" w:hanging="230"/>
-            </w:pPr>
-            <w:r>
-              <w:rPr>
-                <w:rFonts w:ascii="Segoe UI" w:hAnsi="Segoe UI" w:cs="Segoe UI"/>
-                <w:b/>
-                <w:bCs/>
-                <w:color w:val="C21112"/>
-                <w:sz w:val="12"/>
-                <w:szCs w:val="12"/>
-              </w:rPr>
-              <w:t xml:space="preserve">▪</w:t>
-            </w:r>
-            <w:r>
-              <w:rPr>
-                <w:rFonts w:ascii="Segoe UI" w:hAnsi="Segoe UI" w:cs="Segoe UI"/>
-                <w:color w:val="33383D"/>
-                <w:sz w:val="12"/>
-                <w:szCs w:val="12"/>
-              </w:rPr>
-              <w:t xml:space="preserve">  </w:t>
-            </w:r>
-            <w:r>
-              <w:rPr>
-                <w:rFonts w:ascii="Segoe UI" w:hAnsi="Segoe UI" w:cs="Segoe UI"/>
-                <w:color w:val="6E6E6E"/>
-                <w:sz w:val="12"/>
-                <w:szCs w:val="12"/>
-              </w:rPr>
-              <w:t xml:space="preserve">Vigencia de la cotización: 15 días naturales a partir de la fecha de emisión.</w:t>
-            </w:r>
-          </w:p>
-        </w:tc>
-        <w:tc>
-          <w:tcPr>
-            <w:tcW w:w="5184" w:type="dxa"/>
-            <w:tcMar>
-              <w:top w:w="30" w:type="dxa"/>
-              <w:left w:w="200" w:type="dxa"/>
-              <w:bottom w:w="30" w:type="dxa"/>
-              <w:right w:w="160" w:type="dxa"/>
-            </w:tcMar>
-            <w:vAlign w:val="top"/>
-          </w:tcPr>
-          <w:p>
-            <w:pPr>
-              <w:spacing w:before="0" w:after="0" w:line="151" w:lineRule="exact"/>
-              <w:ind w:left="230" w:hanging="230"/>
-            </w:pPr>
-            <w:r>
-              <w:rPr>
-                <w:rFonts w:ascii="Segoe UI" w:hAnsi="Segoe UI" w:cs="Segoe UI"/>
-                <w:b/>
-                <w:bCs/>
-                <w:color w:val="C21112"/>
-                <w:sz w:val="12"/>
-                <w:szCs w:val="12"/>
-              </w:rPr>
-              <w:t xml:space="preserve">▪</w:t>
-            </w:r>
-            <w:r>
-              <w:rPr>
-                <w:rFonts w:ascii="Segoe UI" w:hAnsi="Segoe UI" w:cs="Segoe UI"/>
-                <w:color w:val="33383D"/>
-                <w:sz w:val="12"/>
-                <w:szCs w:val="12"/>
-              </w:rPr>
-              <w:t xml:space="preserve">  </w:t>
-            </w:r>
-            <w:r>
-              <w:rPr>
-                <w:rFonts w:ascii="Segoe UI" w:hAnsi="Segoe UI" w:cs="Segoe UI"/>
-                <w:color w:val="6E6E6E"/>
-                <w:sz w:val="12"/>
-                <w:szCs w:val="12"/>
-              </w:rPr>
-              <w:t xml:space="preserve">Maniobras de carga y descarga por cuenta del cliente.</w:t>
-            </w:r>
-          </w:p>
-        </w:tc>
-      </w:tr>
-      <w:tr>
-        <w:trPr>
-          <w:cantSplit/>
-          <w:trHeight w:val="210" w:hRule="atLeast"/>
-        </w:trPr>
-        <w:tc>
-          <w:tcPr>
-            <w:tcW w:w="5184" w:type="dxa"/>
-            <w:tcMar>
-              <w:top w:w="30" w:type="dxa"/>
-              <w:left w:w="90" w:type="dxa"/>
-              <w:bottom w:w="30" w:type="dxa"/>
-              <w:right w:w="160" w:type="dxa"/>
-            </w:tcMar>
-            <w:vAlign w:val="top"/>
-          </w:tcPr>
-          <w:p>
-            <w:pPr>
-              <w:spacing w:before="0" w:after="0" w:line="151" w:lineRule="exact"/>
-              <w:ind w:left="230" w:hanging="230"/>
-            </w:pPr>
-            <w:r>
-              <w:rPr>
-                <w:rFonts w:ascii="Segoe UI" w:hAnsi="Segoe UI" w:cs="Segoe UI"/>
-                <w:b/>
-                <w:bCs/>
-                <w:color w:val="C21112"/>
-                <w:sz w:val="12"/>
-                <w:szCs w:val="12"/>
-              </w:rPr>
-              <w:t xml:space="preserve">▪</w:t>
-            </w:r>
-            <w:r>
-              <w:rPr>
-                <w:rFonts w:ascii="Segoe UI" w:hAnsi="Segoe UI" w:cs="Segoe UI"/>
-                <w:color w:val="33383D"/>
-                <w:sz w:val="12"/>
-                <w:szCs w:val="12"/>
-              </w:rPr>
-              <w:t xml:space="preserve">  </w:t>
-            </w:r>
-            <w:r>
-              <w:rPr>
-                <w:rFonts w:ascii="Segoe UI" w:hAnsi="Segoe UI" w:cs="Segoe UI"/>
-                <w:color w:val="6E6E6E"/>
-                <w:sz w:val="12"/>
-                <w:szCs w:val="12"/>
-              </w:rPr>
-              <w:t xml:space="preserve">Tarifas en pesos mexicanos (MXN); no incluyen I.V.A. ni retenciones.</w:t>
-            </w:r>
-          </w:p>
-        </w:tc>
-        <w:tc>
-          <w:tcPr>
-            <w:tcW w:w="5184" w:type="dxa"/>
-            <w:tcMar>
-              <w:top w:w="30" w:type="dxa"/>
-              <w:left w:w="200" w:type="dxa"/>
-              <w:bottom w:w="30" w:type="dxa"/>
-              <w:right w:w="160" w:type="dxa"/>
-            </w:tcMar>
-            <w:vAlign w:val="top"/>
-          </w:tcPr>
-          <w:p>
-            <w:pPr>
-              <w:spacing w:before="0" w:after="0" w:line="151" w:lineRule="exact"/>
-              <w:ind w:left="230" w:hanging="230"/>
-            </w:pPr>
-            <w:r>
-              <w:rPr>
-                <w:rFonts w:ascii="Segoe UI" w:hAnsi="Segoe UI" w:cs="Segoe UI"/>
-                <w:b/>
-                <w:bCs/>
-                <w:color w:val="C21112"/>
-                <w:sz w:val="12"/>
-                <w:szCs w:val="12"/>
-              </w:rPr>
-              <w:t xml:space="preserve">▪</w:t>
-            </w:r>
-            <w:r>
-              <w:rPr>
-                <w:rFonts w:ascii="Segoe UI" w:hAnsi="Segoe UI" w:cs="Segoe UI"/>
-                <w:color w:val="33383D"/>
-                <w:sz w:val="12"/>
-                <w:szCs w:val="12"/>
-              </w:rPr>
-              <w:t xml:space="preserve">  </w:t>
-            </w:r>
-            <w:r>
-              <w:rPr>
-                <w:rFonts w:ascii="Segoe UI" w:hAnsi="Segoe UI" w:cs="Segoe UI"/>
-                <w:color w:val="6E6E6E"/>
-                <w:sz w:val="12"/>
-                <w:szCs w:val="12"/>
-              </w:rPr>
-              <w:t xml:space="preserve">Seguro de mercancía sujeto a cobertura contratada; excedente cotizable.</w:t>
-            </w:r>
-          </w:p>
-        </w:tc>
-      </w:tr>
-      <w:tr>
-        <w:trPr>
-          <w:cantSplit/>
-          <w:trHeight w:val="210" w:hRule="atLeast"/>
-        </w:trPr>
-        <w:tc>
-          <w:tcPr>
-            <w:tcW w:w="5184" w:type="dxa"/>
-            <w:tcMar>
-              <w:top w:w="30" w:type="dxa"/>
-              <w:left w:w="90" w:type="dxa"/>
-              <w:bottom w:w="30" w:type="dxa"/>
-              <w:right w:w="160" w:type="dxa"/>
-            </w:tcMar>
-            <w:vAlign w:val="top"/>
-          </w:tcPr>
-          <w:p>
-            <w:pPr>
-              <w:spacing w:before="0" w:after="0" w:line="151" w:lineRule="exact"/>
-              <w:ind w:left="230" w:hanging="230"/>
-            </w:pPr>
-            <w:r>
-              <w:rPr>
-                <w:rFonts w:ascii="Segoe UI" w:hAnsi="Segoe UI" w:cs="Segoe UI"/>
-                <w:b/>
-                <w:bCs/>
-                <w:color w:val="C21112"/>
-                <w:sz w:val="12"/>
-                <w:szCs w:val="12"/>
-              </w:rPr>
-              <w:t xml:space="preserve">▪</w:t>
-            </w:r>
-            <w:r>
-              <w:rPr>
-                <w:rFonts w:ascii="Segoe UI" w:hAnsi="Segoe UI" w:cs="Segoe UI"/>
-                <w:color w:val="33383D"/>
-                <w:sz w:val="12"/>
-                <w:szCs w:val="12"/>
-              </w:rPr>
-              <w:t xml:space="preserve">  </w:t>
-            </w:r>
-            <w:r>
-              <w:rPr>
-                <w:rFonts w:ascii="Segoe UI" w:hAnsi="Segoe UI" w:cs="Segoe UI"/>
-                <w:color w:val="6E6E6E"/>
-                <w:sz w:val="12"/>
-                <w:szCs w:val="12"/>
-              </w:rPr>
-              <w:t xml:space="preserve">Incluye operador, combustible y casetas en la ruta cotizada.</w:t>
-            </w:r>
-          </w:p>
-        </w:tc>
-        <w:tc>
-          <w:tcPr>
-            <w:tcW w:w="5184" w:type="dxa"/>
-            <w:tcMar>
-              <w:top w:w="30" w:type="dxa"/>
-              <w:left w:w="200" w:type="dxa"/>
-              <w:bottom w:w="30" w:type="dxa"/>
-              <w:right w:w="160" w:type="dxa"/>
-            </w:tcMar>
-            <w:vAlign w:val="top"/>
-          </w:tcPr>
-          <w:p>
-            <w:pPr>
-              <w:spacing w:before="0" w:after="0" w:line="151" w:lineRule="exact"/>
-              <w:ind w:left="230" w:hanging="230"/>
-            </w:pPr>
-            <w:r>
-              <w:rPr>
-                <w:rFonts w:ascii="Segoe UI" w:hAnsi="Segoe UI" w:cs="Segoe UI"/>
-                <w:b/>
-                <w:bCs/>
-                <w:color w:val="C21112"/>
-                <w:sz w:val="12"/>
-                <w:szCs w:val="12"/>
-              </w:rPr>
-              <w:t xml:space="preserve">▪</w:t>
-            </w:r>
-            <w:r>
-              <w:rPr>
-                <w:rFonts w:ascii="Segoe UI" w:hAnsi="Segoe UI" w:cs="Segoe UI"/>
-                <w:color w:val="33383D"/>
-                <w:sz w:val="12"/>
-                <w:szCs w:val="12"/>
-              </w:rPr>
-              <w:t xml:space="preserve">  </w:t>
-            </w:r>
-            <w:r>
-              <w:rPr>
-                <w:rFonts w:ascii="Segoe UI" w:hAnsi="Segoe UI" w:cs="Segoe UI"/>
-                <w:color w:val="6E6E6E"/>
-                <w:sz w:val="12"/>
-                <w:szCs w:val="12"/>
-              </w:rPr>
-              <w:t xml:space="preserve">Falso flete: 50% de la tarifa si la cancelación es con menos de 12 horas.</w:t>
-            </w:r>
-          </w:p>
-        </w:tc>
-      </w:tr>
-      <w:tr>
-        <w:trPr>
-          <w:cantSplit/>
-          <w:trHeight w:val="210" w:hRule="atLeast"/>
-        </w:trPr>
-        <w:tc>
-          <w:tcPr>
-            <w:tcW w:w="5184" w:type="dxa"/>
-            <w:tcMar>
-              <w:top w:w="30" w:type="dxa"/>
-              <w:left w:w="90" w:type="dxa"/>
-              <w:bottom w:w="30" w:type="dxa"/>
-              <w:right w:w="160" w:type="dxa"/>
-            </w:tcMar>
-            <w:vAlign w:val="top"/>
-          </w:tcPr>
-          <w:p>
-            <w:pPr>
-              <w:spacing w:before="0" w:after="0" w:line="151" w:lineRule="exact"/>
-              <w:ind w:left="230" w:hanging="230"/>
-            </w:pPr>
-            <w:r>
-              <w:rPr>
-                <w:rFonts w:ascii="Segoe UI" w:hAnsi="Segoe UI" w:cs="Segoe UI"/>
-                <w:b/>
-                <w:bCs/>
-                <w:color w:val="C21112"/>
-                <w:sz w:val="12"/>
-                <w:szCs w:val="12"/>
-              </w:rPr>
-              <w:t xml:space="preserve">▪</w:t>
-            </w:r>
-            <w:r>
-              <w:rPr>
-                <w:rFonts w:ascii="Segoe UI" w:hAnsi="Segoe UI" w:cs="Segoe UI"/>
-                <w:color w:val="33383D"/>
-                <w:sz w:val="12"/>
-                <w:szCs w:val="12"/>
-              </w:rPr>
-              <w:t xml:space="preserve">  </w:t>
-            </w:r>
-            <w:r>
-              <w:rPr>
-                <w:rFonts w:ascii="Segoe UI" w:hAnsi="Segoe UI" w:cs="Segoe UI"/>
-                <w:color w:val="6E6E6E"/>
-                <w:sz w:val="12"/>
-                <w:szCs w:val="12"/>
-              </w:rPr>
-              <w:t xml:space="preserve">Tiempo libre de carga y descarga: 6 horas por maniobra.</w:t>
-            </w:r>
-          </w:p>
-        </w:tc>
-        <w:tc>
-          <w:tcPr>
-            <w:tcW w:w="5184" w:type="dxa"/>
-            <w:tcMar>
-              <w:top w:w="30" w:type="dxa"/>
-              <w:left w:w="200" w:type="dxa"/>
-              <w:bottom w:w="30" w:type="dxa"/>
-              <w:right w:w="160" w:type="dxa"/>
-            </w:tcMar>
-            <w:vAlign w:val="top"/>
-          </w:tcPr>
-          <w:p>
-            <w:pPr>
-              <w:spacing w:before="0" w:after="0" w:line="151" w:lineRule="exact"/>
-              <w:ind w:left="230" w:hanging="230"/>
-            </w:pPr>
-            <w:r>
-              <w:rPr>
-                <w:rFonts w:ascii="Segoe UI" w:hAnsi="Segoe UI" w:cs="Segoe UI"/>
-                <w:b/>
-                <w:bCs/>
-                <w:color w:val="C21112"/>
-                <w:sz w:val="12"/>
-                <w:szCs w:val="12"/>
-              </w:rPr>
-              <w:t xml:space="preserve">▪</w:t>
-            </w:r>
-            <w:r>
-              <w:rPr>
-                <w:rFonts w:ascii="Segoe UI" w:hAnsi="Segoe UI" w:cs="Segoe UI"/>
-                <w:color w:val="33383D"/>
-                <w:sz w:val="12"/>
-                <w:szCs w:val="12"/>
-              </w:rPr>
-              <w:t xml:space="preserve">  </w:t>
-            </w:r>
-            <w:r>
-              <w:rPr>
-                <w:rFonts w:ascii="Segoe UI" w:hAnsi="Segoe UI" w:cs="Segoe UI"/>
-                <w:color w:val="6E6E6E"/>
-                <w:sz w:val="12"/>
-                <w:szCs w:val="12"/>
-              </w:rPr>
-              <w:t xml:space="preserve">El cliente proporcionará los datos de la mercancía para la Carta Porte.</w:t>
-            </w:r>
-          </w:p>
-        </w:tc>
-      </w:tr>
-      <w:tr>
-        <w:trPr>
-          <w:cantSplit/>
-          <w:trHeight w:val="210" w:hRule="atLeast"/>
-        </w:trPr>
-        <w:tc>
-          <w:tcPr>
-            <w:tcW w:w="5184" w:type="dxa"/>
-            <w:tcMar>
-              <w:top w:w="30" w:type="dxa"/>
-              <w:left w:w="90" w:type="dxa"/>
-              <w:bottom w:w="30" w:type="dxa"/>
-              <w:right w:w="160" w:type="dxa"/>
-            </w:tcMar>
-            <w:vAlign w:val="top"/>
-          </w:tcPr>
-          <w:p>
-            <w:pPr>
-              <w:spacing w:before="0" w:after="0" w:line="151" w:lineRule="exact"/>
-              <w:ind w:left="230" w:hanging="230"/>
-            </w:pPr>
-            <w:r>
-              <w:rPr>
-                <w:rFonts w:ascii="Segoe UI" w:hAnsi="Segoe UI" w:cs="Segoe UI"/>
-                <w:b/>
-                <w:bCs/>
-                <w:color w:val="C21112"/>
-                <w:sz w:val="12"/>
-                <w:szCs w:val="12"/>
-              </w:rPr>
-              <w:t xml:space="preserve">▪</w:t>
-            </w:r>
-            <w:r>
-              <w:rPr>
-                <w:rFonts w:ascii="Segoe UI" w:hAnsi="Segoe UI" w:cs="Segoe UI"/>
-                <w:color w:val="33383D"/>
-                <w:sz w:val="12"/>
-                <w:szCs w:val="12"/>
-              </w:rPr>
-              <w:t xml:space="preserve">  </w:t>
-            </w:r>
-            <w:r>
-              <w:rPr>
-                <w:rFonts w:ascii="Segoe UI" w:hAnsi="Segoe UI" w:cs="Segoe UI"/>
-                <w:color w:val="6E6E6E"/>
-                <w:sz w:val="12"/>
-                <w:szCs w:val="12"/>
-              </w:rPr>
-              <w:t xml:space="preserve">Estadías después del tiempo libre: se cotizan por cada 24 horas o fracción.</w:t>
-            </w:r>
-          </w:p>
-        </w:tc>
-        <w:tc>
-          <w:tcPr>
-            <w:tcW w:w="5184" w:type="dxa"/>
-            <w:tcMar>
-              <w:top w:w="30" w:type="dxa"/>
-              <w:left w:w="200" w:type="dxa"/>
-              <w:bottom w:w="30" w:type="dxa"/>
-              <w:right w:w="160" w:type="dxa"/>
-            </w:tcMar>
-            <w:vAlign w:val="top"/>
-          </w:tcPr>
-          <w:p>
-            <w:pPr>
-              <w:spacing w:before="0" w:after="0" w:line="151" w:lineRule="exact"/>
-              <w:ind w:left="230" w:hanging="230"/>
-            </w:pPr>
-            <w:r>
-              <w:rPr>
-                <w:rFonts w:ascii="Segoe UI" w:hAnsi="Segoe UI" w:cs="Segoe UI"/>
-                <w:b/>
-                <w:bCs/>
-                <w:color w:val="C21112"/>
-                <w:sz w:val="12"/>
-                <w:szCs w:val="12"/>
-              </w:rPr>
-              <w:t xml:space="preserve">▪</w:t>
-            </w:r>
-            <w:r>
-              <w:rPr>
-                <w:rFonts w:ascii="Segoe UI" w:hAnsi="Segoe UI" w:cs="Segoe UI"/>
-                <w:color w:val="33383D"/>
-                <w:sz w:val="12"/>
-                <w:szCs w:val="12"/>
-              </w:rPr>
-              <w:t xml:space="preserve">  </w:t>
-            </w:r>
-            <w:r>
-              <w:rPr>
-                <w:rFonts w:ascii="Segoe UI" w:hAnsi="Segoe UI" w:cs="Segoe UI"/>
-                <w:color w:val="6E6E6E"/>
-                <w:sz w:val="12"/>
-                <w:szCs w:val="12"/>
-              </w:rPr>
-              <w:t xml:space="preserve">Servicio sujeto a disponibilidad de unidades al confirmar el embarque.</w:t>
-            </w:r>
-          </w:p>
-        </w:tc>
-      </w:tr>
-    </w:tbl>
+    <w:p>
+      <w:pPr>
+        <w:tabs>
+          <w:tab w:val="left" w:pos="340"/>
+        </w:tabs>
+        <w:spacing w:before="0" w:after="90" w:line="189" w:lineRule="exact"/>
+        <w:ind w:left="340" w:right="120" w:hanging="340"/>
+      </w:pPr>
+      <w:r>
+        <w:rPr>
+          <w:rFonts w:ascii="Segoe UI" w:hAnsi="Segoe UI" w:cs="Segoe UI"/>
+          <w:b/>
+          <w:bCs/>
+          <w:color w:val="C21112"/>
+          <w:sz w:val="15"/>
+          <w:szCs w:val="15"/>
+        </w:rPr>
+        <w:t xml:space="preserve">▪</w:t>
+      </w:r>
+      <w:r>
+        <w:rPr>
+          <w:rFonts w:ascii="Segoe UI" w:hAnsi="Segoe UI" w:cs="Segoe UI"/>
+          <w:color w:val="33383D"/>
+          <w:sz w:val="15"/>
+          <w:szCs w:val="15"/>
+        </w:rPr>
+        <w:tab/>
+      </w:r>
+      <w:r>
+        <w:rPr>
+          <w:rFonts w:ascii="Segoe UI" w:hAnsi="Segoe UI" w:cs="Segoe UI"/>
+          <w:color w:val="6E6E6E"/>
+          <w:sz w:val="15"/>
+          <w:szCs w:val="15"/>
+        </w:rPr>
+        <w:t xml:space="preserve">La presente cotización se emite con base en las características de la mercancía proporcionadas por el cliente.</w:t>
+      </w:r>
+    </w:p>
+    <w:p>
+      <w:pPr>
+        <w:tabs>
+          <w:tab w:val="left" w:pos="340"/>
+        </w:tabs>
+        <w:spacing w:before="0" w:after="90" w:line="189" w:lineRule="exact"/>
+        <w:ind w:left="340" w:right="120" w:hanging="340"/>
+      </w:pPr>
+      <w:r>
+        <w:rPr>
+          <w:rFonts w:ascii="Segoe UI" w:hAnsi="Segoe UI" w:cs="Segoe UI"/>
+          <w:b/>
+          <w:bCs/>
+          <w:color w:val="C21112"/>
+          <w:sz w:val="15"/>
+          <w:szCs w:val="15"/>
+        </w:rPr>
+        <w:t xml:space="preserve">▪</w:t>
+      </w:r>
+      <w:r>
+        <w:rPr>
+          <w:rFonts w:ascii="Segoe UI" w:hAnsi="Segoe UI" w:cs="Segoe UI"/>
+          <w:color w:val="33383D"/>
+          <w:sz w:val="15"/>
+          <w:szCs w:val="15"/>
+        </w:rPr>
+        <w:tab/>
+      </w:r>
+      <w:r>
+        <w:rPr>
+          <w:rFonts w:ascii="Segoe UI" w:hAnsi="Segoe UI" w:cs="Segoe UI"/>
+          <w:color w:val="6E6E6E"/>
+          <w:sz w:val="15"/>
+          <w:szCs w:val="15"/>
+        </w:rPr>
+        <w:t xml:space="preserve">Todos los importes indicados son más IVA.</w:t>
+      </w:r>
+    </w:p>
+    <w:p>
+      <w:pPr>
+        <w:tabs>
+          <w:tab w:val="left" w:pos="340"/>
+        </w:tabs>
+        <w:spacing w:before="0" w:after="90" w:line="189" w:lineRule="exact"/>
+        <w:ind w:left="340" w:right="120" w:hanging="340"/>
+      </w:pPr>
+      <w:r>
+        <w:rPr>
+          <w:rFonts w:ascii="Segoe UI" w:hAnsi="Segoe UI" w:cs="Segoe UI"/>
+          <w:b/>
+          <w:bCs/>
+          <w:color w:val="C21112"/>
+          <w:sz w:val="15"/>
+          <w:szCs w:val="15"/>
+        </w:rPr>
+        <w:t xml:space="preserve">▪</w:t>
+      </w:r>
+      <w:r>
+        <w:rPr>
+          <w:rFonts w:ascii="Segoe UI" w:hAnsi="Segoe UI" w:cs="Segoe UI"/>
+          <w:color w:val="33383D"/>
+          <w:sz w:val="15"/>
+          <w:szCs w:val="15"/>
+        </w:rPr>
+        <w:tab/>
+      </w:r>
+      <w:r>
+        <w:rPr>
+          <w:rFonts w:ascii="Segoe UI" w:hAnsi="Segoe UI" w:cs="Segoe UI"/>
+          <w:color w:val="6E6E6E"/>
+          <w:sz w:val="15"/>
+          <w:szCs w:val="15"/>
+        </w:rPr>
+        <w:t xml:space="preserve">Los precios están sujetos a validación del peso, dimensiones y condiciones reales de la mercancía al momento de la recolección.</w:t>
+      </w:r>
+    </w:p>
+    <w:p>
+      <w:pPr>
+        <w:tabs>
+          <w:tab w:val="left" w:pos="340"/>
+        </w:tabs>
+        <w:spacing w:before="0" w:after="90" w:line="189" w:lineRule="exact"/>
+        <w:ind w:left="340" w:right="120" w:hanging="340"/>
+      </w:pPr>
+      <w:r>
+        <w:rPr>
+          <w:rFonts w:ascii="Segoe UI" w:hAnsi="Segoe UI" w:cs="Segoe UI"/>
+          <w:b/>
+          <w:bCs/>
+          <w:color w:val="C21112"/>
+          <w:sz w:val="15"/>
+          <w:szCs w:val="15"/>
+        </w:rPr>
+        <w:t xml:space="preserve">▪</w:t>
+      </w:r>
+      <w:r>
+        <w:rPr>
+          <w:rFonts w:ascii="Segoe UI" w:hAnsi="Segoe UI" w:cs="Segoe UI"/>
+          <w:color w:val="33383D"/>
+          <w:sz w:val="15"/>
+          <w:szCs w:val="15"/>
+        </w:rPr>
+        <w:tab/>
+      </w:r>
+      <w:r>
+        <w:rPr>
+          <w:rFonts w:ascii="Segoe UI" w:hAnsi="Segoe UI" w:cs="Segoe UI"/>
+          <w:color w:val="6E6E6E"/>
+          <w:sz w:val="15"/>
+          <w:szCs w:val="15"/>
+        </w:rPr>
+        <w:t xml:space="preserve">El seguro de mercancía es opcional. En caso de requerir que el embarque viaje asegurado por Fletes Tauro, el costo será de $.008 por cada millar del valor comercial declarado de la mercancía.</w:t>
+      </w:r>
+    </w:p>
+    <w:p>
+      <w:pPr>
+        <w:tabs>
+          <w:tab w:val="left" w:pos="340"/>
+        </w:tabs>
+        <w:spacing w:before="0" w:after="90" w:line="189" w:lineRule="exact"/>
+        <w:ind w:left="340" w:right="120" w:hanging="340"/>
+      </w:pPr>
+      <w:r>
+        <w:rPr>
+          <w:rFonts w:ascii="Segoe UI" w:hAnsi="Segoe UI" w:cs="Segoe UI"/>
+          <w:b/>
+          <w:bCs/>
+          <w:color w:val="C21112"/>
+          <w:sz w:val="15"/>
+          <w:szCs w:val="15"/>
+        </w:rPr>
+        <w:t xml:space="preserve">▪</w:t>
+      </w:r>
+      <w:r>
+        <w:rPr>
+          <w:rFonts w:ascii="Segoe UI" w:hAnsi="Segoe UI" w:cs="Segoe UI"/>
+          <w:color w:val="33383D"/>
+          <w:sz w:val="15"/>
+          <w:szCs w:val="15"/>
+        </w:rPr>
+        <w:tab/>
+      </w:r>
+      <w:r>
+        <w:rPr>
+          <w:rFonts w:ascii="Segoe UI" w:hAnsi="Segoe UI" w:cs="Segoe UI"/>
+          <w:color w:val="6E6E6E"/>
+          <w:sz w:val="15"/>
+          <w:szCs w:val="15"/>
+        </w:rPr>
+        <w:t xml:space="preserve">La cotización no incluye servicios adicionales como maniobras, almacenajes, reexpediciones, citas de entrega (las cuales deberán solicitarse con un mínimo de 48 horas de anticipación) ni cualquier otro concepto extraordinario que pudiera generarse durante la operación.</w:t>
+      </w:r>
+    </w:p>
+    <w:p>
+      <w:pPr>
+        <w:tabs>
+          <w:tab w:val="left" w:pos="340"/>
+        </w:tabs>
+        <w:spacing w:before="0" w:after="90" w:line="189" w:lineRule="exact"/>
+        <w:ind w:left="340" w:right="120" w:hanging="340"/>
+      </w:pPr>
+      <w:r>
+        <w:rPr>
+          <w:rFonts w:ascii="Segoe UI" w:hAnsi="Segoe UI" w:cs="Segoe UI"/>
+          <w:b/>
+          <w:bCs/>
+          <w:color w:val="C21112"/>
+          <w:sz w:val="15"/>
+          <w:szCs w:val="15"/>
+        </w:rPr>
+        <w:t xml:space="preserve">▪</w:t>
+      </w:r>
+      <w:r>
+        <w:rPr>
+          <w:rFonts w:ascii="Segoe UI" w:hAnsi="Segoe UI" w:cs="Segoe UI"/>
+          <w:color w:val="33383D"/>
+          <w:sz w:val="15"/>
+          <w:szCs w:val="15"/>
+        </w:rPr>
+        <w:tab/>
+      </w:r>
+      <w:r>
+        <w:rPr>
+          <w:rFonts w:ascii="Segoe UI" w:hAnsi="Segoe UI" w:cs="Segoe UI"/>
+          <w:color w:val="6E6E6E"/>
+          <w:sz w:val="15"/>
+          <w:szCs w:val="15"/>
+        </w:rPr>
+        <w:t xml:space="preserve">Para las recolecciones y entregas locales se utilizan unidades tipo rabón, mientras que el traslado entre Monterrey y Ciudad de México se realiza en tráiler con caja seca de 48 o 53 pies, de acuerdo con la disponibilidad operativa.</w:t>
+      </w:r>
+    </w:p>
     <w:p>
       <w:pPr>
         <w:spacing w:before="120" w:after="0" w:line="163" w:lineRule="exact"/>
@@ -3120,7 +2831,7 @@
           <w:sz w:val="13"/>
           <w:szCs w:val="13"/>
         </w:rPr>
-        <w:t xml:space="preserve">La aceptación de esta cotización implica la conformidad con las condiciones comerciales aquí descritas.</w:t>
+        <w:t xml:space="preserve">La aceptación de esta cotización implica la conformidad con las consideraciones aquí descritas.</w:t>
       </w:r>
     </w:p>
     <w:sectPr>

</xml_diff>